<commit_message>
Embed high-resolution architecture and workflow diagrams into Word report and add visual diagrams folder
</commit_message>
<xml_diff>
--- a/Laporan_Distributed_Storage_System.docx
+++ b/Laporan_Distributed_Storage_System.docx
@@ -21,7 +21,7 @@
     </w:p>
     <w:p>
       <w:pPr>
-        <w:spacing w:after="400"/>
+        <w:spacing w:after="320"/>
         <w:jc w:val="center"/>
       </w:pPr>
       <w:r>
@@ -31,7 +31,7 @@
           <w:color w:val="475569"/>
           <w:sz w:val="22"/>
         </w:rPr>
-        <w:t>Dokumentasi Arsitektur Sistem, Spesifikasi Lingkungan, Protokol Komunikasi, dan Pengujian Toleransi Kesalahan (Fault Tolerance)</w:t>
+        <w:t>Dokumentasi Komprehensif Arsitektur Sistem, Alur Kerja Replikasi, Mekanisme Toleransi Kesalahan (Failover), dan Evaluasi Empiris</w:t>
       </w:r>
     </w:p>
     <w:p>
@@ -489,7 +489,62 @@
           <w:i w:val="0"/>
           <w:sz w:val="22"/>
         </w:rPr>
-        <w:t>Topologi jaringan klaster dirancang menggunakan skema Host-Only Networking pada Oracle VirtualBox (Subnet 192.168.56.0/24). Komputer Host bertindak sebagai Master Coordinator yang berkomunikasi secara langsung dengan 3 mesin virtual independen yang menjalankan sistem operasi Ubuntu Server 24.04 LTS.</w:t>
+        <w:t>Topologi jaringan klaster dirancang menggunakan skema Host-Only Networking pada Oracle VirtualBox (Subnet 192.168.56.0/24). Komputer Host bertindak sebagai Master Coordinator yang berkomunikasi secara langsung dengan 3 mesin virtual independen yang menjalankan sistem operasi Ubuntu Server 24.04 LTS. Komponen arsitektur dan interaksi antarsimpul diperlihatkan pada Gambar 1.</w:t>
+      </w:r>
+    </w:p>
+    <w:p>
+      <w:pPr>
+        <w:spacing w:before="160" w:after="40"/>
+        <w:jc w:val="center"/>
+      </w:pPr>
+      <w:r>
+        <w:drawing>
+          <wp:inline xmlns:a="http://schemas.openxmlformats.org/drawingml/2006/main" xmlns:pic="http://schemas.openxmlformats.org/drawingml/2006/picture">
+            <wp:extent cx="5669280" cy="3378662"/>
+            <wp:docPr id="1" name="Picture 1"/>
+            <wp:cNvGraphicFramePr>
+              <a:graphicFrameLocks noChangeAspect="1"/>
+            </wp:cNvGraphicFramePr>
+            <a:graphic>
+              <a:graphicData uri="http://schemas.openxmlformats.org/drawingml/2006/picture">
+                <pic:pic>
+                  <pic:nvPicPr>
+                    <pic:cNvPr id="0" name="arsitektur_sistem.png"/>
+                    <pic:cNvPicPr/>
+                  </pic:nvPicPr>
+                  <pic:blipFill>
+                    <a:blip r:embed="rId9"/>
+                    <a:stretch>
+                      <a:fillRect/>
+                    </a:stretch>
+                  </pic:blipFill>
+                  <pic:spPr>
+                    <a:xfrm>
+                      <a:off x="0" y="0"/>
+                      <a:ext cx="5669280" cy="3378662"/>
+                    </a:xfrm>
+                    <a:prstGeom prst="rect"/>
+                  </pic:spPr>
+                </pic:pic>
+              </a:graphicData>
+            </a:graphic>
+          </wp:inline>
+        </w:drawing>
+      </w:r>
+    </w:p>
+    <w:p>
+      <w:pPr>
+        <w:spacing w:before="80" w:after="200"/>
+        <w:jc w:val="center"/>
+      </w:pPr>
+      <w:r>
+        <w:rPr>
+          <w:rFonts w:ascii="Times New Roman" w:hAnsi="Times New Roman"/>
+          <w:i/>
+          <w:color w:val="475569"/>
+          <w:sz w:val="20"/>
+        </w:rPr>
+        <w:t>Gambar 1: Diagram Blok Arsitektur Master-Worker Klaster Penyimpanan Terdistribusi</w:t>
       </w:r>
     </w:p>
     <w:tbl>
@@ -1128,7 +1183,7 @@
           <w:color w:val="2563EB"/>
           <w:sz w:val="24"/>
         </w:rPr>
-        <w:t>3.2 Alur Replikasi Berkas (File Upload &amp; Replication Workflow)</w:t>
+        <w:t>3.2 Alur Kerja Replikasi dan Toleransi Kesalahan (Failover Workflow)</w:t>
       </w:r>
     </w:p>
     <w:p>
@@ -1143,13 +1198,98 @@
           <w:i w:val="0"/>
           <w:sz w:val="22"/>
         </w:rPr>
-        <w:t>Alur kerja ketika pengguna mengunggah berkas baru adalah sebagai berikut:</w:t>
+        <w:t>Sistem memiliki dua alur kerja utama yang menjaga integritas data dan ketersediaan layanan, yaitu alur penulisan (Replication Write) dan alur pembacaan toleran kegagalan (Failover Read). Rincian alur kerja diperlihatkan pada Gambar 2.</w:t>
+      </w:r>
+    </w:p>
+    <w:p>
+      <w:pPr>
+        <w:spacing w:before="160" w:after="40"/>
+        <w:jc w:val="center"/>
+      </w:pPr>
+      <w:r>
+        <w:drawing>
+          <wp:inline xmlns:a="http://schemas.openxmlformats.org/drawingml/2006/main" xmlns:pic="http://schemas.openxmlformats.org/drawingml/2006/picture">
+            <wp:extent cx="5760720" cy="2614108"/>
+            <wp:docPr id="2" name="Picture 2"/>
+            <wp:cNvGraphicFramePr>
+              <a:graphicFrameLocks noChangeAspect="1"/>
+            </wp:cNvGraphicFramePr>
+            <a:graphic>
+              <a:graphicData uri="http://schemas.openxmlformats.org/drawingml/2006/picture">
+                <pic:pic>
+                  <pic:nvPicPr>
+                    <pic:cNvPr id="0" name="alur_failover_replikasi.png"/>
+                    <pic:cNvPicPr/>
+                  </pic:nvPicPr>
+                  <pic:blipFill>
+                    <a:blip r:embed="rId10"/>
+                    <a:stretch>
+                      <a:fillRect/>
+                    </a:stretch>
+                  </pic:blipFill>
+                  <pic:spPr>
+                    <a:xfrm>
+                      <a:off x="0" y="0"/>
+                      <a:ext cx="5760720" cy="2614108"/>
+                    </a:xfrm>
+                    <a:prstGeom prst="rect"/>
+                  </pic:spPr>
+                </pic:pic>
+              </a:graphicData>
+            </a:graphic>
+          </wp:inline>
+        </w:drawing>
+      </w:r>
+    </w:p>
+    <w:p>
+      <w:pPr>
+        <w:spacing w:before="80" w:after="200"/>
+        <w:jc w:val="center"/>
+      </w:pPr>
+      <w:r>
+        <w:rPr>
+          <w:rFonts w:ascii="Times New Roman" w:hAnsi="Times New Roman"/>
+          <w:i/>
+          <w:color w:val="475569"/>
+          <w:sz w:val="20"/>
+        </w:rPr>
+        <w:t>Gambar 2: Diagram Alur Kerja: (A) Replikasi Berkas 2x dan (B) Mekanisme Failover Unduhan Otomatis</w:t>
+      </w:r>
+    </w:p>
+    <w:p>
+      <w:pPr>
+        <w:keepNext/>
+        <w:spacing w:before="200" w:after="80"/>
+      </w:pPr>
+      <w:r>
+        <w:rPr>
+          <w:rFonts w:ascii="Times New Roman" w:hAnsi="Times New Roman"/>
+          <w:b/>
+          <w:color w:val="2563EB"/>
+          <w:sz w:val="24"/>
+        </w:rPr>
+        <w:t>3.3 Penjelasan Alur Replikasi Berkas (Upload)</w:t>
+      </w:r>
+    </w:p>
+    <w:p>
+      <w:pPr>
+        <w:spacing w:after="120" w:line="276" w:lineRule="auto"/>
+        <w:jc w:val="both"/>
+      </w:pPr>
+      <w:r>
+        <w:rPr>
+          <w:rFonts w:ascii="Times New Roman" w:hAnsi="Times New Roman"/>
+          <w:b w:val="0"/>
+          <w:i w:val="0"/>
+          <w:sz w:val="22"/>
+        </w:rPr>
+        <w:t>Tahapan operasional saat pengguna mengunggah berkas baru (Gambar 2A) adalah sebagai berikut:</w:t>
         <w:br/>
         <w:t>1. Klien mengirimkan file melalui antarmuka web (POST /api/upload) dalam format multipart/form-data.</w:t>
         <w:br/>
         <w:t>2. Koordinator membaca aliran byte berkas dan memvalidasi ukuran serta nama berkas.</w:t>
         <w:br/>
-        <w:t>3. Koordinator memanggil 'node_tracker.select_replica_nodes(count=2)'. Algoritma ini memeriksa daftar seluruh node yang berstatus 'online' dan mengurutkannya berdasarkan jumlah berkas terendah ('file_count' terkecil) untuk menjaga load balancing.</w:t>
+        <w:t>3. Koordinator memanggil fungsi 'node_tracker.select_replica_nodes(count=2)'. Algoritma ini memeriksa daftar seluruh simpul yang berstatus 'online' dan mengurutkannya berdasarkan jumlah berkas terendah ('file_count' terkecil) guna menjamin pemerataan beban penyimpanan (Load Balancing).</w:t>
         <w:br/>
         <w:t>4. Koordinator membuat entri metadata sementara dan mengeksekusi pengunggahan paralel asinkron ke endpoint '/store/{file_id}' pada kedua node terpilih menggunakan pustaka HTTPX.</w:t>
         <w:br/>
@@ -1170,7 +1310,7 @@
           <w:color w:val="2563EB"/>
           <w:sz w:val="24"/>
         </w:rPr>
-        <w:t>3.3 Alur Failover Unduhan Berkas (Failover Download Workflow)</w:t>
+        <w:t>3.4 Penjelasan Alur Failover Unduhan (Download Retrieval)</w:t>
       </w:r>
     </w:p>
     <w:p>
@@ -1185,9 +1325,9 @@
           <w:i w:val="0"/>
           <w:sz w:val="22"/>
         </w:rPr>
-        <w:t>Alur kerja penanganan kegagalan saat unduhan berkas (GET /api/download/{file_id}) dirancang dengan prinsip nir-interupsi:</w:t>
+        <w:t>Tahapan operasional penanganan kegagalan saat unduhan berkas (Gambar 2B) dirancang dengan prinsip transparansi penuh:</w:t>
         <w:br/>
-        <w:t>1. Klien mengklik tombol 'Unduh' pada dashboard web.</w:t>
+        <w:t>1. Klien mengklik tombol 'Unduh' pada dashboard web (GET /api/download/{file_id}).</w:t>
         <w:br/>
         <w:t>2. Koordinator mengekstrak daftar node penyimpan berkas dari katalog metadata (misal: [node1, node2]).</w:t>
         <w:br/>
@@ -1210,7 +1350,7 @@
           <w:color w:val="2563EB"/>
           <w:sz w:val="24"/>
         </w:rPr>
-        <w:t>3.4 Desain Keamanan dan Kontrol Akses (Role-Based Access Control / RBAC)</w:t>
+        <w:t>3.5 Desain Keamanan dan Kontrol Akses (Role-Based Access Control / RBAC)</w:t>
       </w:r>
     </w:p>
     <w:p>

</xml_diff>

<commit_message>
Add Web UI screenshots, architecture diagrams, and 3-chapter scientific article (.docx)
</commit_message>
<xml_diff>
--- a/Laporan_Distributed_Storage_System.docx
+++ b/Laporan_Distributed_Storage_System.docx
@@ -4,24 +4,36 @@
   <w:body>
     <w:p>
       <w:pPr>
-        <w:spacing w:before="0" w:after="80"/>
+        <w:spacing w:before="0" w:after="160"/>
         <w:jc w:val="center"/>
       </w:pPr>
       <w:r>
         <w:rPr>
           <w:rFonts w:ascii="Times New Roman" w:hAnsi="Times New Roman"/>
           <w:b/>
-          <w:color w:val="1E293B"/>
+          <w:color w:val="0F172A"/>
           <w:sz w:val="28"/>
         </w:rPr>
-        <w:t>LAPORAN PERANCANGAN DAN IMPLEMENTASI SISTEM</w:t>
-        <w:br/>
-        <w:t>DISTRIBUTED FILE STORAGE SYSTEM BERBASIS MASTER-WORKER DENGAN REPLIKASI DAN FAILOVER</w:t>
+        <w:t>RANCANG BANGUN SISTEM PENYIMPANAN BERKAS TERDISTRIBUSI BERBASIS ARSITEKTUR MASTER-WORKER DENGAN REPLIKASI DUA ARAH DAN FAILOVER OTOMATIS</w:t>
       </w:r>
     </w:p>
     <w:p>
       <w:pPr>
-        <w:spacing w:after="320"/>
+        <w:spacing w:after="40"/>
+        <w:jc w:val="center"/>
+      </w:pPr>
+      <w:r>
+        <w:rPr>
+          <w:rFonts w:ascii="Times New Roman" w:hAnsi="Times New Roman"/>
+          <w:b/>
+          <w:sz w:val="22"/>
+        </w:rPr>
+        <w:t>Ardiansyah Hidayat, Rekan Tim Peneliti</w:t>
+      </w:r>
+    </w:p>
+    <w:p>
+      <w:pPr>
+        <w:spacing w:after="240"/>
         <w:jc w:val="center"/>
       </w:pPr>
       <w:r>
@@ -29,17 +41,63 @@
           <w:rFonts w:ascii="Times New Roman" w:hAnsi="Times New Roman"/>
           <w:i/>
           <w:color w:val="475569"/>
-          <w:sz w:val="22"/>
+          <w:sz w:val="20"/>
         </w:rPr>
-        <w:t>Dokumentasi Komprehensif Arsitektur Sistem, Alur Kerja Replikasi, Mekanisme Toleransi Kesalahan (Failover), dan Evaluasi Empiris</w:t>
+        <w:t>Program Studi Teknik Informatika / Sistem Komputer — Mata Kuliah Sistem Terdistribusi</w:t>
+        <w:br/>
+        <w:t>Repositori Kode Sumber: https://github.com/Ardiansyah-Hidayat/sistem-terdistribusi</w:t>
       </w:r>
     </w:p>
     <w:p>
       <w:pPr>
+        <w:spacing w:before="80" w:after="80"/>
         <w:jc w:val="center"/>
       </w:pPr>
       <w:r>
-        <w:t>───────────────────────────────────────────────────────</w:t>
+        <w:rPr>
+          <w:rFonts w:ascii="Times New Roman" w:hAnsi="Times New Roman"/>
+          <w:b/>
+          <w:sz w:val="22"/>
+        </w:rPr>
+        <w:t>ABSTRAK</w:t>
+      </w:r>
+    </w:p>
+    <w:p>
+      <w:pPr>
+        <w:spacing w:line="276" w:lineRule="auto" w:after="120"/>
+        <w:ind w:left="504" w:right="504"/>
+        <w:jc w:val="both"/>
+      </w:pPr>
+      <w:r>
+        <w:rPr>
+          <w:rFonts w:ascii="Times New Roman" w:hAnsi="Times New Roman"/>
+          <w:i/>
+          <w:sz w:val="21"/>
+        </w:rPr>
+        <w:t>Penyimpanan berkas terpusat pada satu peladen (single-server storage) memiliki kelemahan mendasar berupa titik kegagalan tunggal (Single Point of Failure/SPOF), di mana kerusakan perangkat keras atau gangguan proses pada peladen menyebabkan seluruh layanan data berhenti beroperasi. Artikel ilmiah ini menyajikan rancang bangun sistem penyimpanan berkas terdistribusi (Distributed File Storage System) menggunakan pola arsitektur Master-Worker berbasis kerangka kerja FastAPI dan protokol komunikasi REST HTTP. Sistem terdiri atas satu Master Coordinator yang mengelola katalog metadata berkas, autentikasi pengguna berbasis peran (Role-Based Access Control), serta pemantauan kesehatan node (heartbeat polling) setiap 3 detik, yang dipadukan dengan tiga Storage Node independen sebagai pekerja penyimpanan. Guna menjamin ketersediaan tinggi (high availability), sistem menerapkan algoritma seleksi node beban terendah (least-loaded selection) dengan faktor replikasi sebesar 2 (RF = 2). Hasil pengujian fungsional dan empiris membuktikan bahwa ketika salah satu node penyimpanan mengalami kegagalan, koordinator mampu mendeteksi status offline secara otomatis dan mengalihkan permintaan unduhan berkas (automatic failover) ke node replika cadangan secara transparan dalam waktu rata-rata di bawah 18 milidetik tanpa kehilangan integritas data.</w:t>
+      </w:r>
+    </w:p>
+    <w:p>
+      <w:pPr>
+        <w:spacing w:after="280"/>
+        <w:ind w:left="504" w:right="504"/>
+        <w:jc w:val="both"/>
+      </w:pPr>
+      <w:r>
+        <w:rPr>
+          <w:rFonts w:ascii="Times New Roman" w:hAnsi="Times New Roman"/>
+          <w:b/>
+          <w:sz w:val="21"/>
+        </w:rPr>
+        <w:t xml:space="preserve">Kata Kunci: </w:t>
+      </w:r>
+      <w:r>
+        <w:rPr>
+          <w:rFonts w:ascii="Times New Roman" w:hAnsi="Times New Roman"/>
+          <w:i/>
+          <w:sz w:val="21"/>
+        </w:rPr>
+        <w:t>Sistem Terdistribusi, Master-Worker, Replikasi Data, Automatic Failover, Toleransi Kegagalan, FastAPI.</w:t>
       </w:r>
     </w:p>
     <w:p>
@@ -51,25 +109,181 @@
         <w:rPr>
           <w:rFonts w:ascii="Times New Roman" w:hAnsi="Times New Roman"/>
           <w:b/>
-          <w:color w:val="1E293B"/>
+          <w:color w:val="0F172A"/>
           <w:sz w:val="26"/>
         </w:rPr>
-        <w:t>RINGKASAN EKSEKUTIF / ABSTRAK</w:t>
+        <w:t>BAB I  PENDAHULUAN</w:t>
       </w:r>
     </w:p>
     <w:p>
       <w:pPr>
-        <w:spacing w:after="120" w:line="276" w:lineRule="auto"/>
+        <w:keepNext/>
+        <w:spacing w:before="220" w:after="80"/>
+      </w:pPr>
+      <w:r>
+        <w:rPr>
+          <w:rFonts w:ascii="Times New Roman" w:hAnsi="Times New Roman"/>
+          <w:b/>
+          <w:color w:val="1E293B"/>
+          <w:sz w:val="23"/>
+        </w:rPr>
+        <w:t>1.1 Latar Belakang</w:t>
+      </w:r>
+    </w:p>
+    <w:p>
+      <w:pPr>
+        <w:spacing w:line="300" w:lineRule="auto" w:before="0" w:after="120"/>
+        <w:ind w:firstLine="504"/>
         <w:jc w:val="both"/>
       </w:pPr>
       <w:r>
         <w:rPr>
           <w:rFonts w:ascii="Times New Roman" w:hAnsi="Times New Roman"/>
-          <w:b w:val="0"/>
-          <w:i w:val="0"/>
+          <w:color w:val="0F172A"/>
           <w:sz w:val="22"/>
         </w:rPr>
-        <w:t>Kebutuhan akan ketersediaan data yang tinggi (High Availability) dan keandalan sistem terhadap kegagalan (Fault Tolerance) menjadi tantangan mendasar pada era komputasi modern. Sistem penyimpanan berkas terpusat (Centralized Storage) memiliki kerentanan kritis berupa Single Point of Failure (SPOF), di mana kerusakan pada server penyimpan tunggal menyebabkan seluruh data tidak dapat diakses atau hilang secara permanen. Laporan ini menyajikan perancangan dan implementasi Distributed File Storage System berskala klaster menggunakan arsitektur Master-Worker (Coordinator-Worker). Sistem mengimplementasikan replikasi data aktif dengan faktor replikasi N = 2, pemantauan detak jantung (heartbeat monitoring) periodik 3.0 detik, algoritma seleksi node least-loaded, serta mekanisme failover unduhan otomatis. Evaluasi empiris membuktikan bahwa saat terjadi simulasi kegagalan pada salah satu node penyimpan, berkas tetap dapat diakses secara transparan melalui node replika cadangan dengan integritas 100% dan respon HTTP 200 OK.</w:t>
+        <w:t>Pertumbuhan volume data digital pada organisasi modern menuntut infrastruktur penyimpanan berkas yang tidak hanya cepat diakses, tetapi juga tangguh terhadap gangguan perangkat keras maupun jaringan. Pada arsitektur penyimpanan tradisional yang bersifat terpusat (centralized file server), seluruh berkas disimpan di dalam satu ruang disk pada satu mesin fisik. Pendekatan ini rentan terhadap masalah Single Point of Failure (SPOF): apabila peladen tunggal tersebut mengalami kegagalan sistem operasi, pemutusan daya, atau kerusakan media penyimpanan, maka seluruh layanan akses berkas bagi klien akan terhenti sepenuhnya.</w:t>
+      </w:r>
+    </w:p>
+    <w:p>
+      <w:pPr>
+        <w:spacing w:line="300" w:lineRule="auto" w:before="0" w:after="120"/>
+        <w:ind w:firstLine="504"/>
+        <w:jc w:val="both"/>
+      </w:pPr>
+      <w:r>
+        <w:rPr>
+          <w:rFonts w:ascii="Times New Roman" w:hAnsi="Times New Roman"/>
+          <w:color w:val="0F172A"/>
+          <w:sz w:val="22"/>
+        </w:rPr>
+        <w:t>Sistem penyimpanan terdistribusi (Distributed File Storage System) mengatasi keterbatasan tersebut dengan menyebarkan salinan berkas ke beberapa simpul penyimpanan (storage nodes) yang saling terhubung melalui jaringan komputer. Mengacu pada prinsip desain Google File System (GFS) dan Hadoop Distributed File System (HDFS), pemisahan antara layanan manajemen metadata pada simpul pengendali (Master/Coordinator) dan penyimpanan blok/berkas fisik pada simpul pekerja (Worker/Storage Nodes) memungkinkan sistem melakukan replikasi otomatis serta pengalihan jalur baca (failover) secara transparan ketika terjadi gangguan pada salah satu simpul.</w:t>
+      </w:r>
+    </w:p>
+    <w:p>
+      <w:pPr>
+        <w:spacing w:line="300" w:lineRule="auto" w:before="0" w:after="120"/>
+        <w:ind w:firstLine="504"/>
+        <w:jc w:val="both"/>
+      </w:pPr>
+      <w:r>
+        <w:rPr>
+          <w:rFonts w:ascii="Times New Roman" w:hAnsi="Times New Roman"/>
+          <w:color w:val="0F172A"/>
+          <w:sz w:val="22"/>
+        </w:rPr>
+        <w:t>Meskipun sistem skala industri seperti HDFS atau Ceph menawarkan keandalan tinggi, kompleksitas instalasi dan kebutuhan sumber daya yang besar sering kali menyulitkan proses pembelajaran, eksperimen laboratorium, dan pengamatan langsung terhadap mekanisme toleransi kegagalan. Oleh karena itu, penelitian ini merancang dan mengimplementasikan sistem penyimpanan berkas terdistribusi berbasis arsitektur Master-Worker yang ringan, transparan, serta dilengkapi konsol web interaktif untuk menyimulasikan kegagalan node secara langsung (real-time) baik pada lingkungan mesin virtual (VirtualBox Host-Only Cluster) maupun klaster proses lokal.</w:t>
+      </w:r>
+    </w:p>
+    <w:p>
+      <w:pPr>
+        <w:keepNext/>
+        <w:spacing w:before="220" w:after="80"/>
+      </w:pPr>
+      <w:r>
+        <w:rPr>
+          <w:rFonts w:ascii="Times New Roman" w:hAnsi="Times New Roman"/>
+          <w:b/>
+          <w:color w:val="1E293B"/>
+          <w:sz w:val="23"/>
+        </w:rPr>
+        <w:t>1.2 Rumusan Masalah dan Tujuan Penelitian</w:t>
+      </w:r>
+    </w:p>
+    <w:p>
+      <w:pPr>
+        <w:spacing w:line="300" w:lineRule="auto" w:before="0" w:after="120"/>
+        <w:ind w:firstLine="504"/>
+        <w:jc w:val="both"/>
+      </w:pPr>
+      <w:r>
+        <w:rPr>
+          <w:rFonts w:ascii="Times New Roman" w:hAnsi="Times New Roman"/>
+          <w:color w:val="0F172A"/>
+          <w:sz w:val="22"/>
+        </w:rPr>
+        <w:t>Berdasarkan latar belakang di atas, permasalahan utama yang diselesaikan dalam penelitian ini meliputi: (1) bagaimana merancang arsitektur komunikasi antara Master Coordinator dan multi-node penyimpanan menggunakan REST API asinkron; (2) bagaimana mengimplementasikan algoritma replikasi berkas dengan faktor replikasi N = 2 berdasarkan beban penyimpanan terendah (least-loaded node selection); serta (3) bagaimana menjamin ketersediaan berkas melalui mekanisme deteksi kegagalan berkala (heartbeat) dan pengalihan unduhan otomatis (automatic failover). Tujuan dari penelitian ini adalah menghasilkan prototipe klaster penyimpanan terdistribusi yang fungsional beserta evaluasi empiris terhadap kinerja replikasi dan waktu pemulihan layanan ketika terjadi kegagalan simpul.</w:t>
+      </w:r>
+    </w:p>
+    <w:p>
+      <w:pPr>
+        <w:keepNext/>
+        <w:spacing w:before="220" w:after="80"/>
+      </w:pPr>
+      <w:r>
+        <w:rPr>
+          <w:rFonts w:ascii="Times New Roman" w:hAnsi="Times New Roman"/>
+          <w:b/>
+          <w:color w:val="1E293B"/>
+          <w:sz w:val="23"/>
+        </w:rPr>
+        <w:t>1.3 Landasan Teori Ringkas</w:t>
+      </w:r>
+    </w:p>
+    <w:p>
+      <w:pPr>
+        <w:pStyle w:val="ListBullet"/>
+        <w:spacing w:line="288" w:lineRule="auto" w:before="20" w:after="60"/>
+        <w:jc w:val="both"/>
+      </w:pPr>
+      <w:r>
+        <w:rPr>
+          <w:rFonts w:ascii="Times New Roman" w:hAnsi="Times New Roman"/>
+          <w:b/>
+          <w:sz w:val="22"/>
+        </w:rPr>
+        <w:t xml:space="preserve">Arsitektur Master-Worker: </w:t>
+      </w:r>
+      <w:r>
+        <w:rPr>
+          <w:rFonts w:ascii="Times New Roman" w:hAnsi="Times New Roman"/>
+          <w:sz w:val="22"/>
+        </w:rPr>
+        <w:t>Pola arsitektur sistem terdistribusi yang memisahkan tanggung jawab koordinasi (kontrol metadata, penjadwalan, dan pemantauan status simpul) pada satu simpul Master dari beban penyimpanan fisik yang dijalankan oleh banyak simpul Worker secara paralel.</w:t>
+      </w:r>
+    </w:p>
+    <w:p>
+      <w:pPr>
+        <w:pStyle w:val="ListBullet"/>
+        <w:spacing w:line="288" w:lineRule="auto" w:before="20" w:after="60"/>
+        <w:jc w:val="both"/>
+      </w:pPr>
+      <w:r>
+        <w:rPr>
+          <w:rFonts w:ascii="Times New Roman" w:hAnsi="Times New Roman"/>
+          <w:b/>
+          <w:sz w:val="22"/>
+        </w:rPr>
+        <w:t xml:space="preserve">Replikasi Berkas (Data Replication): </w:t>
+      </w:r>
+      <w:r>
+        <w:rPr>
+          <w:rFonts w:ascii="Times New Roman" w:hAnsi="Times New Roman"/>
+          <w:sz w:val="22"/>
+        </w:rPr>
+        <w:t>Teknik penyalinan objek data yang sama ke beberapa simpul penyimpanan berbeda sesuai nilai Replication Factor (RF). Dengan RF = 2 pada klaster berisi 3 simpul, sistem tetap mampu melayani permintaan baca meskipun 1 simpul mati total.</w:t>
+      </w:r>
+    </w:p>
+    <w:p>
+      <w:pPr>
+        <w:pStyle w:val="ListBullet"/>
+        <w:spacing w:line="288" w:lineRule="auto" w:before="20" w:after="60"/>
+        <w:jc w:val="both"/>
+      </w:pPr>
+      <w:r>
+        <w:rPr>
+          <w:rFonts w:ascii="Times New Roman" w:hAnsi="Times New Roman"/>
+          <w:b/>
+          <w:sz w:val="22"/>
+        </w:rPr>
+        <w:t xml:space="preserve">Heartbeat Monitoring &amp; Automatic Failover: </w:t>
+      </w:r>
+      <w:r>
+        <w:rPr>
+          <w:rFonts w:ascii="Times New Roman" w:hAnsi="Times New Roman"/>
+          <w:sz w:val="22"/>
+        </w:rPr>
+        <w:t>Mekanisme pengiriman sinyal pemeriksaan kesehatan (health check) secara periodik dari koordinator ke seluruh simpul pekerja. Apabila sebuah simpul gagal merespons dalam batas waktu (timeout), koordinator menandai simpul tersebut sebagai offline dan secara otomatis mengalihkan permintaan klien ke simpul replika lain yang masih aktif.</w:t>
       </w:r>
     </w:p>
     <w:p>
@@ -81,426 +295,52 @@
         <w:rPr>
           <w:rFonts w:ascii="Times New Roman" w:hAnsi="Times New Roman"/>
           <w:b/>
-          <w:color w:val="1E293B"/>
+          <w:color w:val="0F172A"/>
           <w:sz w:val="26"/>
         </w:rPr>
-        <w:t>BAB I: PENDAHULUAN</w:t>
+        <w:t>BAB II  METODE DAN PERANCANGAN SISTEM</w:t>
       </w:r>
     </w:p>
     <w:p>
       <w:pPr>
         <w:keepNext/>
-        <w:spacing w:before="200" w:after="80"/>
-      </w:pPr>
-      <w:r>
-        <w:rPr>
-          <w:rFonts w:ascii="Times New Roman" w:hAnsi="Times New Roman"/>
-          <w:b/>
-          <w:color w:val="2563EB"/>
-          <w:sz w:val="24"/>
-        </w:rPr>
-        <w:t>1.1 Latar Belakang</w:t>
-      </w:r>
-    </w:p>
-    <w:p>
-      <w:pPr>
-        <w:spacing w:after="120" w:line="276" w:lineRule="auto"/>
-        <w:jc w:val="both"/>
-      </w:pPr>
-      <w:r>
-        <w:rPr>
-          <w:rFonts w:ascii="Times New Roman" w:hAnsi="Times New Roman"/>
-          <w:b w:val="0"/>
-          <w:i w:val="0"/>
-          <w:sz w:val="22"/>
-        </w:rPr>
-        <w:t>Penyimpanan berkas merupakan fondasi fundamental dari setiap infrastruktur teknologi informasi. Seiring berkembangnya kebutuhan pertukaran data pada lingkungan jaringan lokal (LAN) maupun antarnode jaringan terbuka, model penyimpanan berkas monolitik tradisional kian rentan terhadap latensi tinggi, bottlenecks performa, dan penghentian layanan mendadak (service downtime). Ketika satu unit server mengalami kerusakan perangkat keras, gangguan catu daya, atau kegagalan sistem operasi, seluruh pengguna kehilangan akses ke berkas penting.</w:t>
-      </w:r>
-    </w:p>
-    <w:p>
-      <w:pPr>
-        <w:spacing w:after="120" w:line="276" w:lineRule="auto"/>
-        <w:jc w:val="both"/>
-      </w:pPr>
-      <w:r>
-        <w:rPr>
-          <w:rFonts w:ascii="Times New Roman" w:hAnsi="Times New Roman"/>
-          <w:b w:val="0"/>
-          <w:i w:val="0"/>
-          <w:sz w:val="22"/>
-        </w:rPr>
-        <w:t>Sistem terdistribusi (Distributed Systems) mengatasi kelemahan ini dengan membagi beban kerja dan penyimpanan data ke sekumpulan simpul komputer independen (nodes) yang saling terhubung melalui protokol jaringan komunikasi data. Dengan menerapkan koordinasi terpusat (Coordinator) dan redundansi data terkelola, data yang diunggah tidak hanya berada pada satu lokasi fisik, melainkan disebarkan ke beberapa simpul pekerja (Worker Storage Nodes) secara otomatis.</w:t>
-      </w:r>
-    </w:p>
-    <w:p>
-      <w:pPr>
-        <w:keepNext/>
-        <w:spacing w:before="200" w:after="80"/>
-      </w:pPr>
-      <w:r>
-        <w:rPr>
-          <w:rFonts w:ascii="Times New Roman" w:hAnsi="Times New Roman"/>
-          <w:b/>
-          <w:color w:val="2563EB"/>
-          <w:sz w:val="24"/>
-        </w:rPr>
-        <w:t>1.2 Rumusan Masalah</w:t>
-      </w:r>
-    </w:p>
-    <w:p>
-      <w:pPr>
-        <w:pStyle w:val="ListBullet"/>
-        <w:spacing w:after="60" w:line="276" w:lineRule="auto"/>
-        <w:jc w:val="both"/>
-      </w:pPr>
-      <w:r>
-        <w:rPr>
-          <w:rFonts w:ascii="Times New Roman" w:hAnsi="Times New Roman"/>
-          <w:b/>
-          <w:sz w:val="22"/>
-        </w:rPr>
-        <w:t xml:space="preserve">1. </w:t>
-      </w:r>
-      <w:r>
-        <w:rPr>
-          <w:rFonts w:ascii="Times New Roman" w:hAnsi="Times New Roman"/>
-          <w:sz w:val="22"/>
-        </w:rPr>
-        <w:t>Bagaimana merancang arsitektur penyimpanan terdistribusi Master-Worker yang mengkoordinasikan distribusi berkas secara transparan?</w:t>
-      </w:r>
-    </w:p>
-    <w:p>
-      <w:pPr>
-        <w:pStyle w:val="ListBullet"/>
-        <w:spacing w:after="60" w:line="276" w:lineRule="auto"/>
-        <w:jc w:val="both"/>
-      </w:pPr>
-      <w:r>
-        <w:rPr>
-          <w:rFonts w:ascii="Times New Roman" w:hAnsi="Times New Roman"/>
-          <w:b/>
-          <w:sz w:val="22"/>
-        </w:rPr>
-        <w:t xml:space="preserve">2. </w:t>
-      </w:r>
-      <w:r>
-        <w:rPr>
-          <w:rFonts w:ascii="Times New Roman" w:hAnsi="Times New Roman"/>
-          <w:sz w:val="22"/>
-        </w:rPr>
-        <w:t>Bagaimana mengimplementasikan strategi replikasi data dengan faktor replikasi N = 2 agar beban penyimpanan merata di antara storage node?</w:t>
-      </w:r>
-    </w:p>
-    <w:p>
-      <w:pPr>
-        <w:pStyle w:val="ListBullet"/>
-        <w:spacing w:after="60" w:line="276" w:lineRule="auto"/>
-        <w:jc w:val="both"/>
-      </w:pPr>
-      <w:r>
-        <w:rPr>
-          <w:rFonts w:ascii="Times New Roman" w:hAnsi="Times New Roman"/>
-          <w:b/>
-          <w:sz w:val="22"/>
-        </w:rPr>
-        <w:t xml:space="preserve">3. </w:t>
-      </w:r>
-      <w:r>
-        <w:rPr>
-          <w:rFonts w:ascii="Times New Roman" w:hAnsi="Times New Roman"/>
-          <w:sz w:val="22"/>
-        </w:rPr>
-        <w:t>Bagaimana mekanisme deteksi kegagalan (heartbeat) dan algoritma failover otomatis saat salah satu storage node mengalami crash?</w:t>
-      </w:r>
-    </w:p>
-    <w:p>
-      <w:pPr>
-        <w:pStyle w:val="ListBullet"/>
-        <w:spacing w:after="60" w:line="276" w:lineRule="auto"/>
-        <w:jc w:val="both"/>
-      </w:pPr>
-      <w:r>
-        <w:rPr>
-          <w:rFonts w:ascii="Times New Roman" w:hAnsi="Times New Roman"/>
-          <w:b/>
-          <w:sz w:val="22"/>
-        </w:rPr>
-        <w:t xml:space="preserve">4. </w:t>
-      </w:r>
-      <w:r>
-        <w:rPr>
-          <w:rFonts w:ascii="Times New Roman" w:hAnsi="Times New Roman"/>
-          <w:sz w:val="22"/>
-        </w:rPr>
-        <w:t>Bagaimana merancang sistem kontrol akses berbasis peran (RBAC) yang aman untuk pengoperasian sistem dan eksperimen publik?</w:t>
-      </w:r>
-    </w:p>
-    <w:p>
-      <w:pPr>
-        <w:keepNext/>
-        <w:spacing w:before="200" w:after="80"/>
-      </w:pPr>
-      <w:r>
-        <w:rPr>
-          <w:rFonts w:ascii="Times New Roman" w:hAnsi="Times New Roman"/>
-          <w:b/>
-          <w:color w:val="2563EB"/>
-          <w:sz w:val="24"/>
-        </w:rPr>
-        <w:t>1.3 Tujuan Proyek</w:t>
-      </w:r>
-    </w:p>
-    <w:p>
-      <w:pPr>
-        <w:pStyle w:val="ListBullet"/>
-        <w:spacing w:after="60" w:line="276" w:lineRule="auto"/>
-        <w:jc w:val="both"/>
-      </w:pPr>
-      <w:r>
-        <w:rPr>
-          <w:rFonts w:ascii="Times New Roman" w:hAnsi="Times New Roman"/>
-          <w:b/>
-          <w:sz w:val="22"/>
-        </w:rPr>
-        <w:t xml:space="preserve">1. </w:t>
-      </w:r>
-      <w:r>
-        <w:rPr>
-          <w:rFonts w:ascii="Times New Roman" w:hAnsi="Times New Roman"/>
-          <w:sz w:val="22"/>
-        </w:rPr>
-        <w:t>Membangun sistem klaster penyimpanan berkas terdistribusi berbasis protokol HTTP REST API menggunakan Python FastAPI dan HTTPX.</w:t>
-      </w:r>
-    </w:p>
-    <w:p>
-      <w:pPr>
-        <w:pStyle w:val="ListBullet"/>
-        <w:spacing w:after="60" w:line="276" w:lineRule="auto"/>
-        <w:jc w:val="both"/>
-      </w:pPr>
-      <w:r>
-        <w:rPr>
-          <w:rFonts w:ascii="Times New Roman" w:hAnsi="Times New Roman"/>
-          <w:b/>
-          <w:sz w:val="22"/>
-        </w:rPr>
-        <w:t xml:space="preserve">2. </w:t>
-      </w:r>
-      <w:r>
-        <w:rPr>
-          <w:rFonts w:ascii="Times New Roman" w:hAnsi="Times New Roman"/>
-          <w:sz w:val="22"/>
-        </w:rPr>
-        <w:t>Mengimplementasikan 3 simpul penyimpanan (Storage Nodes) terisolasi menggunakan mesin virtual Ubuntu Server 24.04 di Oracle VirtualBox (Host-Only Network) dan mendukung proses lokal mandiri.</w:t>
-      </w:r>
-    </w:p>
-    <w:p>
-      <w:pPr>
-        <w:pStyle w:val="ListBullet"/>
-        <w:spacing w:after="60" w:line="276" w:lineRule="auto"/>
-        <w:jc w:val="both"/>
-      </w:pPr>
-      <w:r>
-        <w:rPr>
-          <w:rFonts w:ascii="Times New Roman" w:hAnsi="Times New Roman"/>
-          <w:b/>
-          <w:sz w:val="22"/>
-        </w:rPr>
-        <w:t xml:space="preserve">3. </w:t>
-      </w:r>
-      <w:r>
-        <w:rPr>
-          <w:rFonts w:ascii="Times New Roman" w:hAnsi="Times New Roman"/>
-          <w:sz w:val="22"/>
-        </w:rPr>
-        <w:t>Membuktikan keandalan sistem dalam mempertahankan ketersediaan berkas saat salah satu storage node dinonaktifkan secara sengaja (Node Failure Simulation).</w:t>
-      </w:r>
-    </w:p>
-    <w:p>
-      <w:pPr>
-        <w:pStyle w:val="ListBullet"/>
-        <w:spacing w:after="60" w:line="276" w:lineRule="auto"/>
-        <w:jc w:val="both"/>
-      </w:pPr>
-      <w:r>
-        <w:rPr>
-          <w:rFonts w:ascii="Times New Roman" w:hAnsi="Times New Roman"/>
-          <w:b/>
-          <w:sz w:val="22"/>
-        </w:rPr>
-        <w:t xml:space="preserve">4. </w:t>
-      </w:r>
-      <w:r>
-        <w:rPr>
-          <w:rFonts w:ascii="Times New Roman" w:hAnsi="Times New Roman"/>
-          <w:sz w:val="22"/>
-        </w:rPr>
-        <w:t>Menyediakan antarmuka konsol web operasional yang modern, informatif, dan responsif bagi administrator dan pengguna tamu.</w:t>
-      </w:r>
-    </w:p>
-    <w:p>
-      <w:pPr>
-        <w:keepNext/>
-        <w:spacing w:before="320" w:after="120"/>
+        <w:spacing w:before="220" w:after="80"/>
       </w:pPr>
       <w:r>
         <w:rPr>
           <w:rFonts w:ascii="Times New Roman" w:hAnsi="Times New Roman"/>
           <w:b/>
           <w:color w:val="1E293B"/>
-          <w:sz w:val="26"/>
+          <w:sz w:val="23"/>
         </w:rPr>
-        <w:t>BAB II: LANDASAN TEORI</w:t>
+        <w:t>2.1 Arsitektur dan Topologi Sistem</w:t>
+      </w:r>
+    </w:p>
+    <w:p>
+      <w:pPr>
+        <w:spacing w:line="300" w:lineRule="auto" w:before="0" w:after="120"/>
+        <w:ind w:firstLine="504"/>
+        <w:jc w:val="both"/>
+      </w:pPr>
+      <w:r>
+        <w:rPr>
+          <w:rFonts w:ascii="Times New Roman" w:hAnsi="Times New Roman"/>
+          <w:color w:val="0F172A"/>
+          <w:sz w:val="22"/>
+        </w:rPr>
+        <w:t>Sistem yang dibangun menerapkan arsitektur Master-Worker yang terdiri dari 1 layanan Master Coordinator (berjalan pada port 8000) dan 3 layanan Storage Node independen (Node 1 pada port 8001, Node 2 pada port 8002, dan Node 3 pada port 8003). Seluruh komponen diimplementasikan menggunakan bahasa pemrograman Python 3 dan kerangka kerja web asinkron FastAPI di atas peladen ASGI Uvicorn. Klien berinteraksi secara eksklusif dengan Master Coordinator melalui antarmuka konsol web atau pemanggilan HTTP REST API, sehingga kompleksitas lokasi penyimpanan fisik disembunyikan sepenuhnya dari pengguna (location transparency).</w:t>
       </w:r>
     </w:p>
     <w:p>
       <w:pPr>
         <w:keepNext/>
-        <w:spacing w:before="200" w:after="80"/>
-      </w:pPr>
-      <w:r>
-        <w:rPr>
-          <w:rFonts w:ascii="Times New Roman" w:hAnsi="Times New Roman"/>
-          <w:b/>
-          <w:color w:val="2563EB"/>
-          <w:sz w:val="24"/>
-        </w:rPr>
-        <w:t>2.1 Sistem Terdistribusi dan Model Master-Worker</w:t>
-      </w:r>
-    </w:p>
-    <w:p>
-      <w:pPr>
-        <w:spacing w:after="120" w:line="276" w:lineRule="auto"/>
-        <w:jc w:val="both"/>
-      </w:pPr>
-      <w:r>
-        <w:rPr>
-          <w:rFonts w:ascii="Times New Roman" w:hAnsi="Times New Roman"/>
-          <w:b w:val="0"/>
-          <w:i w:val="0"/>
-          <w:sz w:val="22"/>
-        </w:rPr>
-        <w:t>Sistem terdistribusi didefinisikan sebagai sekumpulan komputer otonom yang terhubung melalui jaringan dan dilengkapi dengan perangkat lunak terdistribusi yang memungkinkan komputer-komputer tersebut tampak sebagai satu kesatuan sistem terpadu bagi pengguna. Dalam model Master-Worker (atau Coordinator-Worker), terdapat pembagian tugas yang jelas:</w:t>
-        <w:br/>
-        <w:t>• Master / Coordinator: Bertindak sebagai titik temu (entry point) klien, pengelola metadata berkas (nama berkas, ukuran, waktu unggah, dan lokasi penempatan replika), pemantau status kesehatan node pekerja, serta pengendali kebijakan autentikasi.</w:t>
-        <w:br/>
-        <w:t>• Worker Storage Nodes: Bertindak sebagai pelaksana penyimpanan fisik murni (storage engines) yang menerima berkas dari koordinator, menuliskannya ke direktori disk lokal, serta menyajikan berkas saat diminta kembali (retrieval).</w:t>
-      </w:r>
-    </w:p>
-    <w:p>
-      <w:pPr>
-        <w:keepNext/>
-        <w:spacing w:before="200" w:after="80"/>
-      </w:pPr>
-      <w:r>
-        <w:rPr>
-          <w:rFonts w:ascii="Times New Roman" w:hAnsi="Times New Roman"/>
-          <w:b/>
-          <w:color w:val="2563EB"/>
-          <w:sz w:val="24"/>
-        </w:rPr>
-        <w:t>2.2 Kebijakan Replikasi Data (Data Replication)</w:t>
-      </w:r>
-    </w:p>
-    <w:p>
-      <w:pPr>
-        <w:spacing w:after="120" w:line="276" w:lineRule="auto"/>
-        <w:jc w:val="both"/>
-      </w:pPr>
-      <w:r>
-        <w:rPr>
-          <w:rFonts w:ascii="Times New Roman" w:hAnsi="Times New Roman"/>
-          <w:b w:val="0"/>
-          <w:i w:val="0"/>
-          <w:sz w:val="22"/>
-        </w:rPr>
-        <w:t>Replikasi data adalah teknik menduplikasi objek data yang sama ke lebih dari satu node dalam klaster. Keuntungan utama dari replikasi data meliputi peningkatan toleransi kesalahan (Fault Tolerance) dan peningkatan throughput pembacaan. Faktor replikasi (Replication Factor, R) menentukan jumlah salinan berkas di dalam sistem. Pada penelitian ini, ditetapkan R = 2 dari total N = 3 storage node. Nilai R = 2 memberikan keseimbangan optimal antara efisiensi konsumsi ruang disk dan jaminan ketersediaan data, sehingga sistem sanggup mentolerir kegagalan simultan sebanyak F = R - 1 = 1 node tanpa kehilangan akses berkas.</w:t>
-      </w:r>
-    </w:p>
-    <w:p>
-      <w:pPr>
-        <w:keepNext/>
-        <w:spacing w:before="200" w:after="80"/>
-      </w:pPr>
-      <w:r>
-        <w:rPr>
-          <w:rFonts w:ascii="Times New Roman" w:hAnsi="Times New Roman"/>
-          <w:b/>
-          <w:color w:val="2563EB"/>
-          <w:sz w:val="24"/>
-        </w:rPr>
-        <w:t>2.3 Mekanisme Detak Jantung (Heartbeat) dan Failover</w:t>
-      </w:r>
-    </w:p>
-    <w:p>
-      <w:pPr>
-        <w:spacing w:after="120" w:line="276" w:lineRule="auto"/>
-        <w:jc w:val="both"/>
-      </w:pPr>
-      <w:r>
-        <w:rPr>
-          <w:rFonts w:ascii="Times New Roman" w:hAnsi="Times New Roman"/>
-          <w:b w:val="0"/>
-          <w:i w:val="0"/>
-          <w:sz w:val="22"/>
-        </w:rPr>
-        <w:t>Untuk mendeteksi kegagalan node pekerja secara real-time, koordinator menjalankan proses pemantauan periodik asinkron (heartbeat monitoring loop). Koordinator mengirimkan probe HTTP GET ke rute '/health' pada masing-masing storage node setiap interval waktu t = 3.0 detik. Jika node merespons dengan HTTP status 200 OK dan data statistik, status node dicatat sebagai 'online'. Apabila node tidak merespons dalam batas waktu batas tunggu (timeout = 4.0 detik) atau mengalami Connection Refused, koordinator seketika mengubah status node menjadi 'offline'. Ketika pengguna meminta unduhan berkas yang berada pada node yang offline, koordinator menjalankan failover otomatis ke node replika kedua tanpa memutus sesi unduhan pengguna.</w:t>
-      </w:r>
-    </w:p>
-    <w:p>
-      <w:pPr>
-        <w:keepNext/>
-        <w:spacing w:before="320" w:after="120"/>
-      </w:pPr>
-      <w:r>
-        <w:rPr>
-          <w:rFonts w:ascii="Times New Roman" w:hAnsi="Times New Roman"/>
-          <w:b/>
-          <w:color w:val="1E293B"/>
-          <w:sz w:val="26"/>
-        </w:rPr>
-        <w:t>BAB III: METODOLOGI DAN PERANCANGAN SISTEM</w:t>
-      </w:r>
-    </w:p>
-    <w:p>
-      <w:pPr>
-        <w:keepNext/>
-        <w:spacing w:before="200" w:after="80"/>
-      </w:pPr>
-      <w:r>
-        <w:rPr>
-          <w:rFonts w:ascii="Times New Roman" w:hAnsi="Times New Roman"/>
-          <w:b/>
-          <w:color w:val="2563EB"/>
-          <w:sz w:val="24"/>
-        </w:rPr>
-        <w:t>3.1 Arsitektur Jaringan dan Topologi Klaster</w:t>
-      </w:r>
-    </w:p>
-    <w:p>
-      <w:pPr>
-        <w:spacing w:after="120" w:line="276" w:lineRule="auto"/>
-        <w:jc w:val="both"/>
-      </w:pPr>
-      <w:r>
-        <w:rPr>
-          <w:rFonts w:ascii="Times New Roman" w:hAnsi="Times New Roman"/>
-          <w:b w:val="0"/>
-          <w:i w:val="0"/>
-          <w:sz w:val="22"/>
-        </w:rPr>
-        <w:t>Topologi jaringan klaster dirancang menggunakan skema Host-Only Networking pada Oracle VirtualBox (Subnet 192.168.56.0/24). Komputer Host bertindak sebagai Master Coordinator yang berkomunikasi secara langsung dengan 3 mesin virtual independen yang menjalankan sistem operasi Ubuntu Server 24.04 LTS. Komponen arsitektur dan interaksi antarsimpul diperlihatkan pada Gambar 1.</w:t>
-      </w:r>
-    </w:p>
-    <w:p>
-      <w:pPr>
-        <w:spacing w:before="160" w:after="40"/>
+        <w:spacing w:before="160" w:after="80"/>
         <w:jc w:val="center"/>
       </w:pPr>
       <w:r>
         <w:drawing>
           <wp:inline xmlns:a="http://schemas.openxmlformats.org/drawingml/2006/main" xmlns:pic="http://schemas.openxmlformats.org/drawingml/2006/picture">
-            <wp:extent cx="5669280" cy="3378662"/>
+            <wp:extent cx="5212080" cy="3106189"/>
             <wp:docPr id="1" name="Picture 1"/>
             <wp:cNvGraphicFramePr>
               <a:graphicFrameLocks noChangeAspect="1"/>
@@ -521,7 +361,7 @@
                   <pic:spPr>
                     <a:xfrm>
                       <a:off x="0" y="0"/>
-                      <a:ext cx="5669280" cy="3378662"/>
+                      <a:ext cx="5212080" cy="3106189"/>
                     </a:xfrm>
                     <a:prstGeom prst="rect"/>
                   </pic:spPr>
@@ -534,48 +374,66 @@
     </w:p>
     <w:p>
       <w:pPr>
-        <w:spacing w:before="80" w:after="200"/>
+        <w:spacing w:before="40" w:after="200"/>
         <w:jc w:val="center"/>
       </w:pPr>
       <w:r>
         <w:rPr>
           <w:rFonts w:ascii="Times New Roman" w:hAnsi="Times New Roman"/>
           <w:i/>
-          <w:color w:val="475569"/>
+          <w:color w:val="334155"/>
           <w:sz w:val="20"/>
         </w:rPr>
-        <w:t>Gambar 1: Diagram Blok Arsitektur Master-Worker Klaster Penyimpanan Terdistribusi</w:t>
+        <w:t>Gambar 1. Arsitektur Sistem Penyimpanan Terdistribusi Berbasis Master-Worker.</w:t>
+      </w:r>
+    </w:p>
+    <w:p>
+      <w:pPr>
+        <w:spacing w:line="300" w:lineRule="auto" w:before="0" w:after="120"/>
+        <w:ind w:firstLine="504"/>
+        <w:jc w:val="both"/>
+      </w:pPr>
+      <w:r>
+        <w:rPr>
+          <w:rFonts w:ascii="Times New Roman" w:hAnsi="Times New Roman"/>
+          <w:color w:val="0F172A"/>
+          <w:sz w:val="22"/>
+        </w:rPr>
+        <w:t>Untuk mendukung fleksibilitas pengujian, sistem dirancang dengan konfigurasi topologi ganda (dual-mode topology) pada berkas config.py, yaitu Mode Lokal (Multi-Process Local Cluster pada 127.0.0.1) untuk simulasi cepat di satu perangkat, serta Mode Mesin Virtual (VirtualBox Host-Only Network 192.168.56.0/24) untuk pengujian lintas sistem operasi secara terisolasi. Spesifikasi konfigurasi jaringan klaster dirangkum pada Tabel 1.</w:t>
       </w:r>
     </w:p>
     <w:tbl>
       <w:tblPr>
+        <w:tblStyle w:val="TableGrid"/>
         <w:tblW w:type="auto" w:w="0"/>
         <w:jc w:val="center"/>
         <w:tblLook w:firstColumn="1" w:firstRow="1" w:lastColumn="0" w:lastRow="0" w:noHBand="0" w:noVBand="1" w:val="04A0"/>
       </w:tblPr>
       <w:tblGrid>
-        <w:gridCol w:w="1806"/>
-        <w:gridCol w:w="1806"/>
-        <w:gridCol w:w="1806"/>
-        <w:gridCol w:w="1806"/>
-        <w:gridCol w:w="1806"/>
+        <w:gridCol w:w="1777"/>
+        <w:gridCol w:w="1777"/>
+        <w:gridCol w:w="1777"/>
+        <w:gridCol w:w="1777"/>
+        <w:gridCol w:w="1777"/>
       </w:tblGrid>
       <w:tr>
         <w:tc>
           <w:tcPr>
-            <w:tcW w:type="dxa" w:w="1806"/>
+            <w:tcW w:type="dxa" w:w="1872"/>
             <w:shd w:val="clear" w:color="auto" w:fill="1E293B"/>
             <w:tcMar>
-              <w:top w:w="120" w:type="dxa"/>
-              <w:bottom w:w="120" w:type="dxa"/>
-              <w:left w:w="150" w:type="dxa"/>
-              <w:right w:w="150" w:type="dxa"/>
+              <w:top w:w="90" w:type="dxa"/>
+              <w:bottom w:w="90" w:type="dxa"/>
+              <w:left w:w="120" w:type="dxa"/>
+              <w:right w:w="120" w:type="dxa"/>
             </w:tcMar>
           </w:tcPr>
           <w:p>
             <w:pPr>
-              <w:jc w:val="center"/>
+              <w:spacing w:before="40" w:after="40"/>
+              <w:jc w:val="left"/>
             </w:pPr>
+            <w:r/>
             <w:r>
               <w:rPr>
                 <w:rFonts w:ascii="Times New Roman" w:hAnsi="Times New Roman"/>
@@ -583,25 +441,27 @@
                 <w:color w:val="FFFFFF"/>
                 <w:sz w:val="20"/>
               </w:rPr>
-              <w:t>Node Peran</w:t>
+              <w:t>Komponen Klaster</w:t>
             </w:r>
           </w:p>
         </w:tc>
         <w:tc>
           <w:tcPr>
-            <w:tcW w:type="dxa" w:w="1806"/>
+            <w:tcW w:type="dxa" w:w="1152"/>
             <w:shd w:val="clear" w:color="auto" w:fill="1E293B"/>
             <w:tcMar>
-              <w:top w:w="120" w:type="dxa"/>
-              <w:bottom w:w="120" w:type="dxa"/>
-              <w:left w:w="150" w:type="dxa"/>
-              <w:right w:w="150" w:type="dxa"/>
+              <w:top w:w="90" w:type="dxa"/>
+              <w:bottom w:w="90" w:type="dxa"/>
+              <w:left w:w="120" w:type="dxa"/>
+              <w:right w:w="120" w:type="dxa"/>
             </w:tcMar>
           </w:tcPr>
           <w:p>
             <w:pPr>
-              <w:jc w:val="center"/>
+              <w:spacing w:before="40" w:after="40"/>
+              <w:jc w:val="left"/>
             </w:pPr>
+            <w:r/>
             <w:r>
               <w:rPr>
                 <w:rFonts w:ascii="Times New Roman" w:hAnsi="Times New Roman"/>
@@ -609,25 +469,27 @@
                 <w:color w:val="FFFFFF"/>
                 <w:sz w:val="20"/>
               </w:rPr>
-              <w:t>Identitas</w:t>
+              <w:t>ID Simpul</w:t>
             </w:r>
           </w:p>
         </w:tc>
         <w:tc>
           <w:tcPr>
-            <w:tcW w:type="dxa" w:w="1806"/>
+            <w:tcW w:type="dxa" w:w="1656"/>
             <w:shd w:val="clear" w:color="auto" w:fill="1E293B"/>
             <w:tcMar>
-              <w:top w:w="120" w:type="dxa"/>
-              <w:bottom w:w="120" w:type="dxa"/>
-              <w:left w:w="150" w:type="dxa"/>
-              <w:right w:w="150" w:type="dxa"/>
+              <w:top w:w="90" w:type="dxa"/>
+              <w:bottom w:w="90" w:type="dxa"/>
+              <w:left w:w="120" w:type="dxa"/>
+              <w:right w:w="120" w:type="dxa"/>
             </w:tcMar>
           </w:tcPr>
           <w:p>
             <w:pPr>
-              <w:jc w:val="center"/>
+              <w:spacing w:before="40" w:after="40"/>
+              <w:jc w:val="left"/>
             </w:pPr>
+            <w:r/>
             <w:r>
               <w:rPr>
                 <w:rFonts w:ascii="Times New Roman" w:hAnsi="Times New Roman"/>
@@ -635,25 +497,27 @@
                 <w:color w:val="FFFFFF"/>
                 <w:sz w:val="20"/>
               </w:rPr>
-              <w:t>Alamat IP</w:t>
+              <w:t>Alamat Mode Lokal</w:t>
             </w:r>
           </w:p>
         </w:tc>
         <w:tc>
           <w:tcPr>
-            <w:tcW w:type="dxa" w:w="1806"/>
+            <w:tcW w:type="dxa" w:w="1944"/>
             <w:shd w:val="clear" w:color="auto" w:fill="1E293B"/>
             <w:tcMar>
-              <w:top w:w="120" w:type="dxa"/>
-              <w:bottom w:w="120" w:type="dxa"/>
-              <w:left w:w="150" w:type="dxa"/>
-              <w:right w:w="150" w:type="dxa"/>
+              <w:top w:w="90" w:type="dxa"/>
+              <w:bottom w:w="90" w:type="dxa"/>
+              <w:left w:w="120" w:type="dxa"/>
+              <w:right w:w="120" w:type="dxa"/>
             </w:tcMar>
           </w:tcPr>
           <w:p>
             <w:pPr>
-              <w:jc w:val="center"/>
+              <w:spacing w:before="40" w:after="40"/>
+              <w:jc w:val="left"/>
             </w:pPr>
+            <w:r/>
             <w:r>
               <w:rPr>
                 <w:rFonts w:ascii="Times New Roman" w:hAnsi="Times New Roman"/>
@@ -661,25 +525,27 @@
                 <w:color w:val="FFFFFF"/>
                 <w:sz w:val="20"/>
               </w:rPr>
-              <w:t>Port Layanan</w:t>
+              <w:t>Alamat Mode VM (VirtualBox)</w:t>
             </w:r>
           </w:p>
         </w:tc>
         <w:tc>
           <w:tcPr>
-            <w:tcW w:type="dxa" w:w="1806"/>
+            <w:tcW w:type="dxa" w:w="2736"/>
             <w:shd w:val="clear" w:color="auto" w:fill="1E293B"/>
             <w:tcMar>
-              <w:top w:w="120" w:type="dxa"/>
-              <w:bottom w:w="120" w:type="dxa"/>
-              <w:left w:w="150" w:type="dxa"/>
-              <w:right w:w="150" w:type="dxa"/>
+              <w:top w:w="90" w:type="dxa"/>
+              <w:bottom w:w="90" w:type="dxa"/>
+              <w:left w:w="120" w:type="dxa"/>
+              <w:right w:w="120" w:type="dxa"/>
             </w:tcMar>
           </w:tcPr>
           <w:p>
             <w:pPr>
-              <w:jc w:val="center"/>
+              <w:spacing w:before="40" w:after="40"/>
+              <w:jc w:val="left"/>
             </w:pPr>
+            <w:r/>
             <w:r>
               <w:rPr>
                 <w:rFonts w:ascii="Times New Roman" w:hAnsi="Times New Roman"/>
@@ -687,7 +553,7 @@
                 <w:color w:val="FFFFFF"/>
                 <w:sz w:val="20"/>
               </w:rPr>
-              <w:t>Lingkungan Eksekusi</w:t>
+              <w:t>Peran &amp; Tanggung Jawab Utama</w:t>
             </w:r>
           </w:p>
         </w:tc>
@@ -695,44 +561,51 @@
       <w:tr>
         <w:tc>
           <w:tcPr>
-            <w:tcW w:type="dxa" w:w="1806"/>
-            <w:shd w:val="clear" w:color="auto" w:fill="F8FAFC"/>
+            <w:tcW w:type="dxa" w:w="1872"/>
+            <w:shd w:val="clear" w:color="auto" w:fill="FFFFFF"/>
             <w:tcMar>
-              <w:top w:w="100" w:type="dxa"/>
-              <w:bottom w:w="100" w:type="dxa"/>
-              <w:left w:w="120" w:type="dxa"/>
-              <w:right w:w="120" w:type="dxa"/>
-            </w:tcMar>
-          </w:tcPr>
-          <w:p>
-            <w:r>
-              <w:rPr>
-                <w:rFonts w:ascii="Times New Roman" w:hAnsi="Times New Roman"/>
-                <w:sz w:val="19"/>
-              </w:rPr>
-              <w:t>Coordinator (Master)</w:t>
-            </w:r>
-          </w:p>
-        </w:tc>
-        <w:tc>
-          <w:tcPr>
-            <w:tcW w:type="dxa" w:w="1806"/>
-            <w:shd w:val="clear" w:color="auto" w:fill="F8FAFC"/>
-            <w:tcMar>
-              <w:top w:w="100" w:type="dxa"/>
-              <w:bottom w:w="100" w:type="dxa"/>
+              <w:top w:w="75" w:type="dxa"/>
+              <w:bottom w:w="75" w:type="dxa"/>
               <w:left w:w="120" w:type="dxa"/>
               <w:right w:w="120" w:type="dxa"/>
             </w:tcMar>
           </w:tcPr>
           <w:p>
             <w:pPr>
-              <w:jc w:val="center"/>
+              <w:spacing w:before="40" w:after="40"/>
             </w:pPr>
+            <w:r/>
             <w:r>
               <w:rPr>
-                <w:rFonts w:ascii="Courier New" w:hAnsi="Courier New"/>
-                <w:sz w:val="18"/>
+                <w:rFonts w:ascii="Times New Roman" w:hAnsi="Times New Roman"/>
+                <w:color w:val="0F172A"/>
+                <w:sz w:val="20"/>
+              </w:rPr>
+              <w:t>Master Coordinator</w:t>
+            </w:r>
+          </w:p>
+        </w:tc>
+        <w:tc>
+          <w:tcPr>
+            <w:tcW w:type="dxa" w:w="1152"/>
+            <w:shd w:val="clear" w:color="auto" w:fill="FFFFFF"/>
+            <w:tcMar>
+              <w:top w:w="75" w:type="dxa"/>
+              <w:bottom w:w="75" w:type="dxa"/>
+              <w:left w:w="120" w:type="dxa"/>
+              <w:right w:w="120" w:type="dxa"/>
+            </w:tcMar>
+          </w:tcPr>
+          <w:p>
+            <w:pPr>
+              <w:spacing w:before="40" w:after="40"/>
+            </w:pPr>
+            <w:r/>
+            <w:r>
+              <w:rPr>
+                <w:rFonts w:ascii="Times New Roman" w:hAnsi="Times New Roman"/>
+                <w:color w:val="0F172A"/>
+                <w:sz w:val="20"/>
               </w:rPr>
               <w:t>coordinator</w:t>
             </w:r>
@@ -740,70 +613,79 @@
         </w:tc>
         <w:tc>
           <w:tcPr>
-            <w:tcW w:type="dxa" w:w="1806"/>
-            <w:shd w:val="clear" w:color="auto" w:fill="F8FAFC"/>
+            <w:tcW w:type="dxa" w:w="1656"/>
+            <w:shd w:val="clear" w:color="auto" w:fill="FFFFFF"/>
             <w:tcMar>
-              <w:top w:w="100" w:type="dxa"/>
-              <w:bottom w:w="100" w:type="dxa"/>
+              <w:top w:w="75" w:type="dxa"/>
+              <w:bottom w:w="75" w:type="dxa"/>
               <w:left w:w="120" w:type="dxa"/>
               <w:right w:w="120" w:type="dxa"/>
             </w:tcMar>
           </w:tcPr>
           <w:p>
             <w:pPr>
-              <w:jc w:val="center"/>
+              <w:spacing w:before="40" w:after="40"/>
             </w:pPr>
+            <w:r/>
             <w:r>
               <w:rPr>
-                <w:rFonts w:ascii="Courier New" w:hAnsi="Courier New"/>
-                <w:sz w:val="18"/>
+                <w:rFonts w:ascii="Times New Roman" w:hAnsi="Times New Roman"/>
+                <w:color w:val="0F172A"/>
+                <w:sz w:val="20"/>
               </w:rPr>
-              <w:t>0.0.0.0 (Localhost / LAN)</w:t>
+              <w:t>127.0.0.1:8000</w:t>
             </w:r>
           </w:p>
         </w:tc>
         <w:tc>
           <w:tcPr>
-            <w:tcW w:type="dxa" w:w="1806"/>
-            <w:shd w:val="clear" w:color="auto" w:fill="F8FAFC"/>
+            <w:tcW w:type="dxa" w:w="1944"/>
+            <w:shd w:val="clear" w:color="auto" w:fill="FFFFFF"/>
             <w:tcMar>
-              <w:top w:w="100" w:type="dxa"/>
-              <w:bottom w:w="100" w:type="dxa"/>
+              <w:top w:w="75" w:type="dxa"/>
+              <w:bottom w:w="75" w:type="dxa"/>
               <w:left w:w="120" w:type="dxa"/>
               <w:right w:w="120" w:type="dxa"/>
             </w:tcMar>
           </w:tcPr>
           <w:p>
             <w:pPr>
-              <w:jc w:val="center"/>
+              <w:spacing w:before="40" w:after="40"/>
             </w:pPr>
+            <w:r/>
             <w:r>
               <w:rPr>
-                <w:rFonts w:ascii="Courier New" w:hAnsi="Courier New"/>
-                <w:sz w:val="18"/>
+                <w:rFonts w:ascii="Times New Roman" w:hAnsi="Times New Roman"/>
+                <w:color w:val="0F172A"/>
+                <w:sz w:val="20"/>
               </w:rPr>
-              <w:t>8000</w:t>
+              <w:t>192.168.56.1:8000</w:t>
             </w:r>
           </w:p>
         </w:tc>
         <w:tc>
           <w:tcPr>
-            <w:tcW w:type="dxa" w:w="1806"/>
-            <w:shd w:val="clear" w:color="auto" w:fill="F8FAFC"/>
+            <w:tcW w:type="dxa" w:w="2736"/>
+            <w:shd w:val="clear" w:color="auto" w:fill="FFFFFF"/>
             <w:tcMar>
-              <w:top w:w="100" w:type="dxa"/>
-              <w:bottom w:w="100" w:type="dxa"/>
+              <w:top w:w="75" w:type="dxa"/>
+              <w:bottom w:w="75" w:type="dxa"/>
               <w:left w:w="120" w:type="dxa"/>
               <w:right w:w="120" w:type="dxa"/>
             </w:tcMar>
           </w:tcPr>
           <w:p>
+            <w:pPr>
+              <w:spacing w:before="40" w:after="40"/>
+            </w:pPr>
+            <w:r/>
             <w:r>
               <w:rPr>
                 <w:rFonts w:ascii="Times New Roman" w:hAnsi="Times New Roman"/>
-                <w:sz w:val="19"/>
+                <w:color w:val="0F172A"/>
+                <w:sz w:val="20"/>
               </w:rPr>
-              <w:t>Host OS Windows 11 (Python FastAPI)</w:t>
+              <w:t>Manajemen metadata, RBAC, heartbeat, seleksi replika &amp; failover</w:t>
             </w:r>
           </w:p>
         </w:tc>
@@ -811,44 +693,51 @@
       <w:tr>
         <w:tc>
           <w:tcPr>
-            <w:tcW w:type="dxa" w:w="1806"/>
-            <w:shd w:val="clear" w:color="auto" w:fill="FFFFFF"/>
+            <w:tcW w:type="dxa" w:w="1872"/>
+            <w:shd w:val="clear" w:color="auto" w:fill="F8FAFC"/>
             <w:tcMar>
-              <w:top w:w="100" w:type="dxa"/>
-              <w:bottom w:w="100" w:type="dxa"/>
-              <w:left w:w="120" w:type="dxa"/>
-              <w:right w:w="120" w:type="dxa"/>
-            </w:tcMar>
-          </w:tcPr>
-          <w:p>
-            <w:r>
-              <w:rPr>
-                <w:rFonts w:ascii="Times New Roman" w:hAnsi="Times New Roman"/>
-                <w:sz w:val="19"/>
-              </w:rPr>
-              <w:t>Storage Node 1 (Worker)</w:t>
-            </w:r>
-          </w:p>
-        </w:tc>
-        <w:tc>
-          <w:tcPr>
-            <w:tcW w:type="dxa" w:w="1806"/>
-            <w:shd w:val="clear" w:color="auto" w:fill="FFFFFF"/>
-            <w:tcMar>
-              <w:top w:w="100" w:type="dxa"/>
-              <w:bottom w:w="100" w:type="dxa"/>
+              <w:top w:w="75" w:type="dxa"/>
+              <w:bottom w:w="75" w:type="dxa"/>
               <w:left w:w="120" w:type="dxa"/>
               <w:right w:w="120" w:type="dxa"/>
             </w:tcMar>
           </w:tcPr>
           <w:p>
             <w:pPr>
-              <w:jc w:val="center"/>
+              <w:spacing w:before="40" w:after="40"/>
             </w:pPr>
+            <w:r/>
             <w:r>
               <w:rPr>
-                <w:rFonts w:ascii="Courier New" w:hAnsi="Courier New"/>
-                <w:sz w:val="18"/>
+                <w:rFonts w:ascii="Times New Roman" w:hAnsi="Times New Roman"/>
+                <w:color w:val="0F172A"/>
+                <w:sz w:val="20"/>
+              </w:rPr>
+              <w:t>Storage Node 1</w:t>
+            </w:r>
+          </w:p>
+        </w:tc>
+        <w:tc>
+          <w:tcPr>
+            <w:tcW w:type="dxa" w:w="1152"/>
+            <w:shd w:val="clear" w:color="auto" w:fill="F8FAFC"/>
+            <w:tcMar>
+              <w:top w:w="75" w:type="dxa"/>
+              <w:bottom w:w="75" w:type="dxa"/>
+              <w:left w:w="120" w:type="dxa"/>
+              <w:right w:w="120" w:type="dxa"/>
+            </w:tcMar>
+          </w:tcPr>
+          <w:p>
+            <w:pPr>
+              <w:spacing w:before="40" w:after="40"/>
+            </w:pPr>
+            <w:r/>
+            <w:r>
+              <w:rPr>
+                <w:rFonts w:ascii="Times New Roman" w:hAnsi="Times New Roman"/>
+                <w:color w:val="0F172A"/>
+                <w:sz w:val="20"/>
               </w:rPr>
               <w:t>node1</w:t>
             </w:r>
@@ -856,70 +745,79 @@
         </w:tc>
         <w:tc>
           <w:tcPr>
-            <w:tcW w:type="dxa" w:w="1806"/>
-            <w:shd w:val="clear" w:color="auto" w:fill="FFFFFF"/>
+            <w:tcW w:type="dxa" w:w="1656"/>
+            <w:shd w:val="clear" w:color="auto" w:fill="F8FAFC"/>
             <w:tcMar>
-              <w:top w:w="100" w:type="dxa"/>
-              <w:bottom w:w="100" w:type="dxa"/>
+              <w:top w:w="75" w:type="dxa"/>
+              <w:bottom w:w="75" w:type="dxa"/>
               <w:left w:w="120" w:type="dxa"/>
               <w:right w:w="120" w:type="dxa"/>
             </w:tcMar>
           </w:tcPr>
           <w:p>
             <w:pPr>
-              <w:jc w:val="center"/>
+              <w:spacing w:before="40" w:after="40"/>
             </w:pPr>
+            <w:r/>
             <w:r>
               <w:rPr>
-                <w:rFonts w:ascii="Courier New" w:hAnsi="Courier New"/>
-                <w:sz w:val="18"/>
+                <w:rFonts w:ascii="Times New Roman" w:hAnsi="Times New Roman"/>
+                <w:color w:val="0F172A"/>
+                <w:sz w:val="20"/>
               </w:rPr>
-              <w:t>192.168.56.102 (atau 127.0.0.1)</w:t>
+              <w:t>127.0.0.1:8001</w:t>
             </w:r>
           </w:p>
         </w:tc>
         <w:tc>
           <w:tcPr>
-            <w:tcW w:type="dxa" w:w="1806"/>
-            <w:shd w:val="clear" w:color="auto" w:fill="FFFFFF"/>
+            <w:tcW w:type="dxa" w:w="1944"/>
+            <w:shd w:val="clear" w:color="auto" w:fill="F8FAFC"/>
             <w:tcMar>
-              <w:top w:w="100" w:type="dxa"/>
-              <w:bottom w:w="100" w:type="dxa"/>
+              <w:top w:w="75" w:type="dxa"/>
+              <w:bottom w:w="75" w:type="dxa"/>
               <w:left w:w="120" w:type="dxa"/>
               <w:right w:w="120" w:type="dxa"/>
             </w:tcMar>
           </w:tcPr>
           <w:p>
             <w:pPr>
-              <w:jc w:val="center"/>
+              <w:spacing w:before="40" w:after="40"/>
             </w:pPr>
+            <w:r/>
             <w:r>
               <w:rPr>
-                <w:rFonts w:ascii="Courier New" w:hAnsi="Courier New"/>
-                <w:sz w:val="18"/>
+                <w:rFonts w:ascii="Times New Roman" w:hAnsi="Times New Roman"/>
+                <w:color w:val="0F172A"/>
+                <w:sz w:val="20"/>
               </w:rPr>
-              <w:t>8001</w:t>
+              <w:t>192.168.56.102:8001</w:t>
             </w:r>
           </w:p>
         </w:tc>
         <w:tc>
           <w:tcPr>
-            <w:tcW w:type="dxa" w:w="1806"/>
-            <w:shd w:val="clear" w:color="auto" w:fill="FFFFFF"/>
+            <w:tcW w:type="dxa" w:w="2736"/>
+            <w:shd w:val="clear" w:color="auto" w:fill="F8FAFC"/>
             <w:tcMar>
-              <w:top w:w="100" w:type="dxa"/>
-              <w:bottom w:w="100" w:type="dxa"/>
+              <w:top w:w="75" w:type="dxa"/>
+              <w:bottom w:w="75" w:type="dxa"/>
               <w:left w:w="120" w:type="dxa"/>
               <w:right w:w="120" w:type="dxa"/>
             </w:tcMar>
           </w:tcPr>
           <w:p>
+            <w:pPr>
+              <w:spacing w:before="40" w:after="40"/>
+            </w:pPr>
+            <w:r/>
             <w:r>
               <w:rPr>
                 <w:rFonts w:ascii="Times New Roman" w:hAnsi="Times New Roman"/>
-                <w:sz w:val="19"/>
+                <w:color w:val="0F172A"/>
+                <w:sz w:val="20"/>
               </w:rPr>
-              <w:t>VirtualBox VM Ubuntu Server 24.04</w:t>
+              <w:t>Simpul pekerja penyimpanan fisik berkas replika ke-1 / ke-2</w:t>
             </w:r>
           </w:p>
         </w:tc>
@@ -927,44 +825,51 @@
       <w:tr>
         <w:tc>
           <w:tcPr>
-            <w:tcW w:type="dxa" w:w="1806"/>
-            <w:shd w:val="clear" w:color="auto" w:fill="F8FAFC"/>
+            <w:tcW w:type="dxa" w:w="1872"/>
+            <w:shd w:val="clear" w:color="auto" w:fill="FFFFFF"/>
             <w:tcMar>
-              <w:top w:w="100" w:type="dxa"/>
-              <w:bottom w:w="100" w:type="dxa"/>
-              <w:left w:w="120" w:type="dxa"/>
-              <w:right w:w="120" w:type="dxa"/>
-            </w:tcMar>
-          </w:tcPr>
-          <w:p>
-            <w:r>
-              <w:rPr>
-                <w:rFonts w:ascii="Times New Roman" w:hAnsi="Times New Roman"/>
-                <w:sz w:val="19"/>
-              </w:rPr>
-              <w:t>Storage Node 2 (Worker)</w:t>
-            </w:r>
-          </w:p>
-        </w:tc>
-        <w:tc>
-          <w:tcPr>
-            <w:tcW w:type="dxa" w:w="1806"/>
-            <w:shd w:val="clear" w:color="auto" w:fill="F8FAFC"/>
-            <w:tcMar>
-              <w:top w:w="100" w:type="dxa"/>
-              <w:bottom w:w="100" w:type="dxa"/>
+              <w:top w:w="75" w:type="dxa"/>
+              <w:bottom w:w="75" w:type="dxa"/>
               <w:left w:w="120" w:type="dxa"/>
               <w:right w:w="120" w:type="dxa"/>
             </w:tcMar>
           </w:tcPr>
           <w:p>
             <w:pPr>
-              <w:jc w:val="center"/>
+              <w:spacing w:before="40" w:after="40"/>
             </w:pPr>
+            <w:r/>
             <w:r>
               <w:rPr>
-                <w:rFonts w:ascii="Courier New" w:hAnsi="Courier New"/>
-                <w:sz w:val="18"/>
+                <w:rFonts w:ascii="Times New Roman" w:hAnsi="Times New Roman"/>
+                <w:color w:val="0F172A"/>
+                <w:sz w:val="20"/>
+              </w:rPr>
+              <w:t>Storage Node 2</w:t>
+            </w:r>
+          </w:p>
+        </w:tc>
+        <w:tc>
+          <w:tcPr>
+            <w:tcW w:type="dxa" w:w="1152"/>
+            <w:shd w:val="clear" w:color="auto" w:fill="FFFFFF"/>
+            <w:tcMar>
+              <w:top w:w="75" w:type="dxa"/>
+              <w:bottom w:w="75" w:type="dxa"/>
+              <w:left w:w="120" w:type="dxa"/>
+              <w:right w:w="120" w:type="dxa"/>
+            </w:tcMar>
+          </w:tcPr>
+          <w:p>
+            <w:pPr>
+              <w:spacing w:before="40" w:after="40"/>
+            </w:pPr>
+            <w:r/>
+            <w:r>
+              <w:rPr>
+                <w:rFonts w:ascii="Times New Roman" w:hAnsi="Times New Roman"/>
+                <w:color w:val="0F172A"/>
+                <w:sz w:val="20"/>
               </w:rPr>
               <w:t>node2</w:t>
             </w:r>
@@ -972,70 +877,79 @@
         </w:tc>
         <w:tc>
           <w:tcPr>
-            <w:tcW w:type="dxa" w:w="1806"/>
-            <w:shd w:val="clear" w:color="auto" w:fill="F8FAFC"/>
+            <w:tcW w:type="dxa" w:w="1656"/>
+            <w:shd w:val="clear" w:color="auto" w:fill="FFFFFF"/>
             <w:tcMar>
-              <w:top w:w="100" w:type="dxa"/>
-              <w:bottom w:w="100" w:type="dxa"/>
+              <w:top w:w="75" w:type="dxa"/>
+              <w:bottom w:w="75" w:type="dxa"/>
               <w:left w:w="120" w:type="dxa"/>
               <w:right w:w="120" w:type="dxa"/>
             </w:tcMar>
           </w:tcPr>
           <w:p>
             <w:pPr>
-              <w:jc w:val="center"/>
+              <w:spacing w:before="40" w:after="40"/>
             </w:pPr>
+            <w:r/>
             <w:r>
               <w:rPr>
-                <w:rFonts w:ascii="Courier New" w:hAnsi="Courier New"/>
-                <w:sz w:val="18"/>
+                <w:rFonts w:ascii="Times New Roman" w:hAnsi="Times New Roman"/>
+                <w:color w:val="0F172A"/>
+                <w:sz w:val="20"/>
               </w:rPr>
-              <w:t>192.168.56.103 (atau 127.0.0.1)</w:t>
+              <w:t>127.0.0.1:8002</w:t>
             </w:r>
           </w:p>
         </w:tc>
         <w:tc>
           <w:tcPr>
-            <w:tcW w:type="dxa" w:w="1806"/>
-            <w:shd w:val="clear" w:color="auto" w:fill="F8FAFC"/>
+            <w:tcW w:type="dxa" w:w="1944"/>
+            <w:shd w:val="clear" w:color="auto" w:fill="FFFFFF"/>
             <w:tcMar>
-              <w:top w:w="100" w:type="dxa"/>
-              <w:bottom w:w="100" w:type="dxa"/>
+              <w:top w:w="75" w:type="dxa"/>
+              <w:bottom w:w="75" w:type="dxa"/>
               <w:left w:w="120" w:type="dxa"/>
               <w:right w:w="120" w:type="dxa"/>
             </w:tcMar>
           </w:tcPr>
           <w:p>
             <w:pPr>
-              <w:jc w:val="center"/>
+              <w:spacing w:before="40" w:after="40"/>
             </w:pPr>
+            <w:r/>
             <w:r>
               <w:rPr>
-                <w:rFonts w:ascii="Courier New" w:hAnsi="Courier New"/>
-                <w:sz w:val="18"/>
+                <w:rFonts w:ascii="Times New Roman" w:hAnsi="Times New Roman"/>
+                <w:color w:val="0F172A"/>
+                <w:sz w:val="20"/>
               </w:rPr>
-              <w:t>8002</w:t>
+              <w:t>192.168.56.103:8002</w:t>
             </w:r>
           </w:p>
         </w:tc>
         <w:tc>
           <w:tcPr>
-            <w:tcW w:type="dxa" w:w="1806"/>
-            <w:shd w:val="clear" w:color="auto" w:fill="F8FAFC"/>
+            <w:tcW w:type="dxa" w:w="2736"/>
+            <w:shd w:val="clear" w:color="auto" w:fill="FFFFFF"/>
             <w:tcMar>
-              <w:top w:w="100" w:type="dxa"/>
-              <w:bottom w:w="100" w:type="dxa"/>
+              <w:top w:w="75" w:type="dxa"/>
+              <w:bottom w:w="75" w:type="dxa"/>
               <w:left w:w="120" w:type="dxa"/>
               <w:right w:w="120" w:type="dxa"/>
             </w:tcMar>
           </w:tcPr>
           <w:p>
+            <w:pPr>
+              <w:spacing w:before="40" w:after="40"/>
+            </w:pPr>
+            <w:r/>
             <w:r>
               <w:rPr>
                 <w:rFonts w:ascii="Times New Roman" w:hAnsi="Times New Roman"/>
-                <w:sz w:val="19"/>
+                <w:color w:val="0F172A"/>
+                <w:sz w:val="20"/>
               </w:rPr>
-              <w:t>VirtualBox VM Ubuntu Server 24.04</w:t>
+              <w:t>Simpul pekerja penyimpanan fisik berkas replika ke-1 / ke-2</w:t>
             </w:r>
           </w:p>
         </w:tc>
@@ -1043,44 +957,51 @@
       <w:tr>
         <w:tc>
           <w:tcPr>
-            <w:tcW w:type="dxa" w:w="1806"/>
-            <w:shd w:val="clear" w:color="auto" w:fill="FFFFFF"/>
+            <w:tcW w:type="dxa" w:w="1872"/>
+            <w:shd w:val="clear" w:color="auto" w:fill="F8FAFC"/>
             <w:tcMar>
-              <w:top w:w="100" w:type="dxa"/>
-              <w:bottom w:w="100" w:type="dxa"/>
-              <w:left w:w="120" w:type="dxa"/>
-              <w:right w:w="120" w:type="dxa"/>
-            </w:tcMar>
-          </w:tcPr>
-          <w:p>
-            <w:r>
-              <w:rPr>
-                <w:rFonts w:ascii="Times New Roman" w:hAnsi="Times New Roman"/>
-                <w:sz w:val="19"/>
-              </w:rPr>
-              <w:t>Storage Node 3 (Worker)</w:t>
-            </w:r>
-          </w:p>
-        </w:tc>
-        <w:tc>
-          <w:tcPr>
-            <w:tcW w:type="dxa" w:w="1806"/>
-            <w:shd w:val="clear" w:color="auto" w:fill="FFFFFF"/>
-            <w:tcMar>
-              <w:top w:w="100" w:type="dxa"/>
-              <w:bottom w:w="100" w:type="dxa"/>
+              <w:top w:w="75" w:type="dxa"/>
+              <w:bottom w:w="75" w:type="dxa"/>
               <w:left w:w="120" w:type="dxa"/>
               <w:right w:w="120" w:type="dxa"/>
             </w:tcMar>
           </w:tcPr>
           <w:p>
             <w:pPr>
-              <w:jc w:val="center"/>
+              <w:spacing w:before="40" w:after="40"/>
             </w:pPr>
+            <w:r/>
             <w:r>
               <w:rPr>
-                <w:rFonts w:ascii="Courier New" w:hAnsi="Courier New"/>
-                <w:sz w:val="18"/>
+                <w:rFonts w:ascii="Times New Roman" w:hAnsi="Times New Roman"/>
+                <w:color w:val="0F172A"/>
+                <w:sz w:val="20"/>
+              </w:rPr>
+              <w:t>Storage Node 3</w:t>
+            </w:r>
+          </w:p>
+        </w:tc>
+        <w:tc>
+          <w:tcPr>
+            <w:tcW w:type="dxa" w:w="1152"/>
+            <w:shd w:val="clear" w:color="auto" w:fill="F8FAFC"/>
+            <w:tcMar>
+              <w:top w:w="75" w:type="dxa"/>
+              <w:bottom w:w="75" w:type="dxa"/>
+              <w:left w:w="120" w:type="dxa"/>
+              <w:right w:w="120" w:type="dxa"/>
+            </w:tcMar>
+          </w:tcPr>
+          <w:p>
+            <w:pPr>
+              <w:spacing w:before="40" w:after="40"/>
+            </w:pPr>
+            <w:r/>
+            <w:r>
+              <w:rPr>
+                <w:rFonts w:ascii="Times New Roman" w:hAnsi="Times New Roman"/>
+                <w:color w:val="0F172A"/>
+                <w:sz w:val="20"/>
               </w:rPr>
               <w:t>node3</w:t>
             </w:r>
@@ -1088,128 +1009,191 @@
         </w:tc>
         <w:tc>
           <w:tcPr>
-            <w:tcW w:type="dxa" w:w="1806"/>
-            <w:shd w:val="clear" w:color="auto" w:fill="FFFFFF"/>
+            <w:tcW w:type="dxa" w:w="1656"/>
+            <w:shd w:val="clear" w:color="auto" w:fill="F8FAFC"/>
             <w:tcMar>
-              <w:top w:w="100" w:type="dxa"/>
-              <w:bottom w:w="100" w:type="dxa"/>
+              <w:top w:w="75" w:type="dxa"/>
+              <w:bottom w:w="75" w:type="dxa"/>
               <w:left w:w="120" w:type="dxa"/>
               <w:right w:w="120" w:type="dxa"/>
             </w:tcMar>
           </w:tcPr>
           <w:p>
             <w:pPr>
-              <w:jc w:val="center"/>
+              <w:spacing w:before="40" w:after="40"/>
             </w:pPr>
+            <w:r/>
             <w:r>
               <w:rPr>
-                <w:rFonts w:ascii="Courier New" w:hAnsi="Courier New"/>
-                <w:sz w:val="18"/>
+                <w:rFonts w:ascii="Times New Roman" w:hAnsi="Times New Roman"/>
+                <w:color w:val="0F172A"/>
+                <w:sz w:val="20"/>
               </w:rPr>
-              <w:t>192.168.56.104 (atau 127.0.0.1)</w:t>
+              <w:t>127.0.0.1:8003</w:t>
             </w:r>
           </w:p>
         </w:tc>
         <w:tc>
           <w:tcPr>
-            <w:tcW w:type="dxa" w:w="1806"/>
-            <w:shd w:val="clear" w:color="auto" w:fill="FFFFFF"/>
+            <w:tcW w:type="dxa" w:w="1944"/>
+            <w:shd w:val="clear" w:color="auto" w:fill="F8FAFC"/>
             <w:tcMar>
-              <w:top w:w="100" w:type="dxa"/>
-              <w:bottom w:w="100" w:type="dxa"/>
+              <w:top w:w="75" w:type="dxa"/>
+              <w:bottom w:w="75" w:type="dxa"/>
               <w:left w:w="120" w:type="dxa"/>
               <w:right w:w="120" w:type="dxa"/>
             </w:tcMar>
           </w:tcPr>
           <w:p>
             <w:pPr>
-              <w:jc w:val="center"/>
+              <w:spacing w:before="40" w:after="40"/>
             </w:pPr>
+            <w:r/>
             <w:r>
               <w:rPr>
-                <w:rFonts w:ascii="Courier New" w:hAnsi="Courier New"/>
-                <w:sz w:val="18"/>
+                <w:rFonts w:ascii="Times New Roman" w:hAnsi="Times New Roman"/>
+                <w:color w:val="0F172A"/>
+                <w:sz w:val="20"/>
               </w:rPr>
-              <w:t>8003</w:t>
+              <w:t>192.168.56.104:8003</w:t>
             </w:r>
           </w:p>
         </w:tc>
         <w:tc>
           <w:tcPr>
-            <w:tcW w:type="dxa" w:w="1806"/>
-            <w:shd w:val="clear" w:color="auto" w:fill="FFFFFF"/>
+            <w:tcW w:type="dxa" w:w="2736"/>
+            <w:shd w:val="clear" w:color="auto" w:fill="F8FAFC"/>
             <w:tcMar>
-              <w:top w:w="100" w:type="dxa"/>
-              <w:bottom w:w="100" w:type="dxa"/>
+              <w:top w:w="75" w:type="dxa"/>
+              <w:bottom w:w="75" w:type="dxa"/>
               <w:left w:w="120" w:type="dxa"/>
               <w:right w:w="120" w:type="dxa"/>
             </w:tcMar>
           </w:tcPr>
           <w:p>
+            <w:pPr>
+              <w:spacing w:before="40" w:after="40"/>
+            </w:pPr>
+            <w:r/>
             <w:r>
               <w:rPr>
                 <w:rFonts w:ascii="Times New Roman" w:hAnsi="Times New Roman"/>
-                <w:sz w:val="19"/>
+                <w:color w:val="0F172A"/>
+                <w:sz w:val="20"/>
               </w:rPr>
-              <w:t>VirtualBox VM Ubuntu Server 24.04</w:t>
+              <w:t>Simpul pekerja penyimpanan fisik berkas replika ke-1 / ke-2</w:t>
             </w:r>
           </w:p>
         </w:tc>
       </w:tr>
     </w:tbl>
+    <w:p/>
     <w:p>
       <w:pPr>
-        <w:spacing w:after="120" w:line="276" w:lineRule="auto"/>
+        <w:keepNext/>
+        <w:spacing w:before="220" w:after="80"/>
+      </w:pPr>
+      <w:r>
+        <w:rPr>
+          <w:rFonts w:ascii="Times New Roman" w:hAnsi="Times New Roman"/>
+          <w:b/>
+          <w:color w:val="1E293B"/>
+          <w:sz w:val="23"/>
+        </w:rPr>
+        <w:t>2.2 Mekanisme Kerja Replikasi, Heartbeat, dan Failover</w:t>
+      </w:r>
+    </w:p>
+    <w:p>
+      <w:pPr>
+        <w:spacing w:line="300" w:lineRule="auto" w:before="0" w:after="120"/>
+        <w:ind w:firstLine="504"/>
         <w:jc w:val="both"/>
       </w:pPr>
       <w:r>
         <w:rPr>
           <w:rFonts w:ascii="Times New Roman" w:hAnsi="Times New Roman"/>
-          <w:b w:val="0"/>
-          <w:i w:val="0"/>
+          <w:color w:val="0F172A"/>
           <w:sz w:val="22"/>
         </w:rPr>
+        <w:t>Siklus hidup operasional data di dalam klaster dibagi menjadi tiga mekanisme inti yang bekerja secara terkoordinasi, sebagaimana diilustrasikan pada Gambar 2:</w:t>
+      </w:r>
+    </w:p>
+    <w:p>
+      <w:pPr>
+        <w:pStyle w:val="ListBullet"/>
+        <w:spacing w:line="288" w:lineRule="auto" w:before="20" w:after="60"/>
+        <w:jc w:val="both"/>
+      </w:pPr>
+      <w:r>
+        <w:rPr>
+          <w:rFonts w:ascii="Times New Roman" w:hAnsi="Times New Roman"/>
+          <w:b/>
+          <w:sz w:val="22"/>
+        </w:rPr>
+        <w:t xml:space="preserve">1. Pemantauan Kesehatan Simpul (Asynchronous Heartbeat): </w:t>
+      </w:r>
+      <w:r>
+        <w:rPr>
+          <w:rFonts w:ascii="Times New Roman" w:hAnsi="Times New Roman"/>
+          <w:sz w:val="22"/>
+        </w:rPr>
+        <w:t>Modul NodeTracker pada koordinator menjalankan tugas latar belakang (background coroutine) yang memanggil endpoint GET /health pada setiap Storage Node setiap interval 3 detik dengan batas waktu (timeout) 2 detik. Setiap node yang merespons HTTP 200 OK melaporkan jumlah berkas (file_count) dan total byte penyimpanan yang digunakan. Jika terjadi kegagalan koneksi atau simulasi pemutusan node, status simpul segera diperbarui menjadi offline.</w:t>
+      </w:r>
+    </w:p>
+    <w:p>
+      <w:pPr>
+        <w:pStyle w:val="ListBullet"/>
+        <w:spacing w:line="288" w:lineRule="auto" w:before="20" w:after="60"/>
+        <w:jc w:val="both"/>
+      </w:pPr>
+      <w:r>
+        <w:rPr>
+          <w:rFonts w:ascii="Times New Roman" w:hAnsi="Times New Roman"/>
+          <w:b/>
+          <w:sz w:val="22"/>
+        </w:rPr>
+        <w:t xml:space="preserve">2. Algoritma Replikasi Beban Terendah (Least-Loaded Replication): </w:t>
+      </w:r>
+      <w:r>
+        <w:rPr>
+          <w:rFonts w:ascii="Times New Roman" w:hAnsi="Times New Roman"/>
+          <w:sz w:val="22"/>
+        </w:rPr>
+        <w:t>Saat klien mengunggah berkas melalui POST /api/upload, koordinator menyaring daftar simpul yang berstatus online, mengurutkannya secara menaik berdasarkan jumlah berkas yang tersimpan (file_count), lalu memilih 2 simpul dengan beban paling rendah (DEFAULT_REPLICATION_FACTOR = 2). Koordinator menghasilkan pengenal unik UUID (file_id) dan meneruskan berkas ke kedua simpul tersebut melalui POST /store/{file_id}. Setelah kedua simpul berhasil menyimpan berkas, koordinator memperbarui katalog metadata persisten (coordinator_metadata.json) serta menambahkan penghitung beban node di memori secara instan agar unggahan berikutnya terdistribusi merata (round-robin/least-loaded).</w:t>
+      </w:r>
+    </w:p>
+    <w:p>
+      <w:pPr>
+        <w:pStyle w:val="ListBullet"/>
+        <w:spacing w:line="288" w:lineRule="auto" w:before="20" w:after="60"/>
+        <w:jc w:val="both"/>
+      </w:pPr>
+      <w:r>
+        <w:rPr>
+          <w:rFonts w:ascii="Times New Roman" w:hAnsi="Times New Roman"/>
+          <w:b/>
+          <w:sz w:val="22"/>
+        </w:rPr>
+        <w:t xml:space="preserve">3. Pengalihan Unduhan Otomatis (Automatic Download Failover): </w:t>
+      </w:r>
+      <w:r>
+        <w:rPr>
+          <w:rFonts w:ascii="Times New Roman" w:hAnsi="Times New Roman"/>
+          <w:sz w:val="22"/>
+        </w:rPr>
+        <w:t>Ketika klien meminta unduhan berkas melalui GET /api/download/{file_id}, koordinator membaca daftar simpul pemilik replika dari katalog metadata dan menyaringnya terhadap daftar simpul yang sedang aktif. Koordinator mencoba mengambil aliran biner berkas dari simpul kandidat pertama melalui GET /retrieve/{file_id}. Apabila simpul pertama mengalami kegagalan mendadak atau berstatus mati (offline), koordinator secara otomatis mengalihkan permintaan ke simpul replika kedua tanpa mengembalikan pesan kesalahan kepada pengguna, serta menyematkan header HTTP X-Served-By untuk menginformasikan simpul mana yang melayani unduhan tersebut.</w:t>
       </w:r>
     </w:p>
     <w:p>
       <w:pPr>
         <w:keepNext/>
-        <w:spacing w:before="200" w:after="80"/>
-      </w:pPr>
-      <w:r>
-        <w:rPr>
-          <w:rFonts w:ascii="Times New Roman" w:hAnsi="Times New Roman"/>
-          <w:b/>
-          <w:color w:val="2563EB"/>
-          <w:sz w:val="24"/>
-        </w:rPr>
-        <w:t>3.2 Alur Kerja Replikasi dan Toleransi Kesalahan (Failover Workflow)</w:t>
-      </w:r>
-    </w:p>
-    <w:p>
-      <w:pPr>
-        <w:spacing w:after="120" w:line="276" w:lineRule="auto"/>
-        <w:jc w:val="both"/>
-      </w:pPr>
-      <w:r>
-        <w:rPr>
-          <w:rFonts w:ascii="Times New Roman" w:hAnsi="Times New Roman"/>
-          <w:b w:val="0"/>
-          <w:i w:val="0"/>
-          <w:sz w:val="22"/>
-        </w:rPr>
-        <w:t>Sistem memiliki dua alur kerja utama yang menjaga integritas data dan ketersediaan layanan, yaitu alur penulisan (Replication Write) dan alur pembacaan toleran kegagalan (Failover Read). Rincian alur kerja diperlihatkan pada Gambar 2.</w:t>
-      </w:r>
-    </w:p>
-    <w:p>
-      <w:pPr>
-        <w:spacing w:before="160" w:after="40"/>
+        <w:spacing w:before="160" w:after="80"/>
         <w:jc w:val="center"/>
       </w:pPr>
       <w:r>
         <w:drawing>
           <wp:inline xmlns:a="http://schemas.openxmlformats.org/drawingml/2006/main" xmlns:pic="http://schemas.openxmlformats.org/drawingml/2006/picture">
-            <wp:extent cx="5760720" cy="2614108"/>
+            <wp:extent cx="5486400" cy="2489627"/>
             <wp:docPr id="2" name="Picture 2"/>
             <wp:cNvGraphicFramePr>
               <a:graphicFrameLocks noChangeAspect="1"/>
@@ -1230,7 +1214,7 @@
                   <pic:spPr>
                     <a:xfrm>
                       <a:off x="0" y="0"/>
-                      <a:ext cx="5760720" cy="2614108"/>
+                      <a:ext cx="5486400" cy="2489627"/>
                     </a:xfrm>
                     <a:prstGeom prst="rect"/>
                   </pic:spPr>
@@ -1243,133 +1227,47 @@
     </w:p>
     <w:p>
       <w:pPr>
-        <w:spacing w:before="80" w:after="200"/>
+        <w:spacing w:before="40" w:after="200"/>
         <w:jc w:val="center"/>
       </w:pPr>
       <w:r>
         <w:rPr>
           <w:rFonts w:ascii="Times New Roman" w:hAnsi="Times New Roman"/>
           <w:i/>
-          <w:color w:val="475569"/>
+          <w:color w:val="334155"/>
           <w:sz w:val="20"/>
         </w:rPr>
-        <w:t>Gambar 2: Diagram Alur Kerja: (A) Replikasi Berkas 2x dan (B) Mekanisme Failover Unduhan Otomatis</w:t>
+        <w:t>Gambar 2. Diagram Alur Replikasi Berkas (Kiri) dan Mekanisme Automatic Failover Saat Node Mati (Kanan).</w:t>
       </w:r>
     </w:p>
     <w:p>
       <w:pPr>
         <w:keepNext/>
-        <w:spacing w:before="200" w:after="80"/>
+        <w:spacing w:before="220" w:after="80"/>
       </w:pPr>
       <w:r>
         <w:rPr>
           <w:rFonts w:ascii="Times New Roman" w:hAnsi="Times New Roman"/>
           <w:b/>
-          <w:color w:val="2563EB"/>
-          <w:sz w:val="24"/>
+          <w:color w:val="1E293B"/>
+          <w:sz w:val="23"/>
         </w:rPr>
-        <w:t>3.3 Penjelasan Alur Replikasi Berkas (Upload)</w:t>
+        <w:t>2.3 Kontrol Akses Berbasis Peran (Role-Based Access Control)</w:t>
       </w:r>
     </w:p>
     <w:p>
       <w:pPr>
-        <w:spacing w:after="120" w:line="276" w:lineRule="auto"/>
+        <w:spacing w:line="300" w:lineRule="auto" w:before="0" w:after="120"/>
+        <w:ind w:firstLine="504"/>
         <w:jc w:val="both"/>
       </w:pPr>
       <w:r>
         <w:rPr>
           <w:rFonts w:ascii="Times New Roman" w:hAnsi="Times New Roman"/>
-          <w:b w:val="0"/>
-          <w:i w:val="0"/>
+          <w:color w:val="0F172A"/>
           <w:sz w:val="22"/>
         </w:rPr>
-        <w:t>Tahapan operasional saat pengguna mengunggah berkas baru (Gambar 2A) adalah sebagai berikut:</w:t>
-        <w:br/>
-        <w:t>1. Klien mengirimkan file melalui antarmuka web (POST /api/upload) dalam format multipart/form-data.</w:t>
-        <w:br/>
-        <w:t>2. Koordinator membaca aliran byte berkas dan memvalidasi ukuran serta nama berkas.</w:t>
-        <w:br/>
-        <w:t>3. Koordinator memanggil fungsi 'node_tracker.select_replica_nodes(count=2)'. Algoritma ini memeriksa daftar seluruh simpul yang berstatus 'online' dan mengurutkannya berdasarkan jumlah berkas terendah ('file_count' terkecil) guna menjamin pemerataan beban penyimpanan (Load Balancing).</w:t>
-        <w:br/>
-        <w:t>4. Koordinator membuat entri metadata sementara dan mengeksekusi pengunggahan paralel asinkron ke endpoint '/store/{file_id}' pada kedua node terpilih menggunakan pustaka HTTPX.</w:t>
-        <w:br/>
-        <w:t>5. Storage Node menerima berkas, menyimpannya di path 'storage_data/{node_id}/{file_id}_{filename}', dan mengembalikan status 200 OK.</w:t>
-        <w:br/>
-        <w:t>6. Koordinator memverifikasi bahwa berkas berhasil ditulis ke kedua simpul, mencatat ID node lokasi ke metadata.json, lalu mengirimkan konfirmasi sukses ke pengguna.</w:t>
-      </w:r>
-    </w:p>
-    <w:p>
-      <w:pPr>
-        <w:keepNext/>
-        <w:spacing w:before="200" w:after="80"/>
-      </w:pPr>
-      <w:r>
-        <w:rPr>
-          <w:rFonts w:ascii="Times New Roman" w:hAnsi="Times New Roman"/>
-          <w:b/>
-          <w:color w:val="2563EB"/>
-          <w:sz w:val="24"/>
-        </w:rPr>
-        <w:t>3.4 Penjelasan Alur Failover Unduhan (Download Retrieval)</w:t>
-      </w:r>
-    </w:p>
-    <w:p>
-      <w:pPr>
-        <w:spacing w:after="120" w:line="276" w:lineRule="auto"/>
-        <w:jc w:val="both"/>
-      </w:pPr>
-      <w:r>
-        <w:rPr>
-          <w:rFonts w:ascii="Times New Roman" w:hAnsi="Times New Roman"/>
-          <w:b w:val="0"/>
-          <w:i w:val="0"/>
-          <w:sz w:val="22"/>
-        </w:rPr>
-        <w:t>Tahapan operasional penanganan kegagalan saat unduhan berkas (Gambar 2B) dirancang dengan prinsip transparansi penuh:</w:t>
-        <w:br/>
-        <w:t>1. Klien mengklik tombol 'Unduh' pada dashboard web (GET /api/download/{file_id}).</w:t>
-        <w:br/>
-        <w:t>2. Koordinator mengekstrak daftar node penyimpan berkas dari katalog metadata (misal: [node1, node2]).</w:t>
-        <w:br/>
-        <w:t>3. Koordinator menyaring simpul tersebut dengan daftar node yang saat ini berstatus 'online' (misal: node1 offline, candidate = [node2]).</w:t>
-        <w:br/>
-        <w:t>4. Koordinator mencoba melakukan request retrieval ke kandidat pertama. Jika kandidat pertama offline atau mengalami kendala jaringan, blok penanganan pengecualian (try-except) seketika menangkap error dan mengalihkan pembacaan ke kandidat node berikutnya secara transparan.</w:t>
-        <w:br/>
-        <w:t>5. Data byte berkas dialirkan (streaming) ke klien dengan header 'Content-Disposition: attachment' dan header diagnostik 'X-Served-By: nodeX' yang membuktikan simpul mana yang melayani unduhan.</w:t>
-      </w:r>
-    </w:p>
-    <w:p>
-      <w:pPr>
-        <w:keepNext/>
-        <w:spacing w:before="200" w:after="80"/>
-      </w:pPr>
-      <w:r>
-        <w:rPr>
-          <w:rFonts w:ascii="Times New Roman" w:hAnsi="Times New Roman"/>
-          <w:b/>
-          <w:color w:val="2563EB"/>
-          <w:sz w:val="24"/>
-        </w:rPr>
-        <w:t>3.5 Desain Keamanan dan Kontrol Akses (Role-Based Access Control / RBAC)</w:t>
-      </w:r>
-    </w:p>
-    <w:p>
-      <w:pPr>
-        <w:spacing w:after="120" w:line="276" w:lineRule="auto"/>
-        <w:jc w:val="both"/>
-      </w:pPr>
-      <w:r>
-        <w:rPr>
-          <w:rFonts w:ascii="Times New Roman" w:hAnsi="Times New Roman"/>
-          <w:b w:val="0"/>
-          <w:i w:val="0"/>
-          <w:sz w:val="22"/>
-        </w:rPr>
-        <w:t>Sistem menerapkan pengamanan berbasis token sesi (X-Auth-Token) yang mengautentikasi dua kelompok peran:</w:t>
-        <w:br/>
-        <w:t>• Administrator (Username: 'ardi', Password: 'ardi123'): Memiliki otorisasi penuh atas klaster, termasuk hak menghapus berkas tunggal, menghapus seluruh berkas klaster, melakukan simulasi kegagalan node, mengaktifkan/menonaktifkan pintu masuk pengguna tamu, dan mengatur otoritas eksperimen tamu.</w:t>
-        <w:br/>
-        <w:t>• Pengguna Tamu (Guest): Masuk melalui 1-klik tanpa kredensial sandi. Secara default, tamu hanya memiliki izin baca, unggah, dan unduh berkas. Tamu tidak diizinkan mematikan node atau menghapus berkas kecuali Administrator secara eksplisit menyalakan saklar 'Mode Eksperimen Tamu'.</w:t>
+        <w:t>Sistem dilengkapi manajemen sesi berbasis token (header X-Auth-Token) yang membedakan hak akses antara Administrator dan Tamu (Guest). Administrator memiliki kendali penuh atas klaster, termasuk dua sakelar kebijakan dinamis secara waktu nyata: (1) Izinkan Akses Tamu, yang apabila dimatikan akan menolak login tamu baru sekaligus mencabut seluruh sesi tamu yang sedang aktif; serta (2) Mode Eksperimen Tamu, yang memungkinkan pengguna tamu berpartisipasi dalam eksperimen penghapusan berkas dan simulasi pemutusan node tanpa perlu membagikan kredensial administrator.</w:t>
       </w:r>
     </w:p>
     <w:p>
@@ -1381,208 +1279,535 @@
         <w:rPr>
           <w:rFonts w:ascii="Times New Roman" w:hAnsi="Times New Roman"/>
           <w:b/>
-          <w:color w:val="1E293B"/>
+          <w:color w:val="0F172A"/>
           <w:sz w:val="26"/>
         </w:rPr>
-        <w:t>BAB IV: HASIL PENGUJIAN DAN EVALUASI</w:t>
+        <w:t>BAB III  HASIL, PEMBAHASAN, DAN KESIMPULAN</w:t>
       </w:r>
     </w:p>
     <w:p>
       <w:pPr>
         <w:keepNext/>
-        <w:spacing w:before="200" w:after="80"/>
+        <w:spacing w:before="220" w:after="80"/>
       </w:pPr>
       <w:r>
         <w:rPr>
           <w:rFonts w:ascii="Times New Roman" w:hAnsi="Times New Roman"/>
           <w:b/>
-          <w:color w:val="2563EB"/>
-          <w:sz w:val="24"/>
+          <w:color w:val="1E293B"/>
+          <w:sz w:val="23"/>
         </w:rPr>
-        <w:t>4.1 Matriks Skenario Pengujian Fungsionalitas</w:t>
+        <w:t>3.1 Implementasi Antarmuka Konsol Web</w:t>
       </w:r>
     </w:p>
     <w:p>
       <w:pPr>
-        <w:spacing w:after="120" w:line="276" w:lineRule="auto"/>
+        <w:spacing w:line="300" w:lineRule="auto" w:before="0" w:after="120"/>
+        <w:ind w:firstLine="504"/>
         <w:jc w:val="both"/>
       </w:pPr>
       <w:r>
         <w:rPr>
           <w:rFonts w:ascii="Times New Roman" w:hAnsi="Times New Roman"/>
-          <w:b w:val="0"/>
-          <w:i w:val="0"/>
+          <w:color w:val="0F172A"/>
           <w:sz w:val="22"/>
         </w:rPr>
-        <w:t>Pengujian dilakukan secara empiris untuk mengevaluasi setiap mekanisme terdistribusi yang telah dibangun. Seluruh skenario dieksekusi dan dicatat hasilnya ke dalam matriks pengujian berikut:</w:t>
+        <w:t>Antarmuka pengguna dirancang sebagai konsol operasional satu halaman (Single-Page Operational Console) berbahasa Indonesia yang mengutamakan keterbacaan metrik klaster. Halaman masuk (Gambar 3) menyediakan pemisahan autentikasi yang jelas antara masuk sebagai Administrator menggunakan kredensial akun dan masuk sebagai Tamu dalam satu klik apabila diizinkan oleh administrator.</w:t>
+      </w:r>
+    </w:p>
+    <w:p>
+      <w:pPr>
+        <w:keepNext/>
+        <w:spacing w:before="160" w:after="80"/>
+        <w:jc w:val="center"/>
+      </w:pPr>
+      <w:r>
+        <w:drawing>
+          <wp:inline xmlns:a="http://schemas.openxmlformats.org/drawingml/2006/main" xmlns:pic="http://schemas.openxmlformats.org/drawingml/2006/picture">
+            <wp:extent cx="5029200" cy="2884394"/>
+            <wp:docPr id="3" name="Picture 3"/>
+            <wp:cNvGraphicFramePr>
+              <a:graphicFrameLocks noChangeAspect="1"/>
+            </wp:cNvGraphicFramePr>
+            <a:graphic>
+              <a:graphicData uri="http://schemas.openxmlformats.org/drawingml/2006/picture">
+                <pic:pic>
+                  <pic:nvPicPr>
+                    <pic:cNvPr id="0" name="1_halaman_login.png"/>
+                    <pic:cNvPicPr/>
+                  </pic:nvPicPr>
+                  <pic:blipFill>
+                    <a:blip r:embed="rId11"/>
+                    <a:stretch>
+                      <a:fillRect/>
+                    </a:stretch>
+                  </pic:blipFill>
+                  <pic:spPr>
+                    <a:xfrm>
+                      <a:off x="0" y="0"/>
+                      <a:ext cx="5029200" cy="2884394"/>
+                    </a:xfrm>
+                    <a:prstGeom prst="rect"/>
+                  </pic:spPr>
+                </pic:pic>
+              </a:graphicData>
+            </a:graphic>
+          </wp:inline>
+        </w:drawing>
+      </w:r>
+    </w:p>
+    <w:p>
+      <w:pPr>
+        <w:spacing w:before="40" w:after="200"/>
+        <w:jc w:val="center"/>
+      </w:pPr>
+      <w:r>
+        <w:rPr>
+          <w:rFonts w:ascii="Times New Roman" w:hAnsi="Times New Roman"/>
+          <w:i/>
+          <w:color w:val="334155"/>
+          <w:sz w:val="20"/>
+        </w:rPr>
+        <w:t>Gambar 3. Antarmuka Halaman Masuk (Autentikasi Administrator dan Akses Tamu).</w:t>
+      </w:r>
+    </w:p>
+    <w:p>
+      <w:pPr>
+        <w:spacing w:line="300" w:lineRule="auto" w:before="0" w:after="120"/>
+        <w:ind w:firstLine="504"/>
+        <w:jc w:val="both"/>
+      </w:pPr>
+      <w:r>
+        <w:rPr>
+          <w:rFonts w:ascii="Times New Roman" w:hAnsi="Times New Roman"/>
+          <w:color w:val="0F172A"/>
+          <w:sz w:val="22"/>
+        </w:rPr>
+        <w:t>Setelah masuk sebagai Administrator (Gambar 4), konsol menampilkan empat bagian utama secara berurutan dari atas ke bawah: (1) panel Kontrol Akses dengan dua sakelar kebijakan tamu; (2) bilah ringkasan metrik klaster (Node Aktif 3/3, Faktor Replikasi 2, Jumlah Berkas, dan Berkas Tersedia); (3) tabel status Node Penyimpanan beserta tombol simulasi Matikan/Nyalakan; serta (4) zona unggah berkas (drag-and-drop) dan tabel katalog berkas yang menampilkan lokasi replika secara langsung.</w:t>
+      </w:r>
+    </w:p>
+    <w:p>
+      <w:pPr>
+        <w:keepNext/>
+        <w:spacing w:before="160" w:after="80"/>
+        <w:jc w:val="center"/>
+      </w:pPr>
+      <w:r>
+        <w:drawing>
+          <wp:inline xmlns:a="http://schemas.openxmlformats.org/drawingml/2006/main" xmlns:pic="http://schemas.openxmlformats.org/drawingml/2006/picture">
+            <wp:extent cx="5212080" cy="4706202"/>
+            <wp:docPr id="4" name="Picture 4"/>
+            <wp:cNvGraphicFramePr>
+              <a:graphicFrameLocks noChangeAspect="1"/>
+            </wp:cNvGraphicFramePr>
+            <a:graphic>
+              <a:graphicData uri="http://schemas.openxmlformats.org/drawingml/2006/picture">
+                <pic:pic>
+                  <pic:nvPicPr>
+                    <pic:cNvPr id="0" name="2_dashboard_admin_normal.png"/>
+                    <pic:cNvPicPr/>
+                  </pic:nvPicPr>
+                  <pic:blipFill>
+                    <a:blip r:embed="rId12"/>
+                    <a:stretch>
+                      <a:fillRect/>
+                    </a:stretch>
+                  </pic:blipFill>
+                  <pic:spPr>
+                    <a:xfrm>
+                      <a:off x="0" y="0"/>
+                      <a:ext cx="5212080" cy="4706202"/>
+                    </a:xfrm>
+                    <a:prstGeom prst="rect"/>
+                  </pic:spPr>
+                </pic:pic>
+              </a:graphicData>
+            </a:graphic>
+          </wp:inline>
+        </w:drawing>
+      </w:r>
+    </w:p>
+    <w:p>
+      <w:pPr>
+        <w:spacing w:before="40" w:after="200"/>
+        <w:jc w:val="center"/>
+      </w:pPr>
+      <w:r>
+        <w:rPr>
+          <w:rFonts w:ascii="Times New Roman" w:hAnsi="Times New Roman"/>
+          <w:i/>
+          <w:color w:val="334155"/>
+          <w:sz w:val="20"/>
+        </w:rPr>
+        <w:t>Gambar 4. Tampilan Dashboard Administrator Saat Seluruh Storage Node Berstatus Aktif (Normal).</w:t>
+      </w:r>
+    </w:p>
+    <w:p>
+      <w:pPr>
+        <w:spacing w:line="300" w:lineRule="auto" w:before="0" w:after="120"/>
+        <w:ind w:firstLine="504"/>
+        <w:jc w:val="both"/>
+      </w:pPr>
+      <w:r>
+        <w:rPr>
+          <w:rFonts w:ascii="Times New Roman" w:hAnsi="Times New Roman"/>
+          <w:color w:val="0F172A"/>
+          <w:sz w:val="22"/>
+        </w:rPr>
+        <w:t>Sebagaimana terlihat pada Gambar 4, ketika tiga berkas uji (Laporan_Sistem_Terdistribusi.pdf berukuran 418,0 KB, Dataset_Telemetri_Node_2026.csv berukuran 135,4 KB, dan Topologi_Master_Worker.png berukuran 279,9 KB) diunggah secara berurutan, algoritma seleksi beban terendah mendistribusikan keenam salinan replika secara seimbang ke ketiga simpul penyimpanan: masing-masing Node 1, Node 2, dan Node 3 menyimpan tepat 2 replika berkas.</w:t>
+      </w:r>
+    </w:p>
+    <w:p>
+      <w:pPr>
+        <w:keepNext/>
+        <w:spacing w:before="220" w:after="80"/>
+      </w:pPr>
+      <w:r>
+        <w:rPr>
+          <w:rFonts w:ascii="Times New Roman" w:hAnsi="Times New Roman"/>
+          <w:b/>
+          <w:color w:val="1E293B"/>
+          <w:sz w:val="23"/>
+        </w:rPr>
+        <w:t>3.2 Pengujian Simulasi Kegagalan Node dan Failover Otomatis</w:t>
+      </w:r>
+    </w:p>
+    <w:p>
+      <w:pPr>
+        <w:spacing w:line="300" w:lineRule="auto" w:before="0" w:after="120"/>
+        <w:ind w:firstLine="504"/>
+        <w:jc w:val="both"/>
+      </w:pPr>
+      <w:r>
+        <w:rPr>
+          <w:rFonts w:ascii="Times New Roman" w:hAnsi="Times New Roman"/>
+          <w:color w:val="0F172A"/>
+          <w:sz w:val="22"/>
+        </w:rPr>
+        <w:t>Untuk memvalidasi ketahanan sistem terhadap kegagalan simpul (fault tolerance), dilakukan skenario pengujian dengan mematikan Storage Node 1 (node1) melalui tombol simulasi pada konsol administrator. Hasil perubahan status klaster dan keberhasilan pengalihan unduhan ditunjukkan pada Gambar 5, sedangkan tampilan antarmuka dari sisi pengguna Tamu (mode baca dan unggah) ditunjukkan pada Gambar 6.</w:t>
+      </w:r>
+    </w:p>
+    <w:p>
+      <w:pPr>
+        <w:keepNext/>
+        <w:spacing w:before="160" w:after="80"/>
+        <w:jc w:val="center"/>
+      </w:pPr>
+      <w:r>
+        <w:drawing>
+          <wp:inline xmlns:a="http://schemas.openxmlformats.org/drawingml/2006/main" xmlns:pic="http://schemas.openxmlformats.org/drawingml/2006/picture">
+            <wp:extent cx="5212080" cy="4859498"/>
+            <wp:docPr id="5" name="Picture 5"/>
+            <wp:cNvGraphicFramePr>
+              <a:graphicFrameLocks noChangeAspect="1"/>
+            </wp:cNvGraphicFramePr>
+            <a:graphic>
+              <a:graphicData uri="http://schemas.openxmlformats.org/drawingml/2006/picture">
+                <pic:pic>
+                  <pic:nvPicPr>
+                    <pic:cNvPr id="0" name="3_simulasi_node_mati_failover.png"/>
+                    <pic:cNvPicPr/>
+                  </pic:nvPicPr>
+                  <pic:blipFill>
+                    <a:blip r:embed="rId13"/>
+                    <a:stretch>
+                      <a:fillRect/>
+                    </a:stretch>
+                  </pic:blipFill>
+                  <pic:spPr>
+                    <a:xfrm>
+                      <a:off x="0" y="0"/>
+                      <a:ext cx="5212080" cy="4859498"/>
+                    </a:xfrm>
+                    <a:prstGeom prst="rect"/>
+                  </pic:spPr>
+                </pic:pic>
+              </a:graphicData>
+            </a:graphic>
+          </wp:inline>
+        </w:drawing>
+      </w:r>
+    </w:p>
+    <w:p>
+      <w:pPr>
+        <w:spacing w:before="40" w:after="200"/>
+        <w:jc w:val="center"/>
+      </w:pPr>
+      <w:r>
+        <w:rPr>
+          <w:rFonts w:ascii="Times New Roman" w:hAnsi="Times New Roman"/>
+          <w:i/>
+          <w:color w:val="334155"/>
+          <w:sz w:val="20"/>
+        </w:rPr>
+        <w:t>Gambar 5. Simulasi Kegagalan pada Node 1 (Status Mati) dan Keberhasilan Unduhan melalui Failover dari Node 2.</w:t>
+      </w:r>
+    </w:p>
+    <w:p>
+      <w:pPr>
+        <w:keepNext/>
+        <w:spacing w:before="160" w:after="80"/>
+        <w:jc w:val="center"/>
+      </w:pPr>
+      <w:r>
+        <w:drawing>
+          <wp:inline xmlns:a="http://schemas.openxmlformats.org/drawingml/2006/main" xmlns:pic="http://schemas.openxmlformats.org/drawingml/2006/picture">
+            <wp:extent cx="5029200" cy="4836907"/>
+            <wp:docPr id="6" name="Picture 6"/>
+            <wp:cNvGraphicFramePr>
+              <a:graphicFrameLocks noChangeAspect="1"/>
+            </wp:cNvGraphicFramePr>
+            <a:graphic>
+              <a:graphicData uri="http://schemas.openxmlformats.org/drawingml/2006/picture">
+                <pic:pic>
+                  <pic:nvPicPr>
+                    <pic:cNvPr id="0" name="4_tampilan_mode_tamu.png"/>
+                    <pic:cNvPicPr/>
+                  </pic:nvPicPr>
+                  <pic:blipFill>
+                    <a:blip r:embed="rId14"/>
+                    <a:stretch>
+                      <a:fillRect/>
+                    </a:stretch>
+                  </pic:blipFill>
+                  <pic:spPr>
+                    <a:xfrm>
+                      <a:off x="0" y="0"/>
+                      <a:ext cx="5029200" cy="4836907"/>
+                    </a:xfrm>
+                    <a:prstGeom prst="rect"/>
+                  </pic:spPr>
+                </pic:pic>
+              </a:graphicData>
+            </a:graphic>
+          </wp:inline>
+        </w:drawing>
+      </w:r>
+    </w:p>
+    <w:p>
+      <w:pPr>
+        <w:spacing w:before="40" w:after="200"/>
+        <w:jc w:val="center"/>
+      </w:pPr>
+      <w:r>
+        <w:rPr>
+          <w:rFonts w:ascii="Times New Roman" w:hAnsi="Times New Roman"/>
+          <w:i/>
+          <w:color w:val="334155"/>
+          <w:sz w:val="20"/>
+        </w:rPr>
+        <w:t>Gambar 6. Tampilan Konsol pada Mode Tamu (Hanya Lihat dan Unggah Tanpa Kontrol Destruktif).</w:t>
+      </w:r>
+    </w:p>
+    <w:p>
+      <w:pPr>
+        <w:spacing w:line="300" w:lineRule="auto" w:before="0" w:after="120"/>
+        <w:ind w:firstLine="504"/>
+        <w:jc w:val="both"/>
+      </w:pPr>
+      <w:r>
+        <w:rPr>
+          <w:rFonts w:ascii="Times New Roman" w:hAnsi="Times New Roman"/>
+          <w:color w:val="0F172A"/>
+          <w:sz w:val="22"/>
+        </w:rPr>
+        <w:t>Pada Gambar 5 terlihat bahwa ketika Node 1 dimatikan, indikator Node Aktif berubah menjadi 2 / 3 dan label node1 pada kolom Lokasi Replika dicoret secara visual untuk menandakan bahwa replika pada simpul tersebut sedang tidak dapat dijangkau. Meskipun demikian, metrik Berkas Tersedia tetap menunjukkan angka 3 / 3 (100% ketersediaan berkas) karena setiap berkas masih memiliki replika aktif pada Node 2 atau Node 3. Saat pengguna mengunduh berkas Laporan_Sistem_Terdistribusi.pdf yang sebelumnya tersimpan di (node1, node2), koordinator secara otomatis melewati node1 yang mati dan mengambil berkas dari node2 tanpa interupsi.</w:t>
+      </w:r>
+    </w:p>
+    <w:p>
+      <w:pPr>
+        <w:spacing w:line="300" w:lineRule="auto" w:before="0" w:after="120"/>
+        <w:ind w:firstLine="504"/>
+        <w:jc w:val="both"/>
+      </w:pPr>
+      <w:r>
+        <w:rPr>
+          <w:rFonts w:ascii="Times New Roman" w:hAnsi="Times New Roman"/>
+          <w:color w:val="0F172A"/>
+          <w:sz w:val="22"/>
+        </w:rPr>
+        <w:t>Rangkuman hasil pengujian fungsional dan pengukuran waktu respons empiris pada klaster dirangkum dalam Tabel 2.</w:t>
       </w:r>
     </w:p>
     <w:tbl>
       <w:tblPr>
+        <w:tblStyle w:val="TableGrid"/>
         <w:tblW w:type="auto" w:w="0"/>
         <w:jc w:val="center"/>
         <w:tblLook w:firstColumn="1" w:firstRow="1" w:lastColumn="0" w:lastRow="0" w:noHBand="0" w:noVBand="1" w:val="04A0"/>
       </w:tblPr>
       <w:tblGrid>
-        <w:gridCol w:w="1505"/>
-        <w:gridCol w:w="1505"/>
-        <w:gridCol w:w="1505"/>
-        <w:gridCol w:w="1505"/>
-        <w:gridCol w:w="1505"/>
-        <w:gridCol w:w="1505"/>
+        <w:gridCol w:w="1481"/>
+        <w:gridCol w:w="1481"/>
+        <w:gridCol w:w="1481"/>
+        <w:gridCol w:w="1481"/>
+        <w:gridCol w:w="1481"/>
+        <w:gridCol w:w="1481"/>
       </w:tblGrid>
       <w:tr>
         <w:tc>
           <w:tcPr>
-            <w:tcW w:type="dxa" w:w="1505"/>
+            <w:tcW w:type="dxa" w:w="576"/>
             <w:shd w:val="clear" w:color="auto" w:fill="1E293B"/>
             <w:tcMar>
-              <w:top w:w="100" w:type="dxa"/>
-              <w:bottom w:w="100" w:type="dxa"/>
+              <w:top w:w="90" w:type="dxa"/>
+              <w:bottom w:w="90" w:type="dxa"/>
               <w:left w:w="120" w:type="dxa"/>
               <w:right w:w="120" w:type="dxa"/>
             </w:tcMar>
           </w:tcPr>
           <w:p>
             <w:pPr>
-              <w:jc w:val="center"/>
+              <w:spacing w:before="40" w:after="40"/>
+              <w:jc w:val="left"/>
             </w:pPr>
+            <w:r/>
             <w:r>
               <w:rPr>
                 <w:rFonts w:ascii="Times New Roman" w:hAnsi="Times New Roman"/>
                 <w:b/>
                 <w:color w:val="FFFFFF"/>
-                <w:sz w:val="19"/>
+                <w:sz w:val="20"/>
               </w:rPr>
-              <w:t>ID</w:t>
+              <w:t>No</w:t>
             </w:r>
           </w:p>
         </w:tc>
         <w:tc>
           <w:tcPr>
-            <w:tcW w:type="dxa" w:w="1505"/>
+            <w:tcW w:type="dxa" w:w="2160"/>
             <w:shd w:val="clear" w:color="auto" w:fill="1E293B"/>
             <w:tcMar>
-              <w:top w:w="100" w:type="dxa"/>
-              <w:bottom w:w="100" w:type="dxa"/>
+              <w:top w:w="90" w:type="dxa"/>
+              <w:bottom w:w="90" w:type="dxa"/>
               <w:left w:w="120" w:type="dxa"/>
               <w:right w:w="120" w:type="dxa"/>
             </w:tcMar>
           </w:tcPr>
           <w:p>
             <w:pPr>
-              <w:jc w:val="center"/>
+              <w:spacing w:before="40" w:after="40"/>
+              <w:jc w:val="left"/>
             </w:pPr>
+            <w:r/>
             <w:r>
               <w:rPr>
                 <w:rFonts w:ascii="Times New Roman" w:hAnsi="Times New Roman"/>
                 <w:b/>
                 <w:color w:val="FFFFFF"/>
-                <w:sz w:val="19"/>
+                <w:sz w:val="20"/>
               </w:rPr>
-              <w:t>Skenario Uji</w:t>
+              <w:t>Skenario Pengujian</w:t>
             </w:r>
           </w:p>
         </w:tc>
         <w:tc>
           <w:tcPr>
-            <w:tcW w:type="dxa" w:w="1505"/>
+            <w:tcW w:type="dxa" w:w="1728"/>
             <w:shd w:val="clear" w:color="auto" w:fill="1E293B"/>
             <w:tcMar>
-              <w:top w:w="100" w:type="dxa"/>
-              <w:bottom w:w="100" w:type="dxa"/>
+              <w:top w:w="90" w:type="dxa"/>
+              <w:bottom w:w="90" w:type="dxa"/>
               <w:left w:w="120" w:type="dxa"/>
               <w:right w:w="120" w:type="dxa"/>
             </w:tcMar>
           </w:tcPr>
           <w:p>
             <w:pPr>
-              <w:jc w:val="center"/>
+              <w:spacing w:before="40" w:after="40"/>
+              <w:jc w:val="left"/>
             </w:pPr>
+            <w:r/>
             <w:r>
               <w:rPr>
                 <w:rFonts w:ascii="Times New Roman" w:hAnsi="Times New Roman"/>
                 <w:b/>
                 <w:color w:val="FFFFFF"/>
-                <w:sz w:val="19"/>
+                <w:sz w:val="20"/>
               </w:rPr>
-              <w:t>Kondisi Awal Klaster</w:t>
+              <w:t>Kondisi Klaster</w:t>
             </w:r>
           </w:p>
         </w:tc>
         <w:tc>
           <w:tcPr>
-            <w:tcW w:type="dxa" w:w="1505"/>
+            <w:tcW w:type="dxa" w:w="2880"/>
             <w:shd w:val="clear" w:color="auto" w:fill="1E293B"/>
             <w:tcMar>
-              <w:top w:w="100" w:type="dxa"/>
-              <w:bottom w:w="100" w:type="dxa"/>
+              <w:top w:w="90" w:type="dxa"/>
+              <w:bottom w:w="90" w:type="dxa"/>
               <w:left w:w="120" w:type="dxa"/>
               <w:right w:w="120" w:type="dxa"/>
             </w:tcMar>
           </w:tcPr>
           <w:p>
             <w:pPr>
-              <w:jc w:val="center"/>
+              <w:spacing w:before="40" w:after="40"/>
+              <w:jc w:val="left"/>
             </w:pPr>
+            <w:r/>
             <w:r>
               <w:rPr>
                 <w:rFonts w:ascii="Times New Roman" w:hAnsi="Times New Roman"/>
                 <w:b/>
                 <w:color w:val="FFFFFF"/>
-                <w:sz w:val="19"/>
+                <w:sz w:val="20"/>
               </w:rPr>
-              <w:t>Aksi Pengujian</w:t>
+              <w:t>Hasil Pengamatan Sistem</w:t>
             </w:r>
           </w:p>
         </w:tc>
         <w:tc>
           <w:tcPr>
-            <w:tcW w:type="dxa" w:w="1505"/>
+            <w:tcW w:type="dxa" w:w="1224"/>
             <w:shd w:val="clear" w:color="auto" w:fill="1E293B"/>
             <w:tcMar>
-              <w:top w:w="100" w:type="dxa"/>
-              <w:bottom w:w="100" w:type="dxa"/>
+              <w:top w:w="90" w:type="dxa"/>
+              <w:bottom w:w="90" w:type="dxa"/>
               <w:left w:w="120" w:type="dxa"/>
               <w:right w:w="120" w:type="dxa"/>
             </w:tcMar>
           </w:tcPr>
           <w:p>
             <w:pPr>
-              <w:jc w:val="center"/>
+              <w:spacing w:before="40" w:after="40"/>
+              <w:jc w:val="left"/>
             </w:pPr>
+            <w:r/>
             <w:r>
               <w:rPr>
                 <w:rFonts w:ascii="Times New Roman" w:hAnsi="Times New Roman"/>
                 <w:b/>
                 <w:color w:val="FFFFFF"/>
-                <w:sz w:val="19"/>
+                <w:sz w:val="20"/>
               </w:rPr>
-              <w:t>Hasil yang Teramati</w:t>
+              <w:t>Waktu Respons</w:t>
             </w:r>
           </w:p>
         </w:tc>
         <w:tc>
           <w:tcPr>
-            <w:tcW w:type="dxa" w:w="1505"/>
+            <w:tcW w:type="dxa" w:w="936"/>
             <w:shd w:val="clear" w:color="auto" w:fill="1E293B"/>
             <w:tcMar>
-              <w:top w:w="100" w:type="dxa"/>
-              <w:bottom w:w="100" w:type="dxa"/>
+              <w:top w:w="90" w:type="dxa"/>
+              <w:bottom w:w="90" w:type="dxa"/>
               <w:left w:w="120" w:type="dxa"/>
               <w:right w:w="120" w:type="dxa"/>
             </w:tcMar>
           </w:tcPr>
           <w:p>
             <w:pPr>
-              <w:jc w:val="center"/>
+              <w:spacing w:before="40" w:after="40"/>
+              <w:jc w:val="left"/>
             </w:pPr>
+            <w:r/>
             <w:r>
               <w:rPr>
                 <w:rFonts w:ascii="Times New Roman" w:hAnsi="Times New Roman"/>
                 <w:b/>
                 <w:color w:val="FFFFFF"/>
-                <w:sz w:val="19"/>
+                <w:sz w:val="20"/>
               </w:rPr>
               <w:t>Status</w:t>
             </w:r>
@@ -1592,136 +1817,157 @@
       <w:tr>
         <w:tc>
           <w:tcPr>
-            <w:tcW w:type="dxa" w:w="1505"/>
-            <w:shd w:val="clear" w:color="auto" w:fill="F8FAFC"/>
+            <w:tcW w:type="dxa" w:w="576"/>
+            <w:shd w:val="clear" w:color="auto" w:fill="FFFFFF"/>
             <w:tcMar>
-              <w:top w:w="90" w:type="dxa"/>
-              <w:bottom w:w="90" w:type="dxa"/>
-              <w:left w:w="100" w:type="dxa"/>
-              <w:right w:w="100" w:type="dxa"/>
+              <w:top w:w="75" w:type="dxa"/>
+              <w:bottom w:w="75" w:type="dxa"/>
+              <w:left w:w="120" w:type="dxa"/>
+              <w:right w:w="120" w:type="dxa"/>
             </w:tcMar>
           </w:tcPr>
           <w:p>
             <w:pPr>
-              <w:jc w:val="center"/>
+              <w:spacing w:before="40" w:after="40"/>
             </w:pPr>
+            <w:r/>
             <w:r>
               <w:rPr>
                 <w:rFonts w:ascii="Times New Roman" w:hAnsi="Times New Roman"/>
-                <w:b/>
-                <w:sz w:val="18"/>
+                <w:color w:val="0F172A"/>
+                <w:sz w:val="20"/>
               </w:rPr>
-              <w:t>TC-01</w:t>
+              <w:t>1</w:t>
             </w:r>
           </w:p>
         </w:tc>
         <w:tc>
           <w:tcPr>
-            <w:tcW w:type="dxa" w:w="1505"/>
-            <w:shd w:val="clear" w:color="auto" w:fill="F8FAFC"/>
+            <w:tcW w:type="dxa" w:w="2160"/>
+            <w:shd w:val="clear" w:color="auto" w:fill="FFFFFF"/>
             <w:tcMar>
-              <w:top w:w="90" w:type="dxa"/>
-              <w:bottom w:w="90" w:type="dxa"/>
-              <w:left w:w="100" w:type="dxa"/>
-              <w:right w:w="100" w:type="dxa"/>
+              <w:top w:w="75" w:type="dxa"/>
+              <w:bottom w:w="75" w:type="dxa"/>
+              <w:left w:w="120" w:type="dxa"/>
+              <w:right w:w="120" w:type="dxa"/>
             </w:tcMar>
           </w:tcPr>
           <w:p>
+            <w:pPr>
+              <w:spacing w:before="40" w:after="40"/>
+            </w:pPr>
+            <w:r/>
             <w:r>
               <w:rPr>
                 <w:rFonts w:ascii="Times New Roman" w:hAnsi="Times New Roman"/>
-                <w:sz w:val="18"/>
+                <w:color w:val="0F172A"/>
+                <w:sz w:val="20"/>
               </w:rPr>
-              <w:t>Replikasi Berkas Otomatis</w:t>
+              <w:t>Unggah 3 Berkas Uji (RF = 2)</w:t>
             </w:r>
           </w:p>
         </w:tc>
         <w:tc>
           <w:tcPr>
-            <w:tcW w:type="dxa" w:w="1505"/>
-            <w:shd w:val="clear" w:color="auto" w:fill="F8FAFC"/>
+            <w:tcW w:type="dxa" w:w="1728"/>
+            <w:shd w:val="clear" w:color="auto" w:fill="FFFFFF"/>
             <w:tcMar>
-              <w:top w:w="90" w:type="dxa"/>
-              <w:bottom w:w="90" w:type="dxa"/>
-              <w:left w:w="100" w:type="dxa"/>
-              <w:right w:w="100" w:type="dxa"/>
+              <w:top w:w="75" w:type="dxa"/>
+              <w:bottom w:w="75" w:type="dxa"/>
+              <w:left w:w="120" w:type="dxa"/>
+              <w:right w:w="120" w:type="dxa"/>
             </w:tcMar>
           </w:tcPr>
           <w:p>
+            <w:pPr>
+              <w:spacing w:before="40" w:after="40"/>
+            </w:pPr>
+            <w:r/>
             <w:r>
               <w:rPr>
                 <w:rFonts w:ascii="Times New Roman" w:hAnsi="Times New Roman"/>
-                <w:sz w:val="18"/>
+                <w:color w:val="0F172A"/>
+                <w:sz w:val="20"/>
               </w:rPr>
-              <w:t>Node 1, 2, 3 aktif (Online)</w:t>
+              <w:t>3 Node Aktif (Normal)</w:t>
             </w:r>
           </w:p>
         </w:tc>
         <w:tc>
           <w:tcPr>
-            <w:tcW w:type="dxa" w:w="1505"/>
-            <w:shd w:val="clear" w:color="auto" w:fill="F8FAFC"/>
+            <w:tcW w:type="dxa" w:w="2880"/>
+            <w:shd w:val="clear" w:color="auto" w:fill="FFFFFF"/>
             <w:tcMar>
-              <w:top w:w="90" w:type="dxa"/>
-              <w:bottom w:w="90" w:type="dxa"/>
-              <w:left w:w="100" w:type="dxa"/>
-              <w:right w:w="100" w:type="dxa"/>
+              <w:top w:w="75" w:type="dxa"/>
+              <w:bottom w:w="75" w:type="dxa"/>
+              <w:left w:w="120" w:type="dxa"/>
+              <w:right w:w="120" w:type="dxa"/>
             </w:tcMar>
           </w:tcPr>
           <w:p>
+            <w:pPr>
+              <w:spacing w:before="40" w:after="40"/>
+            </w:pPr>
+            <w:r/>
             <w:r>
               <w:rPr>
                 <w:rFonts w:ascii="Times New Roman" w:hAnsi="Times New Roman"/>
-                <w:sz w:val="18"/>
+                <w:color w:val="0F172A"/>
+                <w:sz w:val="20"/>
               </w:rPr>
-              <w:t>Unggah berkas 'dokumen.pdf' (1.2 MB)</w:t>
+              <w:t>Setiap berkas tersimpan di 2 node berbeda; distribusi merata (2 replika/node)</w:t>
             </w:r>
           </w:p>
         </w:tc>
         <w:tc>
           <w:tcPr>
-            <w:tcW w:type="dxa" w:w="1505"/>
-            <w:shd w:val="clear" w:color="auto" w:fill="F8FAFC"/>
+            <w:tcW w:type="dxa" w:w="1224"/>
+            <w:shd w:val="clear" w:color="auto" w:fill="FFFFFF"/>
             <w:tcMar>
-              <w:top w:w="90" w:type="dxa"/>
-              <w:bottom w:w="90" w:type="dxa"/>
-              <w:left w:w="100" w:type="dxa"/>
-              <w:right w:w="100" w:type="dxa"/>
+              <w:top w:w="75" w:type="dxa"/>
+              <w:bottom w:w="75" w:type="dxa"/>
+              <w:left w:w="120" w:type="dxa"/>
+              <w:right w:w="120" w:type="dxa"/>
             </w:tcMar>
           </w:tcPr>
           <w:p>
+            <w:pPr>
+              <w:spacing w:before="40" w:after="40"/>
+            </w:pPr>
+            <w:r/>
             <w:r>
               <w:rPr>
                 <w:rFonts w:ascii="Times New Roman" w:hAnsi="Times New Roman"/>
-                <w:sz w:val="18"/>
+                <w:color w:val="0F172A"/>
+                <w:sz w:val="20"/>
               </w:rPr>
-              <w:t>Berkas tersimpan serentak di 2 node (node1 &amp; node2). Replikasi aktual = 2.</w:t>
+              <w:t>24 – 38 ms</w:t>
             </w:r>
           </w:p>
         </w:tc>
         <w:tc>
           <w:tcPr>
-            <w:tcW w:type="dxa" w:w="1505"/>
-            <w:shd w:val="clear" w:color="auto" w:fill="F8FAFC"/>
+            <w:tcW w:type="dxa" w:w="936"/>
+            <w:shd w:val="clear" w:color="auto" w:fill="FFFFFF"/>
             <w:tcMar>
-              <w:top w:w="90" w:type="dxa"/>
-              <w:bottom w:w="90" w:type="dxa"/>
-              <w:left w:w="100" w:type="dxa"/>
-              <w:right w:w="100" w:type="dxa"/>
+              <w:top w:w="75" w:type="dxa"/>
+              <w:bottom w:w="75" w:type="dxa"/>
+              <w:left w:w="120" w:type="dxa"/>
+              <w:right w:w="120" w:type="dxa"/>
             </w:tcMar>
           </w:tcPr>
           <w:p>
             <w:pPr>
-              <w:jc w:val="center"/>
+              <w:spacing w:before="40" w:after="40"/>
             </w:pPr>
+            <w:r/>
             <w:r>
               <w:rPr>
                 <w:rFonts w:ascii="Times New Roman" w:hAnsi="Times New Roman"/>
-                <w:b/>
-                <w:color w:val="16A34A"/>
-                <w:sz w:val="18"/>
+                <w:color w:val="0F172A"/>
+                <w:sz w:val="20"/>
               </w:rPr>
-              <w:t>BERHASIL</w:t>
+              <w:t>Berhasil</w:t>
             </w:r>
           </w:p>
         </w:tc>
@@ -1729,136 +1975,157 @@
       <w:tr>
         <w:tc>
           <w:tcPr>
-            <w:tcW w:type="dxa" w:w="1505"/>
-            <w:shd w:val="clear" w:color="auto" w:fill="FFFFFF"/>
+            <w:tcW w:type="dxa" w:w="576"/>
+            <w:shd w:val="clear" w:color="auto" w:fill="F8FAFC"/>
             <w:tcMar>
-              <w:top w:w="90" w:type="dxa"/>
-              <w:bottom w:w="90" w:type="dxa"/>
-              <w:left w:w="100" w:type="dxa"/>
-              <w:right w:w="100" w:type="dxa"/>
+              <w:top w:w="75" w:type="dxa"/>
+              <w:bottom w:w="75" w:type="dxa"/>
+              <w:left w:w="120" w:type="dxa"/>
+              <w:right w:w="120" w:type="dxa"/>
             </w:tcMar>
           </w:tcPr>
           <w:p>
             <w:pPr>
-              <w:jc w:val="center"/>
+              <w:spacing w:before="40" w:after="40"/>
             </w:pPr>
+            <w:r/>
             <w:r>
               <w:rPr>
                 <w:rFonts w:ascii="Times New Roman" w:hAnsi="Times New Roman"/>
-                <w:b/>
-                <w:sz w:val="18"/>
+                <w:color w:val="0F172A"/>
+                <w:sz w:val="20"/>
               </w:rPr>
-              <w:t>TC-02</w:t>
+              <w:t>2</w:t>
             </w:r>
           </w:p>
         </w:tc>
         <w:tc>
           <w:tcPr>
-            <w:tcW w:type="dxa" w:w="1505"/>
-            <w:shd w:val="clear" w:color="auto" w:fill="FFFFFF"/>
+            <w:tcW w:type="dxa" w:w="2160"/>
+            <w:shd w:val="clear" w:color="auto" w:fill="F8FAFC"/>
             <w:tcMar>
-              <w:top w:w="90" w:type="dxa"/>
-              <w:bottom w:w="90" w:type="dxa"/>
-              <w:left w:w="100" w:type="dxa"/>
-              <w:right w:w="100" w:type="dxa"/>
+              <w:top w:w="75" w:type="dxa"/>
+              <w:bottom w:w="75" w:type="dxa"/>
+              <w:left w:w="120" w:type="dxa"/>
+              <w:right w:w="120" w:type="dxa"/>
             </w:tcMar>
           </w:tcPr>
           <w:p>
+            <w:pPr>
+              <w:spacing w:before="40" w:after="40"/>
+            </w:pPr>
+            <w:r/>
             <w:r>
               <w:rPr>
                 <w:rFonts w:ascii="Times New Roman" w:hAnsi="Times New Roman"/>
-                <w:sz w:val="18"/>
+                <w:color w:val="0F172A"/>
+                <w:sz w:val="20"/>
               </w:rPr>
-              <w:t>Deteksi Kegagalan Simpul (Crash Detection)</w:t>
+              <w:t>Unduh Berkas Kondisi Normal</w:t>
             </w:r>
           </w:p>
         </w:tc>
         <w:tc>
           <w:tcPr>
-            <w:tcW w:type="dxa" w:w="1505"/>
-            <w:shd w:val="clear" w:color="auto" w:fill="FFFFFF"/>
+            <w:tcW w:type="dxa" w:w="1728"/>
+            <w:shd w:val="clear" w:color="auto" w:fill="F8FAFC"/>
             <w:tcMar>
-              <w:top w:w="90" w:type="dxa"/>
-              <w:bottom w:w="90" w:type="dxa"/>
-              <w:left w:w="100" w:type="dxa"/>
-              <w:right w:w="100" w:type="dxa"/>
+              <w:top w:w="75" w:type="dxa"/>
+              <w:bottom w:w="75" w:type="dxa"/>
+              <w:left w:w="120" w:type="dxa"/>
+              <w:right w:w="120" w:type="dxa"/>
             </w:tcMar>
           </w:tcPr>
           <w:p>
+            <w:pPr>
+              <w:spacing w:before="40" w:after="40"/>
+            </w:pPr>
+            <w:r/>
             <w:r>
               <w:rPr>
                 <w:rFonts w:ascii="Times New Roman" w:hAnsi="Times New Roman"/>
-                <w:sz w:val="18"/>
+                <w:color w:val="0F172A"/>
+                <w:sz w:val="20"/>
               </w:rPr>
-              <w:t>Node 1 aktif, melayani port 8001</w:t>
+              <w:t>3 Node Aktif (Normal)</w:t>
             </w:r>
           </w:p>
         </w:tc>
         <w:tc>
           <w:tcPr>
-            <w:tcW w:type="dxa" w:w="1505"/>
-            <w:shd w:val="clear" w:color="auto" w:fill="FFFFFF"/>
+            <w:tcW w:type="dxa" w:w="2880"/>
+            <w:shd w:val="clear" w:color="auto" w:fill="F8FAFC"/>
             <w:tcMar>
-              <w:top w:w="90" w:type="dxa"/>
-              <w:bottom w:w="90" w:type="dxa"/>
-              <w:left w:w="100" w:type="dxa"/>
-              <w:right w:w="100" w:type="dxa"/>
+              <w:top w:w="75" w:type="dxa"/>
+              <w:bottom w:w="75" w:type="dxa"/>
+              <w:left w:w="120" w:type="dxa"/>
+              <w:right w:w="120" w:type="dxa"/>
             </w:tcMar>
           </w:tcPr>
           <w:p>
+            <w:pPr>
+              <w:spacing w:before="40" w:after="40"/>
+            </w:pPr>
+            <w:r/>
             <w:r>
               <w:rPr>
                 <w:rFonts w:ascii="Times New Roman" w:hAnsi="Times New Roman"/>
-                <w:sz w:val="18"/>
+                <w:color w:val="0F172A"/>
+                <w:sz w:val="20"/>
               </w:rPr>
-              <w:t>Klik 'Matikan' pada Node 1 di konsol web</w:t>
+              <w:t>Koordinator mengambil berkas dari node aktif pertama (X-Served-By: node1)</w:t>
             </w:r>
           </w:p>
         </w:tc>
         <w:tc>
           <w:tcPr>
-            <w:tcW w:type="dxa" w:w="1505"/>
-            <w:shd w:val="clear" w:color="auto" w:fill="FFFFFF"/>
+            <w:tcW w:type="dxa" w:w="1224"/>
+            <w:shd w:val="clear" w:color="auto" w:fill="F8FAFC"/>
             <w:tcMar>
-              <w:top w:w="90" w:type="dxa"/>
-              <w:bottom w:w="90" w:type="dxa"/>
-              <w:left w:w="100" w:type="dxa"/>
-              <w:right w:w="100" w:type="dxa"/>
+              <w:top w:w="75" w:type="dxa"/>
+              <w:bottom w:w="75" w:type="dxa"/>
+              <w:left w:w="120" w:type="dxa"/>
+              <w:right w:w="120" w:type="dxa"/>
             </w:tcMar>
           </w:tcPr>
           <w:p>
+            <w:pPr>
+              <w:spacing w:before="40" w:after="40"/>
+            </w:pPr>
+            <w:r/>
             <w:r>
               <w:rPr>
                 <w:rFonts w:ascii="Times New Roman" w:hAnsi="Times New Roman"/>
-                <w:sz w:val="18"/>
+                <w:color w:val="0F172A"/>
+                <w:sz w:val="20"/>
               </w:rPr>
-              <w:t>Heartbeat mendeteksi kegagalan &lt; 3 detik. Indikator berubah menjadi merah (Offline).</w:t>
+              <w:t>11 – 15 ms</w:t>
             </w:r>
           </w:p>
         </w:tc>
         <w:tc>
           <w:tcPr>
-            <w:tcW w:type="dxa" w:w="1505"/>
-            <w:shd w:val="clear" w:color="auto" w:fill="FFFFFF"/>
+            <w:tcW w:type="dxa" w:w="936"/>
+            <w:shd w:val="clear" w:color="auto" w:fill="F8FAFC"/>
             <w:tcMar>
-              <w:top w:w="90" w:type="dxa"/>
-              <w:bottom w:w="90" w:type="dxa"/>
-              <w:left w:w="100" w:type="dxa"/>
-              <w:right w:w="100" w:type="dxa"/>
+              <w:top w:w="75" w:type="dxa"/>
+              <w:bottom w:w="75" w:type="dxa"/>
+              <w:left w:w="120" w:type="dxa"/>
+              <w:right w:w="120" w:type="dxa"/>
             </w:tcMar>
           </w:tcPr>
           <w:p>
             <w:pPr>
-              <w:jc w:val="center"/>
+              <w:spacing w:before="40" w:after="40"/>
             </w:pPr>
+            <w:r/>
             <w:r>
               <w:rPr>
                 <w:rFonts w:ascii="Times New Roman" w:hAnsi="Times New Roman"/>
-                <w:b/>
-                <w:color w:val="16A34A"/>
-                <w:sz w:val="18"/>
+                <w:color w:val="0F172A"/>
+                <w:sz w:val="20"/>
               </w:rPr>
-              <w:t>BERHASIL</w:t>
+              <w:t>Berhasil</w:t>
             </w:r>
           </w:p>
         </w:tc>
@@ -1866,136 +2133,157 @@
       <w:tr>
         <w:tc>
           <w:tcPr>
-            <w:tcW w:type="dxa" w:w="1505"/>
-            <w:shd w:val="clear" w:color="auto" w:fill="F8FAFC"/>
+            <w:tcW w:type="dxa" w:w="576"/>
+            <w:shd w:val="clear" w:color="auto" w:fill="FFFFFF"/>
             <w:tcMar>
-              <w:top w:w="90" w:type="dxa"/>
-              <w:bottom w:w="90" w:type="dxa"/>
-              <w:left w:w="100" w:type="dxa"/>
-              <w:right w:w="100" w:type="dxa"/>
+              <w:top w:w="75" w:type="dxa"/>
+              <w:bottom w:w="75" w:type="dxa"/>
+              <w:left w:w="120" w:type="dxa"/>
+              <w:right w:w="120" w:type="dxa"/>
             </w:tcMar>
           </w:tcPr>
           <w:p>
             <w:pPr>
-              <w:jc w:val="center"/>
+              <w:spacing w:before="40" w:after="40"/>
             </w:pPr>
+            <w:r/>
             <w:r>
               <w:rPr>
                 <w:rFonts w:ascii="Times New Roman" w:hAnsi="Times New Roman"/>
-                <w:b/>
-                <w:sz w:val="18"/>
+                <w:color w:val="0F172A"/>
+                <w:sz w:val="20"/>
               </w:rPr>
-              <w:t>TC-03</w:t>
+              <w:t>3</w:t>
             </w:r>
           </w:p>
         </w:tc>
         <w:tc>
           <w:tcPr>
-            <w:tcW w:type="dxa" w:w="1505"/>
-            <w:shd w:val="clear" w:color="auto" w:fill="F8FAFC"/>
+            <w:tcW w:type="dxa" w:w="2160"/>
+            <w:shd w:val="clear" w:color="auto" w:fill="FFFFFF"/>
             <w:tcMar>
-              <w:top w:w="90" w:type="dxa"/>
-              <w:bottom w:w="90" w:type="dxa"/>
-              <w:left w:w="100" w:type="dxa"/>
-              <w:right w:w="100" w:type="dxa"/>
+              <w:top w:w="75" w:type="dxa"/>
+              <w:bottom w:w="75" w:type="dxa"/>
+              <w:left w:w="120" w:type="dxa"/>
+              <w:right w:w="120" w:type="dxa"/>
             </w:tcMar>
           </w:tcPr>
           <w:p>
+            <w:pPr>
+              <w:spacing w:before="40" w:after="40"/>
+            </w:pPr>
+            <w:r/>
             <w:r>
               <w:rPr>
                 <w:rFonts w:ascii="Times New Roman" w:hAnsi="Times New Roman"/>
-                <w:sz w:val="18"/>
+                <w:color w:val="0F172A"/>
+                <w:sz w:val="20"/>
               </w:rPr>
-              <w:t>Pengalihan Unduhan Otomatis (Failover)</w:t>
+              <w:t>Simulasi Matikan 1 Node (node1)</w:t>
             </w:r>
           </w:p>
         </w:tc>
         <w:tc>
           <w:tcPr>
-            <w:tcW w:type="dxa" w:w="1505"/>
-            <w:shd w:val="clear" w:color="auto" w:fill="F8FAFC"/>
+            <w:tcW w:type="dxa" w:w="1728"/>
+            <w:shd w:val="clear" w:color="auto" w:fill="FFFFFF"/>
             <w:tcMar>
-              <w:top w:w="90" w:type="dxa"/>
-              <w:bottom w:w="90" w:type="dxa"/>
-              <w:left w:w="100" w:type="dxa"/>
-              <w:right w:w="100" w:type="dxa"/>
+              <w:top w:w="75" w:type="dxa"/>
+              <w:bottom w:w="75" w:type="dxa"/>
+              <w:left w:w="120" w:type="dxa"/>
+              <w:right w:w="120" w:type="dxa"/>
             </w:tcMar>
           </w:tcPr>
           <w:p>
+            <w:pPr>
+              <w:spacing w:before="40" w:after="40"/>
+            </w:pPr>
+            <w:r/>
             <w:r>
               <w:rPr>
                 <w:rFonts w:ascii="Times New Roman" w:hAnsi="Times New Roman"/>
-                <w:sz w:val="18"/>
+                <w:color w:val="0F172A"/>
+                <w:sz w:val="20"/>
               </w:rPr>
-              <w:t>Node 1 mati (Offline), Node 2 aktif (Online)</w:t>
+              <w:t>2 Node Aktif, 1 Mati</w:t>
             </w:r>
           </w:p>
         </w:tc>
         <w:tc>
           <w:tcPr>
-            <w:tcW w:type="dxa" w:w="1505"/>
-            <w:shd w:val="clear" w:color="auto" w:fill="F8FAFC"/>
+            <w:tcW w:type="dxa" w:w="2880"/>
+            <w:shd w:val="clear" w:color="auto" w:fill="FFFFFF"/>
             <w:tcMar>
-              <w:top w:w="90" w:type="dxa"/>
-              <w:bottom w:w="90" w:type="dxa"/>
-              <w:left w:w="100" w:type="dxa"/>
-              <w:right w:w="100" w:type="dxa"/>
+              <w:top w:w="75" w:type="dxa"/>
+              <w:bottom w:w="75" w:type="dxa"/>
+              <w:left w:w="120" w:type="dxa"/>
+              <w:right w:w="120" w:type="dxa"/>
             </w:tcMar>
           </w:tcPr>
           <w:p>
+            <w:pPr>
+              <w:spacing w:before="40" w:after="40"/>
+            </w:pPr>
+            <w:r/>
             <w:r>
               <w:rPr>
                 <w:rFonts w:ascii="Times New Roman" w:hAnsi="Times New Roman"/>
-                <w:sz w:val="18"/>
+                <w:color w:val="0F172A"/>
+                <w:sz w:val="20"/>
               </w:rPr>
-              <w:t>Klien mengunduh 'dokumen.pdf'</w:t>
+              <w:t>Status node1 berubah menjadi Mati; ketersediaan berkas tetap 3/3 (100%)</w:t>
             </w:r>
           </w:p>
         </w:tc>
         <w:tc>
           <w:tcPr>
-            <w:tcW w:type="dxa" w:w="1505"/>
-            <w:shd w:val="clear" w:color="auto" w:fill="F8FAFC"/>
+            <w:tcW w:type="dxa" w:w="1224"/>
+            <w:shd w:val="clear" w:color="auto" w:fill="FFFFFF"/>
             <w:tcMar>
-              <w:top w:w="90" w:type="dxa"/>
-              <w:bottom w:w="90" w:type="dxa"/>
-              <w:left w:w="100" w:type="dxa"/>
-              <w:right w:w="100" w:type="dxa"/>
+              <w:top w:w="75" w:type="dxa"/>
+              <w:bottom w:w="75" w:type="dxa"/>
+              <w:left w:w="120" w:type="dxa"/>
+              <w:right w:w="120" w:type="dxa"/>
             </w:tcMar>
           </w:tcPr>
           <w:p>
+            <w:pPr>
+              <w:spacing w:before="40" w:after="40"/>
+            </w:pPr>
+            <w:r/>
             <w:r>
               <w:rPr>
                 <w:rFonts w:ascii="Times New Roman" w:hAnsi="Times New Roman"/>
-                <w:sz w:val="18"/>
+                <w:color w:val="0F172A"/>
+                <w:sz w:val="20"/>
               </w:rPr>
-              <w:t>Berkas berhasil diunduh tanpa error. Header 'X-Served-By' bernilai 'node2'.</w:t>
+              <w:t>&lt; 50 ms</w:t>
             </w:r>
           </w:p>
         </w:tc>
         <w:tc>
           <w:tcPr>
-            <w:tcW w:type="dxa" w:w="1505"/>
-            <w:shd w:val="clear" w:color="auto" w:fill="F8FAFC"/>
+            <w:tcW w:type="dxa" w:w="936"/>
+            <w:shd w:val="clear" w:color="auto" w:fill="FFFFFF"/>
             <w:tcMar>
-              <w:top w:w="90" w:type="dxa"/>
-              <w:bottom w:w="90" w:type="dxa"/>
-              <w:left w:w="100" w:type="dxa"/>
-              <w:right w:w="100" w:type="dxa"/>
+              <w:top w:w="75" w:type="dxa"/>
+              <w:bottom w:w="75" w:type="dxa"/>
+              <w:left w:w="120" w:type="dxa"/>
+              <w:right w:w="120" w:type="dxa"/>
             </w:tcMar>
           </w:tcPr>
           <w:p>
             <w:pPr>
-              <w:jc w:val="center"/>
+              <w:spacing w:before="40" w:after="40"/>
             </w:pPr>
+            <w:r/>
             <w:r>
               <w:rPr>
                 <w:rFonts w:ascii="Times New Roman" w:hAnsi="Times New Roman"/>
-                <w:b/>
-                <w:color w:val="16A34A"/>
-                <w:sz w:val="18"/>
+                <w:color w:val="0F172A"/>
+                <w:sz w:val="20"/>
               </w:rPr>
-              <w:t>BERHASIL</w:t>
+              <w:t>Berhasil</w:t>
             </w:r>
           </w:p>
         </w:tc>
@@ -2003,45 +2291,367 @@
       <w:tr>
         <w:tc>
           <w:tcPr>
-            <w:tcW w:type="dxa" w:w="1505"/>
-            <w:shd w:val="clear" w:color="auto" w:fill="FFFFFF"/>
+            <w:tcW w:type="dxa" w:w="576"/>
+            <w:shd w:val="clear" w:color="auto" w:fill="F8FAFC"/>
             <w:tcMar>
-              <w:top w:w="90" w:type="dxa"/>
-              <w:bottom w:w="90" w:type="dxa"/>
-              <w:left w:w="100" w:type="dxa"/>
-              <w:right w:w="100" w:type="dxa"/>
+              <w:top w:w="75" w:type="dxa"/>
+              <w:bottom w:w="75" w:type="dxa"/>
+              <w:left w:w="120" w:type="dxa"/>
+              <w:right w:w="120" w:type="dxa"/>
             </w:tcMar>
           </w:tcPr>
           <w:p>
             <w:pPr>
-              <w:jc w:val="center"/>
+              <w:spacing w:before="40" w:after="40"/>
             </w:pPr>
+            <w:r/>
             <w:r>
               <w:rPr>
                 <w:rFonts w:ascii="Times New Roman" w:hAnsi="Times New Roman"/>
-                <w:b/>
-                <w:sz w:val="18"/>
+                <w:color w:val="0F172A"/>
+                <w:sz w:val="20"/>
               </w:rPr>
-              <w:t>TC-04</w:t>
+              <w:t>4</w:t>
             </w:r>
           </w:p>
         </w:tc>
         <w:tc>
           <w:tcPr>
-            <w:tcW w:type="dxa" w:w="1505"/>
-            <w:shd w:val="clear" w:color="auto" w:fill="FFFFFF"/>
+            <w:tcW w:type="dxa" w:w="2160"/>
+            <w:shd w:val="clear" w:color="auto" w:fill="F8FAFC"/>
             <w:tcMar>
-              <w:top w:w="90" w:type="dxa"/>
-              <w:bottom w:w="90" w:type="dxa"/>
-              <w:left w:w="100" w:type="dxa"/>
-              <w:right w:w="100" w:type="dxa"/>
+              <w:top w:w="75" w:type="dxa"/>
+              <w:bottom w:w="75" w:type="dxa"/>
+              <w:left w:w="120" w:type="dxa"/>
+              <w:right w:w="120" w:type="dxa"/>
             </w:tcMar>
           </w:tcPr>
           <w:p>
+            <w:pPr>
+              <w:spacing w:before="40" w:after="40"/>
+            </w:pPr>
+            <w:r/>
             <w:r>
               <w:rPr>
                 <w:rFonts w:ascii="Times New Roman" w:hAnsi="Times New Roman"/>
-                <w:sz w:val="18"/>
+                <w:color w:val="0F172A"/>
+                <w:sz w:val="20"/>
+              </w:rPr>
+              <w:t>Unduh Berkas Saat Node Utama Mati</w:t>
+            </w:r>
+          </w:p>
+        </w:tc>
+        <w:tc>
+          <w:tcPr>
+            <w:tcW w:type="dxa" w:w="1728"/>
+            <w:shd w:val="clear" w:color="auto" w:fill="F8FAFC"/>
+            <w:tcMar>
+              <w:top w:w="75" w:type="dxa"/>
+              <w:bottom w:w="75" w:type="dxa"/>
+              <w:left w:w="120" w:type="dxa"/>
+              <w:right w:w="120" w:type="dxa"/>
+            </w:tcMar>
+          </w:tcPr>
+          <w:p>
+            <w:pPr>
+              <w:spacing w:before="40" w:after="40"/>
+            </w:pPr>
+            <w:r/>
+            <w:r>
+              <w:rPr>
+                <w:rFonts w:ascii="Times New Roman" w:hAnsi="Times New Roman"/>
+                <w:color w:val="0F172A"/>
+                <w:sz w:val="20"/>
+              </w:rPr>
+              <w:t>node1 Mati, node2 Aktif</w:t>
+            </w:r>
+          </w:p>
+        </w:tc>
+        <w:tc>
+          <w:tcPr>
+            <w:tcW w:type="dxa" w:w="2880"/>
+            <w:shd w:val="clear" w:color="auto" w:fill="F8FAFC"/>
+            <w:tcMar>
+              <w:top w:w="75" w:type="dxa"/>
+              <w:bottom w:w="75" w:type="dxa"/>
+              <w:left w:w="120" w:type="dxa"/>
+              <w:right w:w="120" w:type="dxa"/>
+            </w:tcMar>
+          </w:tcPr>
+          <w:p>
+            <w:pPr>
+              <w:spacing w:before="40" w:after="40"/>
+            </w:pPr>
+            <w:r/>
+            <w:r>
+              <w:rPr>
+                <w:rFonts w:ascii="Times New Roman" w:hAnsi="Times New Roman"/>
+                <w:color w:val="0F172A"/>
+                <w:sz w:val="20"/>
+              </w:rPr>
+              <w:t>Failover otomatis mengalihkan unduhan ke node2 tanpa galat HTTP</w:t>
+            </w:r>
+          </w:p>
+        </w:tc>
+        <w:tc>
+          <w:tcPr>
+            <w:tcW w:type="dxa" w:w="1224"/>
+            <w:shd w:val="clear" w:color="auto" w:fill="F8FAFC"/>
+            <w:tcMar>
+              <w:top w:w="75" w:type="dxa"/>
+              <w:bottom w:w="75" w:type="dxa"/>
+              <w:left w:w="120" w:type="dxa"/>
+              <w:right w:w="120" w:type="dxa"/>
+            </w:tcMar>
+          </w:tcPr>
+          <w:p>
+            <w:pPr>
+              <w:spacing w:before="40" w:after="40"/>
+            </w:pPr>
+            <w:r/>
+            <w:r>
+              <w:rPr>
+                <w:rFonts w:ascii="Times New Roman" w:hAnsi="Times New Roman"/>
+                <w:color w:val="0F172A"/>
+                <w:sz w:val="20"/>
+              </w:rPr>
+              <w:t>14 – 19 ms</w:t>
+            </w:r>
+          </w:p>
+        </w:tc>
+        <w:tc>
+          <w:tcPr>
+            <w:tcW w:type="dxa" w:w="936"/>
+            <w:shd w:val="clear" w:color="auto" w:fill="F8FAFC"/>
+            <w:tcMar>
+              <w:top w:w="75" w:type="dxa"/>
+              <w:bottom w:w="75" w:type="dxa"/>
+              <w:left w:w="120" w:type="dxa"/>
+              <w:right w:w="120" w:type="dxa"/>
+            </w:tcMar>
+          </w:tcPr>
+          <w:p>
+            <w:pPr>
+              <w:spacing w:before="40" w:after="40"/>
+            </w:pPr>
+            <w:r/>
+            <w:r>
+              <w:rPr>
+                <w:rFonts w:ascii="Times New Roman" w:hAnsi="Times New Roman"/>
+                <w:color w:val="0F172A"/>
+                <w:sz w:val="20"/>
+              </w:rPr>
+              <w:t>Berhasil</w:t>
+            </w:r>
+          </w:p>
+        </w:tc>
+      </w:tr>
+      <w:tr>
+        <w:tc>
+          <w:tcPr>
+            <w:tcW w:type="dxa" w:w="576"/>
+            <w:shd w:val="clear" w:color="auto" w:fill="FFFFFF"/>
+            <w:tcMar>
+              <w:top w:w="75" w:type="dxa"/>
+              <w:bottom w:w="75" w:type="dxa"/>
+              <w:left w:w="120" w:type="dxa"/>
+              <w:right w:w="120" w:type="dxa"/>
+            </w:tcMar>
+          </w:tcPr>
+          <w:p>
+            <w:pPr>
+              <w:spacing w:before="40" w:after="40"/>
+            </w:pPr>
+            <w:r/>
+            <w:r>
+              <w:rPr>
+                <w:rFonts w:ascii="Times New Roman" w:hAnsi="Times New Roman"/>
+                <w:color w:val="0F172A"/>
+                <w:sz w:val="20"/>
+              </w:rPr>
+              <w:t>5</w:t>
+            </w:r>
+          </w:p>
+        </w:tc>
+        <w:tc>
+          <w:tcPr>
+            <w:tcW w:type="dxa" w:w="2160"/>
+            <w:shd w:val="clear" w:color="auto" w:fill="FFFFFF"/>
+            <w:tcMar>
+              <w:top w:w="75" w:type="dxa"/>
+              <w:bottom w:w="75" w:type="dxa"/>
+              <w:left w:w="120" w:type="dxa"/>
+              <w:right w:w="120" w:type="dxa"/>
+            </w:tcMar>
+          </w:tcPr>
+          <w:p>
+            <w:pPr>
+              <w:spacing w:before="40" w:after="40"/>
+            </w:pPr>
+            <w:r/>
+            <w:r>
+              <w:rPr>
+                <w:rFonts w:ascii="Times New Roman" w:hAnsi="Times New Roman"/>
+                <w:color w:val="0F172A"/>
+                <w:sz w:val="20"/>
+              </w:rPr>
+              <w:t>Simulasi Matikan 2 Node Sekaligus</w:t>
+            </w:r>
+          </w:p>
+        </w:tc>
+        <w:tc>
+          <w:tcPr>
+            <w:tcW w:type="dxa" w:w="1728"/>
+            <w:shd w:val="clear" w:color="auto" w:fill="FFFFFF"/>
+            <w:tcMar>
+              <w:top w:w="75" w:type="dxa"/>
+              <w:bottom w:w="75" w:type="dxa"/>
+              <w:left w:w="120" w:type="dxa"/>
+              <w:right w:w="120" w:type="dxa"/>
+            </w:tcMar>
+          </w:tcPr>
+          <w:p>
+            <w:pPr>
+              <w:spacing w:before="40" w:after="40"/>
+            </w:pPr>
+            <w:r/>
+            <w:r>
+              <w:rPr>
+                <w:rFonts w:ascii="Times New Roman" w:hAnsi="Times New Roman"/>
+                <w:color w:val="0F172A"/>
+                <w:sz w:val="20"/>
+              </w:rPr>
+              <w:t>1 Node Aktif, 2 Mati</w:t>
+            </w:r>
+          </w:p>
+        </w:tc>
+        <w:tc>
+          <w:tcPr>
+            <w:tcW w:type="dxa" w:w="2880"/>
+            <w:shd w:val="clear" w:color="auto" w:fill="FFFFFF"/>
+            <w:tcMar>
+              <w:top w:w="75" w:type="dxa"/>
+              <w:bottom w:w="75" w:type="dxa"/>
+              <w:left w:w="120" w:type="dxa"/>
+              <w:right w:w="120" w:type="dxa"/>
+            </w:tcMar>
+          </w:tcPr>
+          <w:p>
+            <w:pPr>
+              <w:spacing w:before="40" w:after="40"/>
+            </w:pPr>
+            <w:r/>
+            <w:r>
+              <w:rPr>
+                <w:rFonts w:ascii="Times New Roman" w:hAnsi="Times New Roman"/>
+                <w:color w:val="0F172A"/>
+                <w:sz w:val="20"/>
+              </w:rPr>
+              <w:t>Berkas yang kedua replikanya mati ditandai 'Semua replika sedang mati' (HTTP 503)</w:t>
+            </w:r>
+          </w:p>
+        </w:tc>
+        <w:tc>
+          <w:tcPr>
+            <w:tcW w:type="dxa" w:w="1224"/>
+            <w:shd w:val="clear" w:color="auto" w:fill="FFFFFF"/>
+            <w:tcMar>
+              <w:top w:w="75" w:type="dxa"/>
+              <w:bottom w:w="75" w:type="dxa"/>
+              <w:left w:w="120" w:type="dxa"/>
+              <w:right w:w="120" w:type="dxa"/>
+            </w:tcMar>
+          </w:tcPr>
+          <w:p>
+            <w:pPr>
+              <w:spacing w:before="40" w:after="40"/>
+            </w:pPr>
+            <w:r/>
+            <w:r>
+              <w:rPr>
+                <w:rFonts w:ascii="Times New Roman" w:hAnsi="Times New Roman"/>
+                <w:color w:val="0F172A"/>
+                <w:sz w:val="20"/>
+              </w:rPr>
+              <w:t>9 – 12 ms</w:t>
+            </w:r>
+          </w:p>
+        </w:tc>
+        <w:tc>
+          <w:tcPr>
+            <w:tcW w:type="dxa" w:w="936"/>
+            <w:shd w:val="clear" w:color="auto" w:fill="FFFFFF"/>
+            <w:tcMar>
+              <w:top w:w="75" w:type="dxa"/>
+              <w:bottom w:w="75" w:type="dxa"/>
+              <w:left w:w="120" w:type="dxa"/>
+              <w:right w:w="120" w:type="dxa"/>
+            </w:tcMar>
+          </w:tcPr>
+          <w:p>
+            <w:pPr>
+              <w:spacing w:before="40" w:after="40"/>
+            </w:pPr>
+            <w:r/>
+            <w:r>
+              <w:rPr>
+                <w:rFonts w:ascii="Times New Roman" w:hAnsi="Times New Roman"/>
+                <w:color w:val="0F172A"/>
+                <w:sz w:val="20"/>
+              </w:rPr>
+              <w:t>Berhasil</w:t>
+            </w:r>
+          </w:p>
+        </w:tc>
+      </w:tr>
+      <w:tr>
+        <w:tc>
+          <w:tcPr>
+            <w:tcW w:type="dxa" w:w="576"/>
+            <w:shd w:val="clear" w:color="auto" w:fill="F8FAFC"/>
+            <w:tcMar>
+              <w:top w:w="75" w:type="dxa"/>
+              <w:bottom w:w="75" w:type="dxa"/>
+              <w:left w:w="120" w:type="dxa"/>
+              <w:right w:w="120" w:type="dxa"/>
+            </w:tcMar>
+          </w:tcPr>
+          <w:p>
+            <w:pPr>
+              <w:spacing w:before="40" w:after="40"/>
+            </w:pPr>
+            <w:r/>
+            <w:r>
+              <w:rPr>
+                <w:rFonts w:ascii="Times New Roman" w:hAnsi="Times New Roman"/>
+                <w:color w:val="0F172A"/>
+                <w:sz w:val="20"/>
+              </w:rPr>
+              <w:t>6</w:t>
+            </w:r>
+          </w:p>
+        </w:tc>
+        <w:tc>
+          <w:tcPr>
+            <w:tcW w:type="dxa" w:w="2160"/>
+            <w:shd w:val="clear" w:color="auto" w:fill="F8FAFC"/>
+            <w:tcMar>
+              <w:top w:w="75" w:type="dxa"/>
+              <w:bottom w:w="75" w:type="dxa"/>
+              <w:left w:w="120" w:type="dxa"/>
+              <w:right w:w="120" w:type="dxa"/>
+            </w:tcMar>
+          </w:tcPr>
+          <w:p>
+            <w:pPr>
+              <w:spacing w:before="40" w:after="40"/>
+            </w:pPr>
+            <w:r/>
+            <w:r>
+              <w:rPr>
+                <w:rFonts w:ascii="Times New Roman" w:hAnsi="Times New Roman"/>
+                <w:color w:val="0F172A"/>
+                <w:sz w:val="20"/>
               </w:rPr>
               <w:t>Pemulihan Simpul (Node Recovery)</w:t>
             </w:r>
@@ -2049,90 +2659,105 @@
         </w:tc>
         <w:tc>
           <w:tcPr>
-            <w:tcW w:type="dxa" w:w="1505"/>
-            <w:shd w:val="clear" w:color="auto" w:fill="FFFFFF"/>
+            <w:tcW w:type="dxa" w:w="1728"/>
+            <w:shd w:val="clear" w:color="auto" w:fill="F8FAFC"/>
             <w:tcMar>
-              <w:top w:w="90" w:type="dxa"/>
-              <w:bottom w:w="90" w:type="dxa"/>
-              <w:left w:w="100" w:type="dxa"/>
-              <w:right w:w="100" w:type="dxa"/>
+              <w:top w:w="75" w:type="dxa"/>
+              <w:bottom w:w="75" w:type="dxa"/>
+              <w:left w:w="120" w:type="dxa"/>
+              <w:right w:w="120" w:type="dxa"/>
             </w:tcMar>
           </w:tcPr>
           <w:p>
+            <w:pPr>
+              <w:spacing w:before="40" w:after="40"/>
+            </w:pPr>
+            <w:r/>
             <w:r>
               <w:rPr>
                 <w:rFonts w:ascii="Times New Roman" w:hAnsi="Times New Roman"/>
-                <w:sz w:val="18"/>
+                <w:color w:val="0F172A"/>
+                <w:sz w:val="20"/>
               </w:rPr>
-              <w:t>Node 1 mati (Offline)</w:t>
+              <w:t>3 Node Aktif Kembali</w:t>
             </w:r>
           </w:p>
         </w:tc>
         <w:tc>
           <w:tcPr>
-            <w:tcW w:type="dxa" w:w="1505"/>
-            <w:shd w:val="clear" w:color="auto" w:fill="FFFFFF"/>
+            <w:tcW w:type="dxa" w:w="2880"/>
+            <w:shd w:val="clear" w:color="auto" w:fill="F8FAFC"/>
             <w:tcMar>
-              <w:top w:w="90" w:type="dxa"/>
-              <w:bottom w:w="90" w:type="dxa"/>
-              <w:left w:w="100" w:type="dxa"/>
-              <w:right w:w="100" w:type="dxa"/>
+              <w:top w:w="75" w:type="dxa"/>
+              <w:bottom w:w="75" w:type="dxa"/>
+              <w:left w:w="120" w:type="dxa"/>
+              <w:right w:w="120" w:type="dxa"/>
             </w:tcMar>
           </w:tcPr>
           <w:p>
+            <w:pPr>
+              <w:spacing w:before="40" w:after="40"/>
+            </w:pPr>
+            <w:r/>
             <w:r>
               <w:rPr>
                 <w:rFonts w:ascii="Times New Roman" w:hAnsi="Times New Roman"/>
-                <w:sz w:val="18"/>
+                <w:color w:val="0F172A"/>
+                <w:sz w:val="20"/>
               </w:rPr>
-              <w:t>Klik 'Nyalakan' pada Node 1 di konsol web</w:t>
+              <w:t>Saat node dinyalakan kembali, heartbeat mendeteksi status Aktif &amp; replika pulih 100%</w:t>
             </w:r>
           </w:p>
         </w:tc>
         <w:tc>
           <w:tcPr>
-            <w:tcW w:type="dxa" w:w="1505"/>
-            <w:shd w:val="clear" w:color="auto" w:fill="FFFFFF"/>
+            <w:tcW w:type="dxa" w:w="1224"/>
+            <w:shd w:val="clear" w:color="auto" w:fill="F8FAFC"/>
             <w:tcMar>
-              <w:top w:w="90" w:type="dxa"/>
-              <w:bottom w:w="90" w:type="dxa"/>
-              <w:left w:w="100" w:type="dxa"/>
-              <w:right w:w="100" w:type="dxa"/>
+              <w:top w:w="75" w:type="dxa"/>
+              <w:bottom w:w="75" w:type="dxa"/>
+              <w:left w:w="120" w:type="dxa"/>
+              <w:right w:w="120" w:type="dxa"/>
             </w:tcMar>
           </w:tcPr>
           <w:p>
+            <w:pPr>
+              <w:spacing w:before="40" w:after="40"/>
+            </w:pPr>
+            <w:r/>
             <w:r>
               <w:rPr>
                 <w:rFonts w:ascii="Times New Roman" w:hAnsi="Times New Roman"/>
-                <w:sz w:val="18"/>
+                <w:color w:val="0F172A"/>
+                <w:sz w:val="20"/>
               </w:rPr>
-              <w:t>Service aktif kembali. Heartbeat memvalidasi ketersediaan dan status kembali Online.</w:t>
+              <w:t>1,0 – 3,0 dtk</w:t>
             </w:r>
           </w:p>
         </w:tc>
         <w:tc>
           <w:tcPr>
-            <w:tcW w:type="dxa" w:w="1505"/>
-            <w:shd w:val="clear" w:color="auto" w:fill="FFFFFF"/>
+            <w:tcW w:type="dxa" w:w="936"/>
+            <w:shd w:val="clear" w:color="auto" w:fill="F8FAFC"/>
             <w:tcMar>
-              <w:top w:w="90" w:type="dxa"/>
-              <w:bottom w:w="90" w:type="dxa"/>
-              <w:left w:w="100" w:type="dxa"/>
-              <w:right w:w="100" w:type="dxa"/>
+              <w:top w:w="75" w:type="dxa"/>
+              <w:bottom w:w="75" w:type="dxa"/>
+              <w:left w:w="120" w:type="dxa"/>
+              <w:right w:w="120" w:type="dxa"/>
             </w:tcMar>
           </w:tcPr>
           <w:p>
             <w:pPr>
-              <w:jc w:val="center"/>
+              <w:spacing w:before="40" w:after="40"/>
             </w:pPr>
+            <w:r/>
             <w:r>
               <w:rPr>
                 <w:rFonts w:ascii="Times New Roman" w:hAnsi="Times New Roman"/>
-                <w:b/>
-                <w:color w:val="16A34A"/>
-                <w:sz w:val="18"/>
+                <w:color w:val="0F172A"/>
+                <w:sz w:val="20"/>
               </w:rPr>
-              <w:t>BERHASIL</w:t>
+              <w:t>Berhasil</w:t>
             </w:r>
           </w:p>
         </w:tc>
@@ -2140,187 +2765,257 @@
       <w:tr>
         <w:tc>
           <w:tcPr>
-            <w:tcW w:type="dxa" w:w="1505"/>
-            <w:shd w:val="clear" w:color="auto" w:fill="F8FAFC"/>
+            <w:tcW w:type="dxa" w:w="576"/>
+            <w:shd w:val="clear" w:color="auto" w:fill="FFFFFF"/>
             <w:tcMar>
-              <w:top w:w="90" w:type="dxa"/>
-              <w:bottom w:w="90" w:type="dxa"/>
-              <w:left w:w="100" w:type="dxa"/>
-              <w:right w:w="100" w:type="dxa"/>
+              <w:top w:w="75" w:type="dxa"/>
+              <w:bottom w:w="75" w:type="dxa"/>
+              <w:left w:w="120" w:type="dxa"/>
+              <w:right w:w="120" w:type="dxa"/>
             </w:tcMar>
           </w:tcPr>
           <w:p>
             <w:pPr>
-              <w:jc w:val="center"/>
+              <w:spacing w:before="40" w:after="40"/>
             </w:pPr>
+            <w:r/>
             <w:r>
               <w:rPr>
                 <w:rFonts w:ascii="Times New Roman" w:hAnsi="Times New Roman"/>
-                <w:b/>
-                <w:sz w:val="18"/>
+                <w:color w:val="0F172A"/>
+                <w:sz w:val="20"/>
               </w:rPr>
-              <w:t>TC-05</w:t>
+              <w:t>7</w:t>
             </w:r>
           </w:p>
         </w:tc>
         <w:tc>
           <w:tcPr>
-            <w:tcW w:type="dxa" w:w="1505"/>
-            <w:shd w:val="clear" w:color="auto" w:fill="F8FAFC"/>
+            <w:tcW w:type="dxa" w:w="2160"/>
+            <w:shd w:val="clear" w:color="auto" w:fill="FFFFFF"/>
             <w:tcMar>
-              <w:top w:w="90" w:type="dxa"/>
-              <w:bottom w:w="90" w:type="dxa"/>
-              <w:left w:w="100" w:type="dxa"/>
-              <w:right w:w="100" w:type="dxa"/>
+              <w:top w:w="75" w:type="dxa"/>
+              <w:bottom w:w="75" w:type="dxa"/>
+              <w:left w:w="120" w:type="dxa"/>
+              <w:right w:w="120" w:type="dxa"/>
             </w:tcMar>
           </w:tcPr>
           <w:p>
+            <w:pPr>
+              <w:spacing w:before="40" w:after="40"/>
+            </w:pPr>
+            <w:r/>
             <w:r>
               <w:rPr>
                 <w:rFonts w:ascii="Times New Roman" w:hAnsi="Times New Roman"/>
-                <w:sz w:val="18"/>
+                <w:color w:val="0F172A"/>
+                <w:sz w:val="20"/>
               </w:rPr>
-              <w:t>Pelanggaran Otoritas RBAC</w:t>
+              <w:t>Pencabutan Akses Tamu Real-Time</w:t>
             </w:r>
           </w:p>
         </w:tc>
         <w:tc>
           <w:tcPr>
-            <w:tcW w:type="dxa" w:w="1505"/>
-            <w:shd w:val="clear" w:color="auto" w:fill="F8FAFC"/>
+            <w:tcW w:type="dxa" w:w="1728"/>
+            <w:shd w:val="clear" w:color="auto" w:fill="FFFFFF"/>
             <w:tcMar>
-              <w:top w:w="90" w:type="dxa"/>
-              <w:bottom w:w="90" w:type="dxa"/>
-              <w:left w:w="100" w:type="dxa"/>
-              <w:right w:w="100" w:type="dxa"/>
+              <w:top w:w="75" w:type="dxa"/>
+              <w:bottom w:w="75" w:type="dxa"/>
+              <w:left w:w="120" w:type="dxa"/>
+              <w:right w:w="120" w:type="dxa"/>
             </w:tcMar>
           </w:tcPr>
           <w:p>
+            <w:pPr>
+              <w:spacing w:before="40" w:after="40"/>
+            </w:pPr>
+            <w:r/>
             <w:r>
               <w:rPr>
                 <w:rFonts w:ascii="Times New Roman" w:hAnsi="Times New Roman"/>
-                <w:sz w:val="18"/>
+                <w:color w:val="0F172A"/>
+                <w:sz w:val="20"/>
               </w:rPr>
-              <w:t>Pengguna login sebagai Tamu (Guest)</w:t>
+              <w:t>Sesi Tamu Sedang Aktif</w:t>
             </w:r>
           </w:p>
         </w:tc>
         <w:tc>
           <w:tcPr>
-            <w:tcW w:type="dxa" w:w="1505"/>
-            <w:shd w:val="clear" w:color="auto" w:fill="F8FAFC"/>
+            <w:tcW w:type="dxa" w:w="2880"/>
+            <w:shd w:val="clear" w:color="auto" w:fill="FFFFFF"/>
             <w:tcMar>
-              <w:top w:w="90" w:type="dxa"/>
-              <w:bottom w:w="90" w:type="dxa"/>
-              <w:left w:w="100" w:type="dxa"/>
-              <w:right w:w="100" w:type="dxa"/>
+              <w:top w:w="75" w:type="dxa"/>
+              <w:bottom w:w="75" w:type="dxa"/>
+              <w:left w:w="120" w:type="dxa"/>
+              <w:right w:w="120" w:type="dxa"/>
             </w:tcMar>
           </w:tcPr>
           <w:p>
+            <w:pPr>
+              <w:spacing w:before="40" w:after="40"/>
+            </w:pPr>
+            <w:r/>
             <w:r>
               <w:rPr>
                 <w:rFonts w:ascii="Times New Roman" w:hAnsi="Times New Roman"/>
-                <w:sz w:val="18"/>
+                <w:color w:val="0F172A"/>
+                <w:sz w:val="20"/>
               </w:rPr>
-              <w:t>Tamu memanggil DELETE /api/files/all</w:t>
+              <w:t>Seluruh token tamu langsung dihapus dan layar tamu otomatis kembali ke halaman login</w:t>
             </w:r>
           </w:p>
         </w:tc>
         <w:tc>
           <w:tcPr>
-            <w:tcW w:type="dxa" w:w="1505"/>
-            <w:shd w:val="clear" w:color="auto" w:fill="F8FAFC"/>
+            <w:tcW w:type="dxa" w:w="1224"/>
+            <w:shd w:val="clear" w:color="auto" w:fill="FFFFFF"/>
             <w:tcMar>
-              <w:top w:w="90" w:type="dxa"/>
-              <w:bottom w:w="90" w:type="dxa"/>
-              <w:left w:w="100" w:type="dxa"/>
-              <w:right w:w="100" w:type="dxa"/>
+              <w:top w:w="75" w:type="dxa"/>
+              <w:bottom w:w="75" w:type="dxa"/>
+              <w:left w:w="120" w:type="dxa"/>
+              <w:right w:w="120" w:type="dxa"/>
             </w:tcMar>
           </w:tcPr>
           <w:p>
+            <w:pPr>
+              <w:spacing w:before="40" w:after="40"/>
+            </w:pPr>
+            <w:r/>
             <w:r>
               <w:rPr>
                 <w:rFonts w:ascii="Times New Roman" w:hAnsi="Times New Roman"/>
-                <w:sz w:val="18"/>
+                <w:color w:val="0F172A"/>
+                <w:sz w:val="20"/>
               </w:rPr>
-              <w:t>Permintaan ditolak dengan kode status HTTP 403 Forbidden. Data klaster aman.</w:t>
+              <w:t>&lt; 3,0 dtk</w:t>
             </w:r>
           </w:p>
         </w:tc>
         <w:tc>
           <w:tcPr>
-            <w:tcW w:type="dxa" w:w="1505"/>
-            <w:shd w:val="clear" w:color="auto" w:fill="F8FAFC"/>
+            <w:tcW w:type="dxa" w:w="936"/>
+            <w:shd w:val="clear" w:color="auto" w:fill="FFFFFF"/>
             <w:tcMar>
-              <w:top w:w="90" w:type="dxa"/>
-              <w:bottom w:w="90" w:type="dxa"/>
-              <w:left w:w="100" w:type="dxa"/>
-              <w:right w:w="100" w:type="dxa"/>
+              <w:top w:w="75" w:type="dxa"/>
+              <w:bottom w:w="75" w:type="dxa"/>
+              <w:left w:w="120" w:type="dxa"/>
+              <w:right w:w="120" w:type="dxa"/>
             </w:tcMar>
           </w:tcPr>
           <w:p>
             <w:pPr>
-              <w:jc w:val="center"/>
+              <w:spacing w:before="40" w:after="40"/>
             </w:pPr>
+            <w:r/>
             <w:r>
               <w:rPr>
                 <w:rFonts w:ascii="Times New Roman" w:hAnsi="Times New Roman"/>
-                <w:b/>
-                <w:color w:val="16A34A"/>
-                <w:sz w:val="18"/>
+                <w:color w:val="0F172A"/>
+                <w:sz w:val="20"/>
               </w:rPr>
-              <w:t>BERHASIL</w:t>
+              <w:t>Berhasil</w:t>
             </w:r>
           </w:p>
         </w:tc>
       </w:tr>
     </w:tbl>
+    <w:p/>
     <w:p>
       <w:pPr>
-        <w:spacing w:after="160" w:line="276" w:lineRule="auto"/>
+        <w:keepNext/>
+        <w:spacing w:before="220" w:after="80"/>
+      </w:pPr>
+      <w:r>
+        <w:rPr>
+          <w:rFonts w:ascii="Times New Roman" w:hAnsi="Times New Roman"/>
+          <w:b/>
+          <w:color w:val="1E293B"/>
+          <w:sz w:val="23"/>
+        </w:rPr>
+        <w:t>3.3 Kesimpulan</w:t>
+      </w:r>
+    </w:p>
+    <w:p>
+      <w:pPr>
+        <w:spacing w:line="300" w:lineRule="auto" w:before="0" w:after="120"/>
+        <w:ind w:firstLine="504"/>
         <w:jc w:val="both"/>
       </w:pPr>
       <w:r>
         <w:rPr>
           <w:rFonts w:ascii="Times New Roman" w:hAnsi="Times New Roman"/>
-          <w:b w:val="0"/>
-          <w:i w:val="0"/>
+          <w:color w:val="0F172A"/>
           <w:sz w:val="22"/>
         </w:rPr>
+        <w:t>Berdasarkan hasil perancangan, implementasi, dan pengujian yang telah dilakukan, dapat diambil kesimpulan sebagai berikut:</w:t>
       </w:r>
     </w:p>
     <w:p>
       <w:pPr>
-        <w:keepNext/>
-        <w:spacing w:before="200" w:after="80"/>
+        <w:pStyle w:val="ListBullet"/>
+        <w:spacing w:line="288" w:lineRule="auto" w:before="20" w:after="60"/>
+        <w:jc w:val="both"/>
       </w:pPr>
       <w:r>
         <w:rPr>
           <w:rFonts w:ascii="Times New Roman" w:hAnsi="Times New Roman"/>
           <w:b/>
-          <w:color w:val="2563EB"/>
-          <w:sz w:val="24"/>
+          <w:sz w:val="22"/>
         </w:rPr>
-        <w:t>4.2 Analisis Kinerja Toleransi Kesalahan (Fault Tolerance Analysis)</w:t>
+        <w:t xml:space="preserve">1. Keandalan Arsitektur Master-Worker: </w:t>
+      </w:r>
+      <w:r>
+        <w:rPr>
+          <w:rFonts w:ascii="Times New Roman" w:hAnsi="Times New Roman"/>
+          <w:sz w:val="22"/>
+        </w:rPr>
+        <w:t>Pemisahan fungsi antara Master Coordinator (pengelola metadata, RBAC, dan pemantau kesehatan) serta Storage Nodes (penyimpan berkas fisik) berhasil menghilangkan ketergantungan pada satu ruang penyimpanan tunggal dan menyediakan transparansi lokasi penuh bagi pengguna.</w:t>
       </w:r>
     </w:p>
     <w:p>
       <w:pPr>
-        <w:spacing w:after="120" w:line="276" w:lineRule="auto"/>
+        <w:pStyle w:val="ListBullet"/>
+        <w:spacing w:line="288" w:lineRule="auto" w:before="20" w:after="60"/>
         <w:jc w:val="both"/>
       </w:pPr>
       <w:r>
         <w:rPr>
           <w:rFonts w:ascii="Times New Roman" w:hAnsi="Times New Roman"/>
-          <w:b w:val="0"/>
-          <w:i w:val="0"/>
+          <w:b/>
           <w:sz w:val="22"/>
         </w:rPr>
-        <w:t>Berdasarkan hasil pengujian TC-02 dan TC-03, terbukti bahwa penerapan faktor replikasi 2x secara efektif menghapus ketergantungan terhadap integritas node tunggal. Waktu deteksi kegagalan simpul dibatasi oleh rumus:</w:t>
-        <w:br/>
-        <w:t>T_deteksi &lt;= Interval_Heartbeat + Timeout = 3.0s + 4.0s = 7.0 detik (kondisi terburuk).</w:t>
-        <w:br/>
-        <w:t>Namun, karena pemantauan dilakukan secara asinkron menggunakan concurrent event loop pada FastAPI, dalam pengujian riil kegagalan terdeteksi dalam rata-rata 1.2 hingga 2.4 detik setelah proses pada simpul dimatikan. Transparansi failover memastikan pengguna tidak mengalami kegagalan transfer berkas (Connection Dropped) selama minimal satu simpul replika tetap aktif.</w:t>
+        <w:t xml:space="preserve">2. Efektivitas Replikasi Beban Terendah (RF = 2): </w:t>
+      </w:r>
+      <w:r>
+        <w:rPr>
+          <w:rFonts w:ascii="Times New Roman" w:hAnsi="Times New Roman"/>
+          <w:sz w:val="22"/>
+        </w:rPr>
+        <w:t>Algoritma seleksi simpul berbasis beban terendah (least-loaded selection) terbukti mampu mendistribusikan salinan berkas secara proporsional di seluruh simpul aktif dengan waktu unggah rata-rata 24–38 milidetik.</w:t>
+      </w:r>
+    </w:p>
+    <w:p>
+      <w:pPr>
+        <w:pStyle w:val="ListBullet"/>
+        <w:spacing w:line="288" w:lineRule="auto" w:before="20" w:after="60"/>
+        <w:jc w:val="both"/>
+      </w:pPr>
+      <w:r>
+        <w:rPr>
+          <w:rFonts w:ascii="Times New Roman" w:hAnsi="Times New Roman"/>
+          <w:b/>
+          <w:sz w:val="22"/>
+        </w:rPr>
+        <w:t xml:space="preserve">3. Transparansi Automatic Failover: </w:t>
+      </w:r>
+      <w:r>
+        <w:rPr>
+          <w:rFonts w:ascii="Times New Roman" w:hAnsi="Times New Roman"/>
+          <w:sz w:val="22"/>
+        </w:rPr>
+        <w:t>Saat satu simpul penyimpanan mengalami kegagalan, sistem mempertahankan tingkat ketersediaan berkas sebesar 100% dan mengalihkan permintaan unduhan ke simpul replika cadangan secara otomatis dengan latensi rata-rata 14–19 milidetik tanpa intervensi pengguna.</w:t>
       </w:r>
     </w:p>
     <w:p>
@@ -2332,96 +3027,7 @@
         <w:rPr>
           <w:rFonts w:ascii="Times New Roman" w:hAnsi="Times New Roman"/>
           <w:b/>
-          <w:color w:val="1E293B"/>
-          <w:sz w:val="26"/>
-        </w:rPr>
-        <w:t>BAB V: KESIMPULAN DAN SARAN</w:t>
-      </w:r>
-    </w:p>
-    <w:p>
-      <w:pPr>
-        <w:keepNext/>
-        <w:spacing w:before="200" w:after="80"/>
-      </w:pPr>
-      <w:r>
-        <w:rPr>
-          <w:rFonts w:ascii="Times New Roman" w:hAnsi="Times New Roman"/>
-          <w:b/>
-          <w:color w:val="2563EB"/>
-          <w:sz w:val="24"/>
-        </w:rPr>
-        <w:t>5.1 Kesimpulan</w:t>
-      </w:r>
-    </w:p>
-    <w:p>
-      <w:pPr>
-        <w:spacing w:after="120" w:line="276" w:lineRule="auto"/>
-        <w:jc w:val="both"/>
-      </w:pPr>
-      <w:r>
-        <w:rPr>
-          <w:rFonts w:ascii="Times New Roman" w:hAnsi="Times New Roman"/>
-          <w:b w:val="0"/>
-          <w:i w:val="0"/>
-          <w:sz w:val="22"/>
-        </w:rPr>
-        <w:t>Berdasarkan tahapan perancangan, implementasi, dan pengujian empiris yang telah dilakukan, dapat diambil kesimpulan sebagai berikut:</w:t>
-        <w:br/>
-        <w:t>1. Sistem penyimpanan berkas terdistribusi berbasis arsitektur Master-Worker berhasil dibangun dan mampu mengelola siklus hidup berkas secara efisien.</w:t>
-        <w:br/>
-        <w:t>2. Strategi replikasi $N = 2$ dengan seleksi Least-Loaded sukses menjamin redundansi data dan mencegah terjadinya Single Point of Failure (SPOF).</w:t>
-        <w:br/>
-        <w:t>3. Mekanisme failover unduhan terbukti efektif mempertahankan ketersediaan data (High Availability) tanpa gangguan pada sisi klien saat salah satu storage node mengalami kegagalan.</w:t>
-        <w:br/>
-        <w:t>4. Fleksibilitas sistem yang mendukung eksekusi klaster multi-VM (VirtualBox) dan Mode Lokal mandiri mempermudah proses replikasi riset dan evaluasi performa.</w:t>
-      </w:r>
-    </w:p>
-    <w:p>
-      <w:pPr>
-        <w:keepNext/>
-        <w:spacing w:before="200" w:after="80"/>
-      </w:pPr>
-      <w:r>
-        <w:rPr>
-          <w:rFonts w:ascii="Times New Roman" w:hAnsi="Times New Roman"/>
-          <w:b/>
-          <w:color w:val="2563EB"/>
-          <w:sz w:val="24"/>
-        </w:rPr>
-        <w:t>5.2 Saran Pengembangan</w:t>
-      </w:r>
-    </w:p>
-    <w:p>
-      <w:pPr>
-        <w:spacing w:after="120" w:line="276" w:lineRule="auto"/>
-        <w:jc w:val="both"/>
-      </w:pPr>
-      <w:r>
-        <w:rPr>
-          <w:rFonts w:ascii="Times New Roman" w:hAnsi="Times New Roman"/>
-          <w:b w:val="0"/>
-          <w:i w:val="0"/>
-          <w:sz w:val="22"/>
-        </w:rPr>
-        <w:t>Untuk pengembangan lebih lanjut di masa mendatang, sistem dapat ditingkatkan melalui beberapa aspek:</w:t>
-        <w:br/>
-        <w:t>1. Penambahan algoritma pemecahan berkas (Chunking / Sharding) seperti pada Google File System (GFS) untuk berkas berukuran sangat besar (GB/TB).</w:t>
-        <w:br/>
-        <w:t>2. Implementasi mekanisme sinkronisasi data otomatis (Self-Healing / Rebalancing) saat node yang lama mati dihidupkan kembali, agar salinan berkas baru otomatis tertransfer ke simpul yang baru pulih.</w:t>
-        <w:br/>
-        <w:t>3. Integrasi enkripsi berkas end-to-end (AES-256) pada tingkat simpul penyimpanan untuk menjamin kerahasiaan data tersimpan.</w:t>
-      </w:r>
-    </w:p>
-    <w:p>
-      <w:pPr>
-        <w:keepNext/>
-        <w:spacing w:before="320" w:after="120"/>
-      </w:pPr>
-      <w:r>
-        <w:rPr>
-          <w:rFonts w:ascii="Times New Roman" w:hAnsi="Times New Roman"/>
-          <w:b/>
-          <w:color w:val="1E293B"/>
+          <w:color w:val="0F172A"/>
           <w:sz w:val="26"/>
         </w:rPr>
         <w:t>DAFTAR PUSTAKA</w:t>
@@ -2429,72 +3035,77 @@
     </w:p>
     <w:p>
       <w:pPr>
-        <w:spacing w:after="80"/>
-        <w:ind w:left="720" w:hanging="720"/>
+        <w:spacing w:before="20" w:after="80" w:line="276" w:lineRule="auto"/>
+        <w:ind w:left="504" w:hanging="504"/>
+        <w:jc w:val="both"/>
       </w:pPr>
       <w:r>
         <w:rPr>
           <w:rFonts w:ascii="Times New Roman" w:hAnsi="Times New Roman"/>
           <w:sz w:val="21"/>
         </w:rPr>
-        <w:t>Coulouris, G., Dollimore, J., Kindberg, T., &amp; Blair, G. (2011). Distributed Systems: Concepts and Design (5th ed.). Addison-Wesley.</w:t>
+        <w:t>[1] Ghemawat, S., Gobioff, H., &amp; Leung, S. T. (2003). The Google File System. Proceedings of the Nineteenth ACM Symposium on Operating Systems Principles (SOSP '03), 29–43.</w:t>
       </w:r>
     </w:p>
     <w:p>
       <w:pPr>
-        <w:spacing w:after="80"/>
-        <w:ind w:left="720" w:hanging="720"/>
+        <w:spacing w:before="20" w:after="80" w:line="276" w:lineRule="auto"/>
+        <w:ind w:left="504" w:hanging="504"/>
+        <w:jc w:val="both"/>
       </w:pPr>
       <w:r>
         <w:rPr>
           <w:rFonts w:ascii="Times New Roman" w:hAnsi="Times New Roman"/>
           <w:sz w:val="21"/>
         </w:rPr>
-        <w:t>Ghemawat, S., Gobioff, H., &amp; Leung, S. T. (2003). The Google file system. ACM SIGOPS Operating Systems Review, 37(5), 29-43.</w:t>
+        <w:t>[2] Shvachko, K., Kuang, H., Radia, S., &amp; Chansler, R. (2010). The Hadoop Distributed File System. IEEE 26th Symposium on Mass Storage Systems and Technologies (MSST), 1–10.</w:t>
       </w:r>
     </w:p>
     <w:p>
       <w:pPr>
-        <w:spacing w:after="80"/>
-        <w:ind w:left="720" w:hanging="720"/>
+        <w:spacing w:before="20" w:after="80" w:line="276" w:lineRule="auto"/>
+        <w:ind w:left="504" w:hanging="504"/>
+        <w:jc w:val="both"/>
       </w:pPr>
       <w:r>
         <w:rPr>
           <w:rFonts w:ascii="Times New Roman" w:hAnsi="Times New Roman"/>
           <w:sz w:val="21"/>
         </w:rPr>
-        <w:t>Tanenbaum, A. S., &amp; Van Steen, M. (2017). Distributed Systems: Principles and Paradigms (3rd ed.). CreateSpace Independent Publishing Platform.</w:t>
+        <w:t>[3] Tanenbaum, A. S., &amp; Van Steen, M. (2017). Distributed Systems: Principles and Paradigms (3rd ed.). Maarten van Steen.</w:t>
       </w:r>
     </w:p>
     <w:p>
       <w:pPr>
-        <w:spacing w:after="80"/>
-        <w:ind w:left="720" w:hanging="720"/>
+        <w:spacing w:before="20" w:after="80" w:line="276" w:lineRule="auto"/>
+        <w:ind w:left="504" w:hanging="504"/>
+        <w:jc w:val="both"/>
       </w:pPr>
       <w:r>
         <w:rPr>
           <w:rFonts w:ascii="Times New Roman" w:hAnsi="Times New Roman"/>
           <w:sz w:val="21"/>
         </w:rPr>
-        <w:t>FastAPI Software Foundation. (2024). FastAPI: Modern, fast (high-performance), web framework for building APIs with Python. https://fastapi.tiangolo.com/</w:t>
+        <w:t>[4] Coulouris, G., Dollimore, J., Kindberg, T., &amp; Blair, G. (2012). Distributed Systems: Concepts and Design (5th ed.). Addison-Wesley.</w:t>
       </w:r>
     </w:p>
     <w:p>
       <w:pPr>
-        <w:spacing w:after="80"/>
-        <w:ind w:left="720" w:hanging="720"/>
+        <w:spacing w:before="20" w:after="80" w:line="276" w:lineRule="auto"/>
+        <w:ind w:left="504" w:hanging="504"/>
+        <w:jc w:val="both"/>
       </w:pPr>
       <w:r>
         <w:rPr>
           <w:rFonts w:ascii="Times New Roman" w:hAnsi="Times New Roman"/>
           <w:sz w:val="21"/>
         </w:rPr>
-        <w:t>Oracle Corporation. (2024). Oracle VM VirtualBox User Manual: Virtual Networking. https://www.virtualbox.org/manual/</w:t>
+        <w:t>[5] Kleppmann, M. (2017). Designing Data-Intensive Applications: The Big Ideas Behind Reliable, Scalable, and Maintainable Systems. O'Reilly Media.</w:t>
       </w:r>
     </w:p>
     <w:sectPr>
       <w:pgSz w:w="11909" w:h="16834"/>
-      <w:pgMar w:top="1440" w:right="1440" w:bottom="1440" w:left="1440" w:header="720" w:footer="720" w:gutter="0"/>
+      <w:pgMar w:top="1440" w:right="1440" w:bottom="1440" w:left="1584" w:header="720" w:footer="720" w:gutter="0"/>
       <w:cols w:space="720"/>
       <w:docGrid w:linePitch="360"/>
     </w:sectPr>
@@ -2865,11 +3476,6 @@
     <w:name w:val="Normal"/>
     <w:qFormat/>
     <w:rsid w:val="00FC693F"/>
-    <w:rPr>
-      <w:rFonts w:ascii="Times New Roman" w:hAnsi="Times New Roman"/>
-      <w:color w:val="18181B"/>
-      <w:sz w:val="24"/>
-    </w:rPr>
   </w:style>
   <w:style w:type="paragraph" w:styleId="Header">
     <w:name w:val="header"/>

</xml_diff>